<commit_message>
Filled in more accurate track data for Silverstone circuit. Detailed on planning and structuring for the second prototype
</commit_message>
<xml_diff>
--- a/Silverstone circuit data.docx
+++ b/Silverstone circuit data.docx
@@ -17,7 +17,9 @@
         </w:tblBorders>
         <w:tblLayout w:type="fixed"/>
         <w:tblCellMar>
+          <w:top w:w="0" w:type="dxa"/>
           <w:left w:w="108" w:type="dxa"/>
+          <w:bottom w:w="0" w:type="dxa"/>
           <w:right w:w="108" w:type="dxa"/>
         </w:tblCellMar>
       </w:tblPr>
@@ -43,7 +45,9 @@
             <w:insideV w:val="single" w:color="auto" w:sz="4" w:space="0"/>
           </w:tblBorders>
           <w:tblCellMar>
+            <w:top w:w="0" w:type="dxa"/>
             <w:left w:w="108" w:type="dxa"/>
+            <w:bottom w:w="0" w:type="dxa"/>
             <w:right w:w="108" w:type="dxa"/>
           </w:tblCellMar>
         </w:tblPrEx>
@@ -56,6 +60,8 @@
           </w:tcPr>
           <w:p>
             <w:pPr>
+              <w:widowControl w:val="0"/>
+              <w:jc w:val="both"/>
               <w:rPr>
                 <w:rFonts w:hint="default"/>
                 <w:vertAlign w:val="baseline"/>
@@ -78,6 +84,8 @@
           </w:tcPr>
           <w:p>
             <w:pPr>
+              <w:widowControl w:val="0"/>
+              <w:jc w:val="both"/>
               <w:rPr>
                 <w:rFonts w:hint="default"/>
                 <w:vertAlign w:val="baseline"/>
@@ -100,6 +108,8 @@
           </w:tcPr>
           <w:p>
             <w:pPr>
+              <w:widowControl w:val="0"/>
+              <w:jc w:val="both"/>
               <w:rPr>
                 <w:rFonts w:hint="default"/>
                 <w:vertAlign w:val="baseline"/>
@@ -117,6 +127,8 @@
           </w:p>
           <w:p>
             <w:pPr>
+              <w:widowControl w:val="0"/>
+              <w:jc w:val="both"/>
               <w:rPr>
                 <w:rFonts w:hint="default"/>
                 <w:vertAlign w:val="baseline"/>
@@ -139,6 +151,8 @@
           </w:tcPr>
           <w:p>
             <w:pPr>
+              <w:widowControl w:val="0"/>
+              <w:jc w:val="both"/>
               <w:rPr>
                 <w:rFonts w:hint="default"/>
                 <w:vertAlign w:val="baseline"/>
@@ -156,6 +170,8 @@
           </w:p>
           <w:p>
             <w:pPr>
+              <w:widowControl w:val="0"/>
+              <w:jc w:val="both"/>
               <w:rPr>
                 <w:rFonts w:hint="default"/>
                 <w:vertAlign w:val="baseline"/>
@@ -178,6 +194,8 @@
           </w:tcPr>
           <w:p>
             <w:pPr>
+              <w:widowControl w:val="0"/>
+              <w:jc w:val="both"/>
               <w:rPr>
                 <w:rFonts w:hint="default"/>
                 <w:vertAlign w:val="baseline"/>
@@ -200,6 +218,8 @@
           </w:tcPr>
           <w:p>
             <w:pPr>
+              <w:widowControl w:val="0"/>
+              <w:jc w:val="both"/>
               <w:rPr>
                 <w:rFonts w:hint="default"/>
                 <w:vertAlign w:val="baseline"/>
@@ -222,6 +242,8 @@
           </w:tcPr>
           <w:p>
             <w:pPr>
+              <w:widowControl w:val="0"/>
+              <w:jc w:val="both"/>
               <w:rPr>
                 <w:rFonts w:hint="default"/>
                 <w:vertAlign w:val="baseline"/>
@@ -244,6 +266,8 @@
           </w:tcPr>
           <w:p>
             <w:pPr>
+              <w:widowControl w:val="0"/>
+              <w:jc w:val="both"/>
               <w:rPr>
                 <w:rFonts w:hint="default"/>
                 <w:vertAlign w:val="baseline"/>
@@ -266,6 +290,8 @@
           </w:tcPr>
           <w:p>
             <w:pPr>
+              <w:widowControl w:val="0"/>
+              <w:jc w:val="both"/>
               <w:rPr>
                 <w:rFonts w:hint="default"/>
                 <w:vertAlign w:val="baseline"/>
@@ -294,7 +320,9 @@
             <w:insideV w:val="single" w:color="auto" w:sz="4" w:space="0"/>
           </w:tblBorders>
           <w:tblCellMar>
+            <w:top w:w="0" w:type="dxa"/>
             <w:left w:w="108" w:type="dxa"/>
+            <w:bottom w:w="0" w:type="dxa"/>
             <w:right w:w="108" w:type="dxa"/>
           </w:tblCellMar>
         </w:tblPrEx>
@@ -307,6 +335,8 @@
           </w:tcPr>
           <w:p>
             <w:pPr>
+              <w:widowControl w:val="0"/>
+              <w:jc w:val="both"/>
               <w:rPr>
                 <w:rFonts w:hint="default"/>
                 <w:vertAlign w:val="baseline"/>
@@ -329,6 +359,8 @@
           </w:tcPr>
           <w:p>
             <w:pPr>
+              <w:widowControl w:val="0"/>
+              <w:jc w:val="both"/>
               <w:rPr>
                 <w:rFonts w:hint="default"/>
                 <w:vertAlign w:val="baseline"/>
@@ -351,6 +383,8 @@
           </w:tcPr>
           <w:p>
             <w:pPr>
+              <w:widowControl w:val="0"/>
+              <w:jc w:val="both"/>
               <w:rPr>
                 <w:vertAlign w:val="baseline"/>
               </w:rPr>
@@ -363,6 +397,8 @@
           </w:tcPr>
           <w:p>
             <w:pPr>
+              <w:widowControl w:val="0"/>
+              <w:jc w:val="both"/>
               <w:rPr>
                 <w:vertAlign w:val="baseline"/>
               </w:rPr>
@@ -375,6 +411,8 @@
           </w:tcPr>
           <w:p>
             <w:pPr>
+              <w:widowControl w:val="0"/>
+              <w:jc w:val="both"/>
               <w:rPr>
                 <w:vertAlign w:val="baseline"/>
               </w:rPr>
@@ -387,6 +425,8 @@
           </w:tcPr>
           <w:p>
             <w:pPr>
+              <w:widowControl w:val="0"/>
+              <w:jc w:val="both"/>
               <w:rPr>
                 <w:rFonts w:hint="default"/>
                 <w:vertAlign w:val="baseline"/>
@@ -409,6 +449,8 @@
           </w:tcPr>
           <w:p>
             <w:pPr>
+              <w:widowControl w:val="0"/>
+              <w:jc w:val="both"/>
               <w:rPr>
                 <w:rFonts w:hint="default"/>
                 <w:vertAlign w:val="baseline"/>
@@ -423,6 +465,8 @@
           </w:tcPr>
           <w:p>
             <w:pPr>
+              <w:widowControl w:val="0"/>
+              <w:jc w:val="both"/>
               <w:rPr>
                 <w:rFonts w:hint="default"/>
                 <w:vertAlign w:val="baseline"/>
@@ -445,6 +489,8 @@
           </w:tcPr>
           <w:p>
             <w:pPr>
+              <w:widowControl w:val="0"/>
+              <w:jc w:val="both"/>
               <w:rPr>
                 <w:rFonts w:hint="default"/>
                 <w:vertAlign w:val="baseline"/>
@@ -516,7 +562,9 @@
             <w:insideV w:val="single" w:color="auto" w:sz="4" w:space="0"/>
           </w:tblBorders>
           <w:tblCellMar>
+            <w:top w:w="0" w:type="dxa"/>
             <w:left w:w="108" w:type="dxa"/>
+            <w:bottom w:w="0" w:type="dxa"/>
             <w:right w:w="108" w:type="dxa"/>
           </w:tblCellMar>
         </w:tblPrEx>
@@ -529,6 +577,8 @@
           </w:tcPr>
           <w:p>
             <w:pPr>
+              <w:widowControl w:val="0"/>
+              <w:jc w:val="both"/>
               <w:rPr>
                 <w:rFonts w:hint="default"/>
                 <w:vertAlign w:val="baseline"/>
@@ -551,6 +601,8 @@
           </w:tcPr>
           <w:p>
             <w:pPr>
+              <w:widowControl w:val="0"/>
+              <w:jc w:val="both"/>
               <w:rPr>
                 <w:rFonts w:hint="default"/>
                 <w:vertAlign w:val="baseline"/>
@@ -573,10 +625,22 @@
           </w:tcPr>
           <w:p>
             <w:pPr>
-              <w:rPr>
-                <w:vertAlign w:val="baseline"/>
-              </w:rPr>
-            </w:pPr>
+              <w:widowControl w:val="0"/>
+              <w:jc w:val="both"/>
+              <w:rPr>
+                <w:rFonts w:hint="default"/>
+                <w:vertAlign w:val="baseline"/>
+                <w:lang w:val="en-US"/>
+              </w:rPr>
+            </w:pPr>
+            <w:r>
+              <w:rPr>
+                <w:rFonts w:hint="default"/>
+                <w:vertAlign w:val="baseline"/>
+                <w:lang w:val="en-US"/>
+              </w:rPr>
+              <w:t>307</w:t>
+            </w:r>
           </w:p>
         </w:tc>
         <w:tc>
@@ -585,10 +649,22 @@
           </w:tcPr>
           <w:p>
             <w:pPr>
-              <w:rPr>
-                <w:vertAlign w:val="baseline"/>
-              </w:rPr>
-            </w:pPr>
+              <w:widowControl w:val="0"/>
+              <w:jc w:val="both"/>
+              <w:rPr>
+                <w:rFonts w:hint="default"/>
+                <w:vertAlign w:val="baseline"/>
+                <w:lang w:val="en-US"/>
+              </w:rPr>
+            </w:pPr>
+            <w:r>
+              <w:rPr>
+                <w:rFonts w:hint="default"/>
+                <w:vertAlign w:val="baseline"/>
+                <w:lang w:val="en-US"/>
+              </w:rPr>
+              <w:t>295</w:t>
+            </w:r>
           </w:p>
         </w:tc>
         <w:tc>
@@ -597,6 +673,8 @@
           </w:tcPr>
           <w:p>
             <w:pPr>
+              <w:widowControl w:val="0"/>
+              <w:jc w:val="both"/>
               <w:rPr>
                 <w:vertAlign w:val="baseline"/>
               </w:rPr>
@@ -609,6 +687,8 @@
           </w:tcPr>
           <w:p>
             <w:pPr>
+              <w:widowControl w:val="0"/>
+              <w:jc w:val="both"/>
               <w:rPr>
                 <w:rFonts w:hint="default"/>
                 <w:vertAlign w:val="baseline"/>
@@ -631,6 +711,8 @@
           </w:tcPr>
           <w:p>
             <w:pPr>
+              <w:widowControl w:val="0"/>
+              <w:jc w:val="both"/>
               <w:rPr>
                 <w:rFonts w:hint="default"/>
                 <w:vertAlign w:val="baseline"/>
@@ -653,6 +735,8 @@
           </w:tcPr>
           <w:p>
             <w:pPr>
+              <w:widowControl w:val="0"/>
+              <w:jc w:val="both"/>
               <w:rPr>
                 <w:rFonts w:hint="default"/>
                 <w:vertAlign w:val="baseline"/>
@@ -675,6 +759,8 @@
           </w:tcPr>
           <w:p>
             <w:pPr>
+              <w:widowControl w:val="0"/>
+              <w:jc w:val="both"/>
               <w:rPr>
                 <w:vertAlign w:val="baseline"/>
               </w:rPr>
@@ -693,7 +779,9 @@
             <w:insideV w:val="single" w:color="auto" w:sz="4" w:space="0"/>
           </w:tblBorders>
           <w:tblCellMar>
+            <w:top w:w="0" w:type="dxa"/>
             <w:left w:w="108" w:type="dxa"/>
+            <w:bottom w:w="0" w:type="dxa"/>
             <w:right w:w="108" w:type="dxa"/>
           </w:tblCellMar>
         </w:tblPrEx>
@@ -706,6 +794,8 @@
           </w:tcPr>
           <w:p>
             <w:pPr>
+              <w:widowControl w:val="0"/>
+              <w:jc w:val="both"/>
               <w:rPr>
                 <w:vertAlign w:val="baseline"/>
               </w:rPr>
@@ -748,6 +838,8 @@
           </w:tcPr>
           <w:p>
             <w:pPr>
+              <w:widowControl w:val="0"/>
+              <w:jc w:val="both"/>
               <w:rPr>
                 <w:vertAlign w:val="baseline"/>
               </w:rPr>
@@ -768,10 +860,22 @@
           </w:tcPr>
           <w:p>
             <w:pPr>
-              <w:rPr>
-                <w:vertAlign w:val="baseline"/>
-              </w:rPr>
-            </w:pPr>
+              <w:widowControl w:val="0"/>
+              <w:jc w:val="both"/>
+              <w:rPr>
+                <w:rFonts w:hint="default"/>
+                <w:vertAlign w:val="baseline"/>
+                <w:lang w:val="en-US"/>
+              </w:rPr>
+            </w:pPr>
+            <w:r>
+              <w:rPr>
+                <w:rFonts w:hint="default"/>
+                <w:vertAlign w:val="baseline"/>
+                <w:lang w:val="en-US"/>
+              </w:rPr>
+              <w:t>286</w:t>
+            </w:r>
           </w:p>
         </w:tc>
         <w:tc>
@@ -780,10 +884,22 @@
           </w:tcPr>
           <w:p>
             <w:pPr>
-              <w:rPr>
-                <w:vertAlign w:val="baseline"/>
-              </w:rPr>
-            </w:pPr>
+              <w:widowControl w:val="0"/>
+              <w:jc w:val="both"/>
+              <w:rPr>
+                <w:rFonts w:hint="default"/>
+                <w:vertAlign w:val="baseline"/>
+                <w:lang w:val="en-US"/>
+              </w:rPr>
+            </w:pPr>
+            <w:r>
+              <w:rPr>
+                <w:rFonts w:hint="default"/>
+                <w:vertAlign w:val="baseline"/>
+                <w:lang w:val="en-US"/>
+              </w:rPr>
+              <w:t>263</w:t>
+            </w:r>
           </w:p>
         </w:tc>
         <w:tc>
@@ -792,6 +908,8 @@
           </w:tcPr>
           <w:p>
             <w:pPr>
+              <w:widowControl w:val="0"/>
+              <w:jc w:val="both"/>
               <w:rPr>
                 <w:vertAlign w:val="baseline"/>
               </w:rPr>
@@ -804,6 +922,8 @@
           </w:tcPr>
           <w:p>
             <w:pPr>
+              <w:widowControl w:val="0"/>
+              <w:jc w:val="both"/>
               <w:rPr>
                 <w:rFonts w:hint="default"/>
                 <w:vertAlign w:val="baseline"/>
@@ -826,6 +946,8 @@
           </w:tcPr>
           <w:p>
             <w:pPr>
+              <w:widowControl w:val="0"/>
+              <w:jc w:val="both"/>
               <w:rPr>
                 <w:rFonts w:hint="default"/>
                 <w:vertAlign w:val="baseline"/>
@@ -848,6 +970,8 @@
           </w:tcPr>
           <w:p>
             <w:pPr>
+              <w:widowControl w:val="0"/>
+              <w:jc w:val="both"/>
               <w:rPr>
                 <w:vertAlign w:val="baseline"/>
               </w:rPr>
@@ -868,6 +992,8 @@
           </w:tcPr>
           <w:p>
             <w:pPr>
+              <w:widowControl w:val="0"/>
+              <w:jc w:val="both"/>
               <w:rPr>
                 <w:vertAlign w:val="baseline"/>
               </w:rPr>
@@ -886,7 +1012,9 @@
             <w:insideV w:val="single" w:color="auto" w:sz="4" w:space="0"/>
           </w:tblBorders>
           <w:tblCellMar>
+            <w:top w:w="0" w:type="dxa"/>
             <w:left w:w="108" w:type="dxa"/>
+            <w:bottom w:w="0" w:type="dxa"/>
             <w:right w:w="108" w:type="dxa"/>
           </w:tblCellMar>
         </w:tblPrEx>
@@ -899,6 +1027,8 @@
           </w:tcPr>
           <w:p>
             <w:pPr>
+              <w:widowControl w:val="0"/>
+              <w:jc w:val="both"/>
               <w:rPr>
                 <w:vertAlign w:val="baseline"/>
               </w:rPr>
@@ -919,6 +1049,8 @@
           </w:tcPr>
           <w:p>
             <w:pPr>
+              <w:widowControl w:val="0"/>
+              <w:jc w:val="both"/>
               <w:rPr>
                 <w:rFonts w:hint="default"/>
                 <w:vertAlign w:val="baseline"/>
@@ -941,10 +1073,22 @@
           </w:tcPr>
           <w:p>
             <w:pPr>
-              <w:rPr>
-                <w:vertAlign w:val="baseline"/>
-              </w:rPr>
-            </w:pPr>
+              <w:widowControl w:val="0"/>
+              <w:jc w:val="both"/>
+              <w:rPr>
+                <w:rFonts w:hint="default"/>
+                <w:vertAlign w:val="baseline"/>
+                <w:lang w:val="en-US"/>
+              </w:rPr>
+            </w:pPr>
+            <w:r>
+              <w:rPr>
+                <w:rFonts w:hint="default"/>
+                <w:vertAlign w:val="baseline"/>
+                <w:lang w:val="en-US"/>
+              </w:rPr>
+              <w:t>108</w:t>
+            </w:r>
           </w:p>
         </w:tc>
         <w:tc>
@@ -953,10 +1097,22 @@
           </w:tcPr>
           <w:p>
             <w:pPr>
-              <w:rPr>
-                <w:vertAlign w:val="baseline"/>
-              </w:rPr>
-            </w:pPr>
+              <w:widowControl w:val="0"/>
+              <w:jc w:val="both"/>
+              <w:rPr>
+                <w:rFonts w:hint="default"/>
+                <w:vertAlign w:val="baseline"/>
+                <w:lang w:val="en-US"/>
+              </w:rPr>
+            </w:pPr>
+            <w:r>
+              <w:rPr>
+                <w:rFonts w:hint="default"/>
+                <w:vertAlign w:val="baseline"/>
+                <w:lang w:val="en-US"/>
+              </w:rPr>
+              <w:t>141</w:t>
+            </w:r>
           </w:p>
         </w:tc>
         <w:tc>
@@ -965,6 +1121,8 @@
           </w:tcPr>
           <w:p>
             <w:pPr>
+              <w:widowControl w:val="0"/>
+              <w:jc w:val="both"/>
               <w:rPr>
                 <w:vertAlign w:val="baseline"/>
               </w:rPr>
@@ -977,6 +1135,8 @@
           </w:tcPr>
           <w:p>
             <w:pPr>
+              <w:widowControl w:val="0"/>
+              <w:jc w:val="both"/>
               <w:rPr>
                 <w:rFonts w:hint="default"/>
                 <w:vertAlign w:val="baseline"/>
@@ -999,6 +1159,8 @@
           </w:tcPr>
           <w:p>
             <w:pPr>
+              <w:widowControl w:val="0"/>
+              <w:jc w:val="both"/>
               <w:rPr>
                 <w:rFonts w:hint="default"/>
                 <w:vertAlign w:val="baseline"/>
@@ -1021,6 +1183,8 @@
           </w:tcPr>
           <w:p>
             <w:pPr>
+              <w:widowControl w:val="0"/>
+              <w:jc w:val="both"/>
               <w:rPr>
                 <w:vertAlign w:val="baseline"/>
               </w:rPr>
@@ -1041,6 +1205,8 @@
           </w:tcPr>
           <w:p>
             <w:pPr>
+              <w:widowControl w:val="0"/>
+              <w:jc w:val="both"/>
               <w:rPr>
                 <w:vertAlign w:val="baseline"/>
               </w:rPr>
@@ -1059,7 +1225,9 @@
             <w:insideV w:val="single" w:color="auto" w:sz="4" w:space="0"/>
           </w:tblBorders>
           <w:tblCellMar>
+            <w:top w:w="0" w:type="dxa"/>
             <w:left w:w="108" w:type="dxa"/>
+            <w:bottom w:w="0" w:type="dxa"/>
             <w:right w:w="108" w:type="dxa"/>
           </w:tblCellMar>
         </w:tblPrEx>
@@ -1072,6 +1240,8 @@
           </w:tcPr>
           <w:p>
             <w:pPr>
+              <w:widowControl w:val="0"/>
+              <w:jc w:val="both"/>
               <w:rPr>
                 <w:vertAlign w:val="baseline"/>
               </w:rPr>
@@ -1092,6 +1262,8 @@
           </w:tcPr>
           <w:p>
             <w:pPr>
+              <w:widowControl w:val="0"/>
+              <w:jc w:val="both"/>
               <w:rPr>
                 <w:vertAlign w:val="baseline"/>
               </w:rPr>
@@ -1112,10 +1284,22 @@
           </w:tcPr>
           <w:p>
             <w:pPr>
-              <w:rPr>
-                <w:vertAlign w:val="baseline"/>
-              </w:rPr>
-            </w:pPr>
+              <w:widowControl w:val="0"/>
+              <w:jc w:val="both"/>
+              <w:rPr>
+                <w:rFonts w:hint="default"/>
+                <w:vertAlign w:val="baseline"/>
+                <w:lang w:val="en-US"/>
+              </w:rPr>
+            </w:pPr>
+            <w:r>
+              <w:rPr>
+                <w:rFonts w:hint="default"/>
+                <w:vertAlign w:val="baseline"/>
+                <w:lang w:val="en-US"/>
+              </w:rPr>
+              <w:t>87</w:t>
+            </w:r>
           </w:p>
         </w:tc>
         <w:tc>
@@ -1124,10 +1308,22 @@
           </w:tcPr>
           <w:p>
             <w:pPr>
-              <w:rPr>
-                <w:vertAlign w:val="baseline"/>
-              </w:rPr>
-            </w:pPr>
+              <w:widowControl w:val="0"/>
+              <w:jc w:val="both"/>
+              <w:rPr>
+                <w:rFonts w:hint="default"/>
+                <w:vertAlign w:val="baseline"/>
+                <w:lang w:val="en-US"/>
+              </w:rPr>
+            </w:pPr>
+            <w:r>
+              <w:rPr>
+                <w:rFonts w:hint="default"/>
+                <w:vertAlign w:val="baseline"/>
+                <w:lang w:val="en-US"/>
+              </w:rPr>
+              <w:t>184</w:t>
+            </w:r>
           </w:p>
         </w:tc>
         <w:tc>
@@ -1136,6 +1332,8 @@
           </w:tcPr>
           <w:p>
             <w:pPr>
+              <w:widowControl w:val="0"/>
+              <w:jc w:val="both"/>
               <w:rPr>
                 <w:vertAlign w:val="baseline"/>
               </w:rPr>
@@ -1148,6 +1346,8 @@
           </w:tcPr>
           <w:p>
             <w:pPr>
+              <w:widowControl w:val="0"/>
+              <w:jc w:val="both"/>
               <w:rPr>
                 <w:rFonts w:hint="default"/>
                 <w:vertAlign w:val="baseline"/>
@@ -1170,6 +1370,8 @@
           </w:tcPr>
           <w:p>
             <w:pPr>
+              <w:widowControl w:val="0"/>
+              <w:jc w:val="both"/>
               <w:rPr>
                 <w:rFonts w:hint="default"/>
                 <w:vertAlign w:val="baseline"/>
@@ -1192,6 +1394,8 @@
           </w:tcPr>
           <w:p>
             <w:pPr>
+              <w:widowControl w:val="0"/>
+              <w:jc w:val="both"/>
               <w:rPr>
                 <w:vertAlign w:val="baseline"/>
               </w:rPr>
@@ -1212,6 +1416,8 @@
           </w:tcPr>
           <w:p>
             <w:pPr>
+              <w:widowControl w:val="0"/>
+              <w:jc w:val="both"/>
               <w:rPr>
                 <w:vertAlign w:val="baseline"/>
               </w:rPr>
@@ -1230,7 +1436,9 @@
             <w:insideV w:val="single" w:color="auto" w:sz="4" w:space="0"/>
           </w:tblBorders>
           <w:tblCellMar>
+            <w:top w:w="0" w:type="dxa"/>
             <w:left w:w="108" w:type="dxa"/>
+            <w:bottom w:w="0" w:type="dxa"/>
             <w:right w:w="108" w:type="dxa"/>
           </w:tblCellMar>
         </w:tblPrEx>
@@ -1243,6 +1451,8 @@
           </w:tcPr>
           <w:p>
             <w:pPr>
+              <w:widowControl w:val="0"/>
+              <w:jc w:val="both"/>
               <w:rPr>
                 <w:vertAlign w:val="baseline"/>
               </w:rPr>
@@ -1263,17 +1473,27 @@
           </w:tcPr>
           <w:p>
             <w:pPr>
-              <w:rPr>
-                <w:vertAlign w:val="baseline"/>
-              </w:rPr>
-            </w:pPr>
-            <w:r>
-              <w:rPr>
-                <w:rFonts w:hint="default"/>
-                <w:vertAlign w:val="baseline"/>
-                <w:lang w:val="en-GB"/>
-              </w:rPr>
-              <w:t>Slow corner</w:t>
+              <w:widowControl w:val="0"/>
+              <w:jc w:val="both"/>
+              <w:rPr>
+                <w:vertAlign w:val="baseline"/>
+              </w:rPr>
+            </w:pPr>
+            <w:r>
+              <w:rPr>
+                <w:rFonts w:hint="default"/>
+                <w:vertAlign w:val="baseline"/>
+                <w:lang w:val="en-US"/>
+              </w:rPr>
+              <w:t xml:space="preserve">Fast </w:t>
+            </w:r>
+            <w:r>
+              <w:rPr>
+                <w:rFonts w:hint="default"/>
+                <w:vertAlign w:val="baseline"/>
+                <w:lang w:val="en-GB"/>
+              </w:rPr>
+              <w:t>corner</w:t>
             </w:r>
           </w:p>
         </w:tc>
@@ -1283,10 +1503,22 @@
           </w:tcPr>
           <w:p>
             <w:pPr>
-              <w:rPr>
-                <w:vertAlign w:val="baseline"/>
-              </w:rPr>
-            </w:pPr>
+              <w:widowControl w:val="0"/>
+              <w:jc w:val="both"/>
+              <w:rPr>
+                <w:rFonts w:hint="default"/>
+                <w:vertAlign w:val="baseline"/>
+                <w:lang w:val="en-US"/>
+              </w:rPr>
+            </w:pPr>
+            <w:r>
+              <w:rPr>
+                <w:rFonts w:hint="default"/>
+                <w:vertAlign w:val="baseline"/>
+                <w:lang w:val="en-US"/>
+              </w:rPr>
+              <w:t>237</w:t>
+            </w:r>
           </w:p>
         </w:tc>
         <w:tc>
@@ -1295,10 +1527,22 @@
           </w:tcPr>
           <w:p>
             <w:pPr>
-              <w:rPr>
-                <w:vertAlign w:val="baseline"/>
-              </w:rPr>
-            </w:pPr>
+              <w:widowControl w:val="0"/>
+              <w:jc w:val="both"/>
+              <w:rPr>
+                <w:rFonts w:hint="default"/>
+                <w:vertAlign w:val="baseline"/>
+                <w:lang w:val="en-US"/>
+              </w:rPr>
+            </w:pPr>
+            <w:r>
+              <w:rPr>
+                <w:rFonts w:hint="default"/>
+                <w:vertAlign w:val="baseline"/>
+                <w:lang w:val="en-US"/>
+              </w:rPr>
+              <w:t>257</w:t>
+            </w:r>
           </w:p>
         </w:tc>
         <w:tc>
@@ -1307,6 +1551,8 @@
           </w:tcPr>
           <w:p>
             <w:pPr>
+              <w:widowControl w:val="0"/>
+              <w:jc w:val="both"/>
               <w:rPr>
                 <w:vertAlign w:val="baseline"/>
               </w:rPr>
@@ -1319,6 +1565,8 @@
           </w:tcPr>
           <w:p>
             <w:pPr>
+              <w:widowControl w:val="0"/>
+              <w:jc w:val="both"/>
               <w:rPr>
                 <w:rFonts w:hint="default"/>
                 <w:vertAlign w:val="baseline"/>
@@ -1341,6 +1589,8 @@
           </w:tcPr>
           <w:p>
             <w:pPr>
+              <w:widowControl w:val="0"/>
+              <w:jc w:val="both"/>
               <w:rPr>
                 <w:rFonts w:hint="default"/>
                 <w:vertAlign w:val="baseline"/>
@@ -1363,6 +1613,8 @@
           </w:tcPr>
           <w:p>
             <w:pPr>
+              <w:widowControl w:val="0"/>
+              <w:jc w:val="both"/>
               <w:rPr>
                 <w:vertAlign w:val="baseline"/>
               </w:rPr>
@@ -1383,6 +1635,8 @@
           </w:tcPr>
           <w:p>
             <w:pPr>
+              <w:widowControl w:val="0"/>
+              <w:jc w:val="both"/>
               <w:rPr>
                 <w:vertAlign w:val="baseline"/>
               </w:rPr>
@@ -1401,7 +1655,9 @@
             <w:insideV w:val="single" w:color="auto" w:sz="4" w:space="0"/>
           </w:tblBorders>
           <w:tblCellMar>
+            <w:top w:w="0" w:type="dxa"/>
             <w:left w:w="108" w:type="dxa"/>
+            <w:bottom w:w="0" w:type="dxa"/>
             <w:right w:w="108" w:type="dxa"/>
           </w:tblCellMar>
         </w:tblPrEx>
@@ -1414,6 +1670,8 @@
           </w:tcPr>
           <w:p>
             <w:pPr>
+              <w:widowControl w:val="0"/>
+              <w:jc w:val="both"/>
               <w:rPr>
                 <w:vertAlign w:val="baseline"/>
               </w:rPr>
@@ -1440,6 +1698,8 @@
           </w:tcPr>
           <w:p>
             <w:pPr>
+              <w:widowControl w:val="0"/>
+              <w:jc w:val="both"/>
               <w:rPr>
                 <w:vertAlign w:val="baseline"/>
               </w:rPr>
@@ -1460,6 +1720,8 @@
           </w:tcPr>
           <w:p>
             <w:pPr>
+              <w:widowControl w:val="0"/>
+              <w:jc w:val="both"/>
               <w:rPr>
                 <w:vertAlign w:val="baseline"/>
               </w:rPr>
@@ -1472,6 +1734,8 @@
           </w:tcPr>
           <w:p>
             <w:pPr>
+              <w:widowControl w:val="0"/>
+              <w:jc w:val="both"/>
               <w:rPr>
                 <w:vertAlign w:val="baseline"/>
               </w:rPr>
@@ -1484,6 +1748,8 @@
           </w:tcPr>
           <w:p>
             <w:pPr>
+              <w:widowControl w:val="0"/>
+              <w:jc w:val="both"/>
               <w:rPr>
                 <w:vertAlign w:val="baseline"/>
               </w:rPr>
@@ -1496,6 +1762,8 @@
           </w:tcPr>
           <w:p>
             <w:pPr>
+              <w:widowControl w:val="0"/>
+              <w:jc w:val="both"/>
               <w:rPr>
                 <w:rFonts w:hint="default"/>
                 <w:vertAlign w:val="baseline"/>
@@ -1518,6 +1786,8 @@
           </w:tcPr>
           <w:p>
             <w:pPr>
+              <w:widowControl w:val="0"/>
+              <w:jc w:val="both"/>
               <w:rPr>
                 <w:vertAlign w:val="baseline"/>
               </w:rPr>
@@ -1530,6 +1800,8 @@
           </w:tcPr>
           <w:p>
             <w:pPr>
+              <w:widowControl w:val="0"/>
+              <w:jc w:val="both"/>
               <w:rPr>
                 <w:vertAlign w:val="baseline"/>
               </w:rPr>
@@ -1550,6 +1822,8 @@
           </w:tcPr>
           <w:p>
             <w:pPr>
+              <w:widowControl w:val="0"/>
+              <w:jc w:val="both"/>
               <w:rPr>
                 <w:rFonts w:hint="default"/>
                 <w:vertAlign w:val="baseline"/>
@@ -1578,7 +1852,9 @@
             <w:insideV w:val="single" w:color="auto" w:sz="4" w:space="0"/>
           </w:tblBorders>
           <w:tblCellMar>
+            <w:top w:w="0" w:type="dxa"/>
             <w:left w:w="108" w:type="dxa"/>
+            <w:bottom w:w="0" w:type="dxa"/>
             <w:right w:w="108" w:type="dxa"/>
           </w:tblCellMar>
         </w:tblPrEx>
@@ -1591,6 +1867,8 @@
           </w:tcPr>
           <w:p>
             <w:pPr>
+              <w:widowControl w:val="0"/>
+              <w:jc w:val="both"/>
               <w:rPr>
                 <w:vertAlign w:val="baseline"/>
               </w:rPr>
@@ -1611,6 +1889,8 @@
           </w:tcPr>
           <w:p>
             <w:pPr>
+              <w:widowControl w:val="0"/>
+              <w:jc w:val="both"/>
               <w:rPr>
                 <w:vertAlign w:val="baseline"/>
               </w:rPr>
@@ -1631,10 +1911,22 @@
           </w:tcPr>
           <w:p>
             <w:pPr>
-              <w:rPr>
-                <w:vertAlign w:val="baseline"/>
-              </w:rPr>
-            </w:pPr>
+              <w:widowControl w:val="0"/>
+              <w:jc w:val="both"/>
+              <w:rPr>
+                <w:rFonts w:hint="default"/>
+                <w:vertAlign w:val="baseline"/>
+                <w:lang w:val="en-US"/>
+              </w:rPr>
+            </w:pPr>
+            <w:r>
+              <w:rPr>
+                <w:rFonts w:hint="default"/>
+                <w:vertAlign w:val="baseline"/>
+                <w:lang w:val="en-US"/>
+              </w:rPr>
+              <w:t>167</w:t>
+            </w:r>
           </w:p>
         </w:tc>
         <w:tc>
@@ -1643,10 +1935,22 @@
           </w:tcPr>
           <w:p>
             <w:pPr>
-              <w:rPr>
-                <w:vertAlign w:val="baseline"/>
-              </w:rPr>
-            </w:pPr>
+              <w:widowControl w:val="0"/>
+              <w:jc w:val="both"/>
+              <w:rPr>
+                <w:rFonts w:hint="default"/>
+                <w:vertAlign w:val="baseline"/>
+                <w:lang w:val="en-US"/>
+              </w:rPr>
+            </w:pPr>
+            <w:r>
+              <w:rPr>
+                <w:rFonts w:hint="default"/>
+                <w:vertAlign w:val="baseline"/>
+                <w:lang w:val="en-US"/>
+              </w:rPr>
+              <w:t>184</w:t>
+            </w:r>
           </w:p>
         </w:tc>
         <w:tc>
@@ -1655,6 +1959,8 @@
           </w:tcPr>
           <w:p>
             <w:pPr>
+              <w:widowControl w:val="0"/>
+              <w:jc w:val="both"/>
               <w:rPr>
                 <w:vertAlign w:val="baseline"/>
               </w:rPr>
@@ -1667,6 +1973,8 @@
           </w:tcPr>
           <w:p>
             <w:pPr>
+              <w:widowControl w:val="0"/>
+              <w:jc w:val="both"/>
               <w:rPr>
                 <w:rFonts w:hint="default"/>
                 <w:vertAlign w:val="baseline"/>
@@ -1689,6 +1997,8 @@
           </w:tcPr>
           <w:p>
             <w:pPr>
+              <w:widowControl w:val="0"/>
+              <w:jc w:val="both"/>
               <w:rPr>
                 <w:rFonts w:hint="default"/>
                 <w:vertAlign w:val="baseline"/>
@@ -1711,6 +2021,8 @@
           </w:tcPr>
           <w:p>
             <w:pPr>
+              <w:widowControl w:val="0"/>
+              <w:jc w:val="both"/>
               <w:rPr>
                 <w:vertAlign w:val="baseline"/>
               </w:rPr>
@@ -1731,6 +2043,8 @@
           </w:tcPr>
           <w:p>
             <w:pPr>
+              <w:widowControl w:val="0"/>
+              <w:jc w:val="both"/>
               <w:rPr>
                 <w:vertAlign w:val="baseline"/>
               </w:rPr>
@@ -1749,7 +2063,9 @@
             <w:insideV w:val="single" w:color="auto" w:sz="4" w:space="0"/>
           </w:tblBorders>
           <w:tblCellMar>
+            <w:top w:w="0" w:type="dxa"/>
             <w:left w:w="108" w:type="dxa"/>
+            <w:bottom w:w="0" w:type="dxa"/>
             <w:right w:w="108" w:type="dxa"/>
           </w:tblCellMar>
         </w:tblPrEx>
@@ -1762,6 +2078,8 @@
           </w:tcPr>
           <w:p>
             <w:pPr>
+              <w:widowControl w:val="0"/>
+              <w:jc w:val="both"/>
               <w:rPr>
                 <w:vertAlign w:val="baseline"/>
               </w:rPr>
@@ -1782,6 +2100,8 @@
           </w:tcPr>
           <w:p>
             <w:pPr>
+              <w:widowControl w:val="0"/>
+              <w:jc w:val="both"/>
               <w:rPr>
                 <w:vertAlign w:val="baseline"/>
               </w:rPr>
@@ -1802,10 +2122,22 @@
           </w:tcPr>
           <w:p>
             <w:pPr>
-              <w:rPr>
-                <w:vertAlign w:val="baseline"/>
-              </w:rPr>
-            </w:pPr>
+              <w:widowControl w:val="0"/>
+              <w:jc w:val="both"/>
+              <w:rPr>
+                <w:rFonts w:hint="default"/>
+                <w:vertAlign w:val="baseline"/>
+                <w:lang w:val="en-US"/>
+              </w:rPr>
+            </w:pPr>
+            <w:r>
+              <w:rPr>
+                <w:rFonts w:hint="default"/>
+                <w:vertAlign w:val="baseline"/>
+                <w:lang w:val="en-US"/>
+              </w:rPr>
+              <w:t>114</w:t>
+            </w:r>
           </w:p>
         </w:tc>
         <w:tc>
@@ -1814,10 +2146,22 @@
           </w:tcPr>
           <w:p>
             <w:pPr>
-              <w:rPr>
-                <w:vertAlign w:val="baseline"/>
-              </w:rPr>
-            </w:pPr>
+              <w:widowControl w:val="0"/>
+              <w:jc w:val="both"/>
+              <w:rPr>
+                <w:rFonts w:hint="default"/>
+                <w:vertAlign w:val="baseline"/>
+                <w:lang w:val="en-US"/>
+              </w:rPr>
+            </w:pPr>
+            <w:r>
+              <w:rPr>
+                <w:rFonts w:hint="default"/>
+                <w:vertAlign w:val="baseline"/>
+                <w:lang w:val="en-US"/>
+              </w:rPr>
+              <w:t>230</w:t>
+            </w:r>
           </w:p>
         </w:tc>
         <w:tc>
@@ -1826,6 +2170,8 @@
           </w:tcPr>
           <w:p>
             <w:pPr>
+              <w:widowControl w:val="0"/>
+              <w:jc w:val="both"/>
               <w:rPr>
                 <w:vertAlign w:val="baseline"/>
               </w:rPr>
@@ -1838,6 +2184,8 @@
           </w:tcPr>
           <w:p>
             <w:pPr>
+              <w:widowControl w:val="0"/>
+              <w:jc w:val="both"/>
               <w:rPr>
                 <w:rFonts w:hint="default"/>
                 <w:vertAlign w:val="baseline"/>
@@ -1860,6 +2208,8 @@
           </w:tcPr>
           <w:p>
             <w:pPr>
+              <w:widowControl w:val="0"/>
+              <w:jc w:val="both"/>
               <w:rPr>
                 <w:rFonts w:hint="default"/>
                 <w:vertAlign w:val="baseline"/>
@@ -1882,6 +2232,8 @@
           </w:tcPr>
           <w:p>
             <w:pPr>
+              <w:widowControl w:val="0"/>
+              <w:jc w:val="both"/>
               <w:rPr>
                 <w:vertAlign w:val="baseline"/>
               </w:rPr>
@@ -1902,6 +2254,8 @@
           </w:tcPr>
           <w:p>
             <w:pPr>
+              <w:widowControl w:val="0"/>
+              <w:jc w:val="both"/>
               <w:rPr>
                 <w:vertAlign w:val="baseline"/>
               </w:rPr>
@@ -1920,7 +2274,9 @@
             <w:insideV w:val="single" w:color="auto" w:sz="4" w:space="0"/>
           </w:tblBorders>
           <w:tblCellMar>
+            <w:top w:w="0" w:type="dxa"/>
             <w:left w:w="108" w:type="dxa"/>
+            <w:bottom w:w="0" w:type="dxa"/>
             <w:right w:w="108" w:type="dxa"/>
           </w:tblCellMar>
         </w:tblPrEx>
@@ -1933,6 +2289,8 @@
           </w:tcPr>
           <w:p>
             <w:pPr>
+              <w:widowControl w:val="0"/>
+              <w:jc w:val="both"/>
               <w:rPr>
                 <w:vertAlign w:val="baseline"/>
               </w:rPr>
@@ -1953,6 +2311,8 @@
           </w:tcPr>
           <w:p>
             <w:pPr>
+              <w:widowControl w:val="0"/>
+              <w:jc w:val="both"/>
               <w:rPr>
                 <w:vertAlign w:val="baseline"/>
               </w:rPr>
@@ -1973,8 +2333,12 @@
           </w:tcPr>
           <w:p>
             <w:pPr>
-              <w:rPr>
-                <w:vertAlign w:val="baseline"/>
+              <w:widowControl w:val="0"/>
+              <w:jc w:val="both"/>
+              <w:rPr>
+                <w:rFonts w:hint="default"/>
+                <w:vertAlign w:val="baseline"/>
+                <w:lang w:val="en-US"/>
               </w:rPr>
             </w:pPr>
           </w:p>
@@ -1985,8 +2349,12 @@
           </w:tcPr>
           <w:p>
             <w:pPr>
-              <w:rPr>
-                <w:vertAlign w:val="baseline"/>
+              <w:widowControl w:val="0"/>
+              <w:jc w:val="both"/>
+              <w:rPr>
+                <w:rFonts w:hint="default"/>
+                <w:vertAlign w:val="baseline"/>
+                <w:lang w:val="en-US"/>
               </w:rPr>
             </w:pPr>
           </w:p>
@@ -1997,6 +2365,8 @@
           </w:tcPr>
           <w:p>
             <w:pPr>
+              <w:widowControl w:val="0"/>
+              <w:jc w:val="both"/>
               <w:rPr>
                 <w:vertAlign w:val="baseline"/>
               </w:rPr>
@@ -2009,6 +2379,8 @@
           </w:tcPr>
           <w:p>
             <w:pPr>
+              <w:widowControl w:val="0"/>
+              <w:jc w:val="both"/>
               <w:rPr>
                 <w:rFonts w:hint="default"/>
                 <w:vertAlign w:val="baseline"/>
@@ -2031,6 +2403,8 @@
           </w:tcPr>
           <w:p>
             <w:pPr>
+              <w:widowControl w:val="0"/>
+              <w:jc w:val="both"/>
               <w:rPr>
                 <w:rFonts w:hint="default"/>
                 <w:vertAlign w:val="baseline"/>
@@ -2053,6 +2427,8 @@
           </w:tcPr>
           <w:p>
             <w:pPr>
+              <w:widowControl w:val="0"/>
+              <w:jc w:val="both"/>
               <w:rPr>
                 <w:vertAlign w:val="baseline"/>
               </w:rPr>
@@ -2073,6 +2449,8 @@
           </w:tcPr>
           <w:p>
             <w:pPr>
+              <w:widowControl w:val="0"/>
+              <w:jc w:val="both"/>
               <w:rPr>
                 <w:rFonts w:hint="default"/>
                 <w:vertAlign w:val="baseline"/>
@@ -2101,7 +2479,9 @@
             <w:insideV w:val="single" w:color="auto" w:sz="4" w:space="0"/>
           </w:tblBorders>
           <w:tblCellMar>
+            <w:top w:w="0" w:type="dxa"/>
             <w:left w:w="108" w:type="dxa"/>
+            <w:bottom w:w="0" w:type="dxa"/>
             <w:right w:w="108" w:type="dxa"/>
           </w:tblCellMar>
         </w:tblPrEx>
@@ -2114,6 +2494,8 @@
           </w:tcPr>
           <w:p>
             <w:pPr>
+              <w:widowControl w:val="0"/>
+              <w:jc w:val="both"/>
               <w:rPr>
                 <w:rFonts w:hint="default"/>
                 <w:vertAlign w:val="baseline"/>
@@ -2136,6 +2518,8 @@
           </w:tcPr>
           <w:p>
             <w:pPr>
+              <w:widowControl w:val="0"/>
+              <w:jc w:val="both"/>
               <w:rPr>
                 <w:vertAlign w:val="baseline"/>
               </w:rPr>
@@ -2156,6 +2540,8 @@
           </w:tcPr>
           <w:p>
             <w:pPr>
+              <w:widowControl w:val="0"/>
+              <w:jc w:val="both"/>
               <w:rPr>
                 <w:vertAlign w:val="baseline"/>
               </w:rPr>
@@ -2168,6 +2554,8 @@
           </w:tcPr>
           <w:p>
             <w:pPr>
+              <w:widowControl w:val="0"/>
+              <w:jc w:val="both"/>
               <w:rPr>
                 <w:vertAlign w:val="baseline"/>
               </w:rPr>
@@ -2180,6 +2568,8 @@
           </w:tcPr>
           <w:p>
             <w:pPr>
+              <w:widowControl w:val="0"/>
+              <w:jc w:val="both"/>
               <w:rPr>
                 <w:vertAlign w:val="baseline"/>
               </w:rPr>
@@ -2192,6 +2582,8 @@
           </w:tcPr>
           <w:p>
             <w:pPr>
+              <w:widowControl w:val="0"/>
+              <w:jc w:val="both"/>
               <w:rPr>
                 <w:rFonts w:hint="default"/>
                 <w:vertAlign w:val="baseline"/>
@@ -2214,6 +2606,8 @@
           </w:tcPr>
           <w:p>
             <w:pPr>
+              <w:widowControl w:val="0"/>
+              <w:jc w:val="both"/>
               <w:rPr>
                 <w:vertAlign w:val="baseline"/>
               </w:rPr>
@@ -2226,6 +2620,8 @@
           </w:tcPr>
           <w:p>
             <w:pPr>
+              <w:widowControl w:val="0"/>
+              <w:jc w:val="both"/>
               <w:rPr>
                 <w:vertAlign w:val="baseline"/>
               </w:rPr>
@@ -2246,6 +2642,8 @@
           </w:tcPr>
           <w:p>
             <w:pPr>
+              <w:widowControl w:val="0"/>
+              <w:jc w:val="both"/>
               <w:rPr>
                 <w:rFonts w:hint="default"/>
                 <w:vertAlign w:val="baseline"/>
@@ -2274,7 +2672,9 @@
             <w:insideV w:val="single" w:color="auto" w:sz="4" w:space="0"/>
           </w:tblBorders>
           <w:tblCellMar>
+            <w:top w:w="0" w:type="dxa"/>
             <w:left w:w="108" w:type="dxa"/>
+            <w:bottom w:w="0" w:type="dxa"/>
             <w:right w:w="108" w:type="dxa"/>
           </w:tblCellMar>
         </w:tblPrEx>
@@ -2287,6 +2687,8 @@
           </w:tcPr>
           <w:p>
             <w:pPr>
+              <w:widowControl w:val="0"/>
+              <w:jc w:val="both"/>
               <w:rPr>
                 <w:vertAlign w:val="baseline"/>
               </w:rPr>
@@ -2307,6 +2709,8 @@
           </w:tcPr>
           <w:p>
             <w:pPr>
+              <w:widowControl w:val="0"/>
+              <w:jc w:val="both"/>
               <w:rPr>
                 <w:vertAlign w:val="baseline"/>
               </w:rPr>
@@ -2319,10 +2723,22 @@
           </w:tcPr>
           <w:p>
             <w:pPr>
-              <w:rPr>
-                <w:vertAlign w:val="baseline"/>
-              </w:rPr>
-            </w:pPr>
+              <w:widowControl w:val="0"/>
+              <w:jc w:val="both"/>
+              <w:rPr>
+                <w:rFonts w:hint="default"/>
+                <w:vertAlign w:val="baseline"/>
+                <w:lang w:val="en-US"/>
+              </w:rPr>
+            </w:pPr>
+            <w:r>
+              <w:rPr>
+                <w:rFonts w:hint="default"/>
+                <w:vertAlign w:val="baseline"/>
+                <w:lang w:val="en-US"/>
+              </w:rPr>
+              <w:t>284</w:t>
+            </w:r>
           </w:p>
         </w:tc>
         <w:tc>
@@ -2331,10 +2747,20 @@
           </w:tcPr>
           <w:p>
             <w:pPr>
-              <w:rPr>
-                <w:vertAlign w:val="baseline"/>
-              </w:rPr>
-            </w:pPr>
+              <w:widowControl w:val="0"/>
+              <w:jc w:val="both"/>
+              <w:rPr>
+                <w:vertAlign w:val="baseline"/>
+              </w:rPr>
+            </w:pPr>
+            <w:r>
+              <w:rPr>
+                <w:rFonts w:hint="default"/>
+                <w:vertAlign w:val="baseline"/>
+                <w:lang w:val="en-US"/>
+              </w:rPr>
+              <w:t>287</w:t>
+            </w:r>
           </w:p>
         </w:tc>
         <w:tc>
@@ -2343,6 +2769,8 @@
           </w:tcPr>
           <w:p>
             <w:pPr>
+              <w:widowControl w:val="0"/>
+              <w:jc w:val="both"/>
               <w:rPr>
                 <w:vertAlign w:val="baseline"/>
               </w:rPr>
@@ -2355,6 +2783,8 @@
           </w:tcPr>
           <w:p>
             <w:pPr>
+              <w:widowControl w:val="0"/>
+              <w:jc w:val="both"/>
               <w:rPr>
                 <w:rFonts w:hint="default"/>
                 <w:vertAlign w:val="baseline"/>
@@ -2377,6 +2807,8 @@
           </w:tcPr>
           <w:p>
             <w:pPr>
+              <w:widowControl w:val="0"/>
+              <w:jc w:val="both"/>
               <w:rPr>
                 <w:rFonts w:hint="default"/>
                 <w:vertAlign w:val="baseline"/>
@@ -2399,6 +2831,8 @@
           </w:tcPr>
           <w:p>
             <w:pPr>
+              <w:widowControl w:val="0"/>
+              <w:jc w:val="both"/>
               <w:rPr>
                 <w:vertAlign w:val="baseline"/>
               </w:rPr>
@@ -2419,6 +2853,8 @@
           </w:tcPr>
           <w:p>
             <w:pPr>
+              <w:widowControl w:val="0"/>
+              <w:jc w:val="both"/>
               <w:rPr>
                 <w:vertAlign w:val="baseline"/>
               </w:rPr>
@@ -2437,7 +2873,9 @@
             <w:insideV w:val="single" w:color="auto" w:sz="4" w:space="0"/>
           </w:tblBorders>
           <w:tblCellMar>
+            <w:top w:w="0" w:type="dxa"/>
             <w:left w:w="108" w:type="dxa"/>
+            <w:bottom w:w="0" w:type="dxa"/>
             <w:right w:w="108" w:type="dxa"/>
           </w:tblCellMar>
         </w:tblPrEx>
@@ -2450,6 +2888,8 @@
           </w:tcPr>
           <w:p>
             <w:pPr>
+              <w:widowControl w:val="0"/>
+              <w:jc w:val="both"/>
               <w:rPr>
                 <w:rFonts w:hint="default"/>
                 <w:vertAlign w:val="baseline"/>
@@ -2472,6 +2912,8 @@
           </w:tcPr>
           <w:p>
             <w:pPr>
+              <w:widowControl w:val="0"/>
+              <w:jc w:val="both"/>
               <w:rPr>
                 <w:vertAlign w:val="baseline"/>
               </w:rPr>
@@ -2492,6 +2934,8 @@
           </w:tcPr>
           <w:p>
             <w:pPr>
+              <w:widowControl w:val="0"/>
+              <w:jc w:val="both"/>
               <w:rPr>
                 <w:vertAlign w:val="baseline"/>
               </w:rPr>
@@ -2504,6 +2948,8 @@
           </w:tcPr>
           <w:p>
             <w:pPr>
+              <w:widowControl w:val="0"/>
+              <w:jc w:val="both"/>
               <w:rPr>
                 <w:vertAlign w:val="baseline"/>
               </w:rPr>
@@ -2516,6 +2962,8 @@
           </w:tcPr>
           <w:p>
             <w:pPr>
+              <w:widowControl w:val="0"/>
+              <w:jc w:val="both"/>
               <w:rPr>
                 <w:vertAlign w:val="baseline"/>
               </w:rPr>
@@ -2528,6 +2976,8 @@
           </w:tcPr>
           <w:p>
             <w:pPr>
+              <w:widowControl w:val="0"/>
+              <w:jc w:val="both"/>
               <w:rPr>
                 <w:rFonts w:hint="default"/>
                 <w:vertAlign w:val="baseline"/>
@@ -2550,6 +3000,8 @@
           </w:tcPr>
           <w:p>
             <w:pPr>
+              <w:widowControl w:val="0"/>
+              <w:jc w:val="both"/>
               <w:rPr>
                 <w:vertAlign w:val="baseline"/>
               </w:rPr>
@@ -2562,6 +3014,8 @@
           </w:tcPr>
           <w:p>
             <w:pPr>
+              <w:widowControl w:val="0"/>
+              <w:jc w:val="both"/>
               <w:rPr>
                 <w:vertAlign w:val="baseline"/>
               </w:rPr>
@@ -2582,6 +3036,8 @@
           </w:tcPr>
           <w:p>
             <w:pPr>
+              <w:widowControl w:val="0"/>
+              <w:jc w:val="both"/>
               <w:rPr>
                 <w:vertAlign w:val="baseline"/>
               </w:rPr>
@@ -2600,7 +3056,9 @@
             <w:insideV w:val="single" w:color="auto" w:sz="4" w:space="0"/>
           </w:tblBorders>
           <w:tblCellMar>
+            <w:top w:w="0" w:type="dxa"/>
             <w:left w:w="108" w:type="dxa"/>
+            <w:bottom w:w="0" w:type="dxa"/>
             <w:right w:w="108" w:type="dxa"/>
           </w:tblCellMar>
         </w:tblPrEx>
@@ -2613,6 +3071,8 @@
           </w:tcPr>
           <w:p>
             <w:pPr>
+              <w:widowControl w:val="0"/>
+              <w:jc w:val="both"/>
               <w:rPr>
                 <w:rFonts w:hint="default"/>
                 <w:vertAlign w:val="baseline"/>
@@ -2635,6 +3095,8 @@
           </w:tcPr>
           <w:p>
             <w:pPr>
+              <w:widowControl w:val="0"/>
+              <w:jc w:val="both"/>
               <w:rPr>
                 <w:vertAlign w:val="baseline"/>
               </w:rPr>
@@ -2655,10 +3117,22 @@
           </w:tcPr>
           <w:p>
             <w:pPr>
-              <w:rPr>
-                <w:vertAlign w:val="baseline"/>
-              </w:rPr>
-            </w:pPr>
+              <w:widowControl w:val="0"/>
+              <w:jc w:val="both"/>
+              <w:rPr>
+                <w:rFonts w:hint="default"/>
+                <w:vertAlign w:val="baseline"/>
+                <w:lang w:val="en-US"/>
+              </w:rPr>
+            </w:pPr>
+            <w:r>
+              <w:rPr>
+                <w:rFonts w:hint="default"/>
+                <w:vertAlign w:val="baseline"/>
+                <w:lang w:val="en-US"/>
+              </w:rPr>
+              <w:t>285</w:t>
+            </w:r>
           </w:p>
         </w:tc>
         <w:tc>
@@ -2667,6 +3141,8 @@
           </w:tcPr>
           <w:p>
             <w:pPr>
+              <w:widowControl w:val="0"/>
+              <w:jc w:val="both"/>
               <w:rPr>
                 <w:vertAlign w:val="baseline"/>
               </w:rPr>
@@ -2679,6 +3155,8 @@
           </w:tcPr>
           <w:p>
             <w:pPr>
+              <w:widowControl w:val="0"/>
+              <w:jc w:val="both"/>
               <w:rPr>
                 <w:vertAlign w:val="baseline"/>
               </w:rPr>
@@ -2691,6 +3169,8 @@
           </w:tcPr>
           <w:p>
             <w:pPr>
+              <w:widowControl w:val="0"/>
+              <w:jc w:val="both"/>
               <w:rPr>
                 <w:rFonts w:hint="default"/>
                 <w:vertAlign w:val="baseline"/>
@@ -2713,6 +3193,8 @@
           </w:tcPr>
           <w:p>
             <w:pPr>
+              <w:widowControl w:val="0"/>
+              <w:jc w:val="both"/>
               <w:rPr>
                 <w:rFonts w:hint="default"/>
                 <w:vertAlign w:val="baseline"/>
@@ -2735,6 +3217,8 @@
           </w:tcPr>
           <w:p>
             <w:pPr>
+              <w:widowControl w:val="0"/>
+              <w:jc w:val="both"/>
               <w:rPr>
                 <w:vertAlign w:val="baseline"/>
               </w:rPr>
@@ -2755,6 +3239,8 @@
           </w:tcPr>
           <w:p>
             <w:pPr>
+              <w:widowControl w:val="0"/>
+              <w:jc w:val="both"/>
               <w:rPr>
                 <w:vertAlign w:val="baseline"/>
               </w:rPr>
@@ -2773,7 +3259,9 @@
             <w:insideV w:val="single" w:color="auto" w:sz="4" w:space="0"/>
           </w:tblBorders>
           <w:tblCellMar>
+            <w:top w:w="0" w:type="dxa"/>
             <w:left w:w="108" w:type="dxa"/>
+            <w:bottom w:w="0" w:type="dxa"/>
             <w:right w:w="108" w:type="dxa"/>
           </w:tblCellMar>
         </w:tblPrEx>
@@ -2786,6 +3274,8 @@
           </w:tcPr>
           <w:p>
             <w:pPr>
+              <w:widowControl w:val="0"/>
+              <w:jc w:val="both"/>
               <w:rPr>
                 <w:rFonts w:hint="default"/>
                 <w:vertAlign w:val="baseline"/>
@@ -2808,6 +3298,8 @@
           </w:tcPr>
           <w:p>
             <w:pPr>
+              <w:widowControl w:val="0"/>
+              <w:jc w:val="both"/>
               <w:rPr>
                 <w:vertAlign w:val="baseline"/>
               </w:rPr>
@@ -2828,10 +3320,22 @@
           </w:tcPr>
           <w:p>
             <w:pPr>
-              <w:rPr>
-                <w:vertAlign w:val="baseline"/>
-              </w:rPr>
-            </w:pPr>
+              <w:widowControl w:val="0"/>
+              <w:jc w:val="both"/>
+              <w:rPr>
+                <w:rFonts w:hint="default"/>
+                <w:vertAlign w:val="baseline"/>
+                <w:lang w:val="en-US"/>
+              </w:rPr>
+            </w:pPr>
+            <w:r>
+              <w:rPr>
+                <w:rFonts w:hint="default"/>
+                <w:vertAlign w:val="baseline"/>
+                <w:lang w:val="en-US"/>
+              </w:rPr>
+              <w:t>278</w:t>
+            </w:r>
           </w:p>
         </w:tc>
         <w:tc>
@@ -2840,10 +3344,22 @@
           </w:tcPr>
           <w:p>
             <w:pPr>
-              <w:rPr>
-                <w:vertAlign w:val="baseline"/>
-              </w:rPr>
-            </w:pPr>
+              <w:widowControl w:val="0"/>
+              <w:jc w:val="both"/>
+              <w:rPr>
+                <w:rFonts w:hint="default"/>
+                <w:vertAlign w:val="baseline"/>
+                <w:lang w:val="en-US"/>
+              </w:rPr>
+            </w:pPr>
+            <w:r>
+              <w:rPr>
+                <w:rFonts w:hint="default"/>
+                <w:vertAlign w:val="baseline"/>
+                <w:lang w:val="en-US"/>
+              </w:rPr>
+              <w:t>270</w:t>
+            </w:r>
           </w:p>
         </w:tc>
         <w:tc>
@@ -2852,6 +3368,8 @@
           </w:tcPr>
           <w:p>
             <w:pPr>
+              <w:widowControl w:val="0"/>
+              <w:jc w:val="both"/>
               <w:rPr>
                 <w:vertAlign w:val="baseline"/>
               </w:rPr>
@@ -2864,6 +3382,8 @@
           </w:tcPr>
           <w:p>
             <w:pPr>
+              <w:widowControl w:val="0"/>
+              <w:jc w:val="both"/>
               <w:rPr>
                 <w:rFonts w:hint="default"/>
                 <w:vertAlign w:val="baseline"/>
@@ -2886,6 +3406,8 @@
           </w:tcPr>
           <w:p>
             <w:pPr>
+              <w:widowControl w:val="0"/>
+              <w:jc w:val="both"/>
               <w:rPr>
                 <w:rFonts w:hint="default"/>
                 <w:vertAlign w:val="baseline"/>
@@ -2908,6 +3430,8 @@
           </w:tcPr>
           <w:p>
             <w:pPr>
+              <w:widowControl w:val="0"/>
+              <w:jc w:val="both"/>
               <w:rPr>
                 <w:vertAlign w:val="baseline"/>
               </w:rPr>
@@ -2928,6 +3452,8 @@
           </w:tcPr>
           <w:p>
             <w:pPr>
+              <w:widowControl w:val="0"/>
+              <w:jc w:val="both"/>
               <w:rPr>
                 <w:vertAlign w:val="baseline"/>
               </w:rPr>
@@ -2946,7 +3472,9 @@
             <w:insideV w:val="single" w:color="auto" w:sz="4" w:space="0"/>
           </w:tblBorders>
           <w:tblCellMar>
+            <w:top w:w="0" w:type="dxa"/>
             <w:left w:w="108" w:type="dxa"/>
+            <w:bottom w:w="0" w:type="dxa"/>
             <w:right w:w="108" w:type="dxa"/>
           </w:tblCellMar>
         </w:tblPrEx>
@@ -2959,6 +3487,8 @@
           </w:tcPr>
           <w:p>
             <w:pPr>
+              <w:widowControl w:val="0"/>
+              <w:jc w:val="both"/>
               <w:rPr>
                 <w:rFonts w:hint="default"/>
                 <w:vertAlign w:val="baseline"/>
@@ -2981,6 +3511,8 @@
           </w:tcPr>
           <w:p>
             <w:pPr>
+              <w:widowControl w:val="0"/>
+              <w:jc w:val="both"/>
               <w:rPr>
                 <w:vertAlign w:val="baseline"/>
               </w:rPr>
@@ -3001,10 +3533,22 @@
           </w:tcPr>
           <w:p>
             <w:pPr>
-              <w:rPr>
-                <w:vertAlign w:val="baseline"/>
-              </w:rPr>
-            </w:pPr>
+              <w:widowControl w:val="0"/>
+              <w:jc w:val="both"/>
+              <w:rPr>
+                <w:rFonts w:hint="default"/>
+                <w:vertAlign w:val="baseline"/>
+                <w:lang w:val="en-US"/>
+              </w:rPr>
+            </w:pPr>
+            <w:r>
+              <w:rPr>
+                <w:rFonts w:hint="default"/>
+                <w:vertAlign w:val="baseline"/>
+                <w:lang w:val="en-US"/>
+              </w:rPr>
+              <w:t>259</w:t>
+            </w:r>
           </w:p>
         </w:tc>
         <w:tc>
@@ -3013,6 +3557,8 @@
           </w:tcPr>
           <w:p>
             <w:pPr>
+              <w:widowControl w:val="0"/>
+              <w:jc w:val="both"/>
               <w:rPr>
                 <w:vertAlign w:val="baseline"/>
               </w:rPr>
@@ -3025,6 +3571,8 @@
           </w:tcPr>
           <w:p>
             <w:pPr>
+              <w:widowControl w:val="0"/>
+              <w:jc w:val="both"/>
               <w:rPr>
                 <w:vertAlign w:val="baseline"/>
               </w:rPr>
@@ -3037,6 +3585,8 @@
           </w:tcPr>
           <w:p>
             <w:pPr>
+              <w:widowControl w:val="0"/>
+              <w:jc w:val="both"/>
               <w:rPr>
                 <w:rFonts w:hint="default"/>
                 <w:vertAlign w:val="baseline"/>
@@ -3059,6 +3609,8 @@
           </w:tcPr>
           <w:p>
             <w:pPr>
+              <w:widowControl w:val="0"/>
+              <w:jc w:val="both"/>
               <w:rPr>
                 <w:rFonts w:hint="default"/>
                 <w:vertAlign w:val="baseline"/>
@@ -3081,6 +3633,8 @@
           </w:tcPr>
           <w:p>
             <w:pPr>
+              <w:widowControl w:val="0"/>
+              <w:jc w:val="both"/>
               <w:rPr>
                 <w:vertAlign w:val="baseline"/>
               </w:rPr>
@@ -3101,6 +3655,8 @@
           </w:tcPr>
           <w:p>
             <w:pPr>
+              <w:widowControl w:val="0"/>
+              <w:jc w:val="both"/>
               <w:rPr>
                 <w:vertAlign w:val="baseline"/>
               </w:rPr>
@@ -3119,7 +3675,9 @@
             <w:insideV w:val="single" w:color="auto" w:sz="4" w:space="0"/>
           </w:tblBorders>
           <w:tblCellMar>
+            <w:top w:w="0" w:type="dxa"/>
             <w:left w:w="108" w:type="dxa"/>
+            <w:bottom w:w="0" w:type="dxa"/>
             <w:right w:w="108" w:type="dxa"/>
           </w:tblCellMar>
         </w:tblPrEx>
@@ -3132,6 +3690,8 @@
           </w:tcPr>
           <w:p>
             <w:pPr>
+              <w:widowControl w:val="0"/>
+              <w:jc w:val="both"/>
               <w:rPr>
                 <w:rFonts w:hint="default"/>
                 <w:vertAlign w:val="baseline"/>
@@ -3154,6 +3714,8 @@
           </w:tcPr>
           <w:p>
             <w:pPr>
+              <w:widowControl w:val="0"/>
+              <w:jc w:val="both"/>
               <w:rPr>
                 <w:vertAlign w:val="baseline"/>
               </w:rPr>
@@ -3174,10 +3736,22 @@
           </w:tcPr>
           <w:p>
             <w:pPr>
-              <w:rPr>
-                <w:vertAlign w:val="baseline"/>
-              </w:rPr>
-            </w:pPr>
+              <w:widowControl w:val="0"/>
+              <w:jc w:val="both"/>
+              <w:rPr>
+                <w:rFonts w:hint="default"/>
+                <w:vertAlign w:val="baseline"/>
+                <w:lang w:val="en-US"/>
+              </w:rPr>
+            </w:pPr>
+            <w:r>
+              <w:rPr>
+                <w:rFonts w:hint="default"/>
+                <w:vertAlign w:val="baseline"/>
+                <w:lang w:val="en-US"/>
+              </w:rPr>
+              <w:t>219</w:t>
+            </w:r>
           </w:p>
         </w:tc>
         <w:tc>
@@ -3186,10 +3760,22 @@
           </w:tcPr>
           <w:p>
             <w:pPr>
-              <w:rPr>
-                <w:vertAlign w:val="baseline"/>
-              </w:rPr>
-            </w:pPr>
+              <w:widowControl w:val="0"/>
+              <w:jc w:val="both"/>
+              <w:rPr>
+                <w:rFonts w:hint="default"/>
+                <w:vertAlign w:val="baseline"/>
+                <w:lang w:val="en-US"/>
+              </w:rPr>
+            </w:pPr>
+            <w:r>
+              <w:rPr>
+                <w:rFonts w:hint="default"/>
+                <w:vertAlign w:val="baseline"/>
+                <w:lang w:val="en-US"/>
+              </w:rPr>
+              <w:t>244</w:t>
+            </w:r>
           </w:p>
         </w:tc>
         <w:tc>
@@ -3198,6 +3784,8 @@
           </w:tcPr>
           <w:p>
             <w:pPr>
+              <w:widowControl w:val="0"/>
+              <w:jc w:val="both"/>
               <w:rPr>
                 <w:vertAlign w:val="baseline"/>
               </w:rPr>
@@ -3210,6 +3798,8 @@
           </w:tcPr>
           <w:p>
             <w:pPr>
+              <w:widowControl w:val="0"/>
+              <w:jc w:val="both"/>
               <w:rPr>
                 <w:rFonts w:hint="default"/>
                 <w:vertAlign w:val="baseline"/>
@@ -3232,6 +3822,8 @@
           </w:tcPr>
           <w:p>
             <w:pPr>
+              <w:widowControl w:val="0"/>
+              <w:jc w:val="both"/>
               <w:rPr>
                 <w:rFonts w:hint="default"/>
                 <w:vertAlign w:val="baseline"/>
@@ -3254,6 +3846,8 @@
           </w:tcPr>
           <w:p>
             <w:pPr>
+              <w:widowControl w:val="0"/>
+              <w:jc w:val="both"/>
               <w:rPr>
                 <w:vertAlign w:val="baseline"/>
               </w:rPr>
@@ -3274,6 +3868,8 @@
           </w:tcPr>
           <w:p>
             <w:pPr>
+              <w:widowControl w:val="0"/>
+              <w:jc w:val="both"/>
               <w:rPr>
                 <w:vertAlign w:val="baseline"/>
               </w:rPr>
@@ -3292,7 +3888,9 @@
             <w:insideV w:val="single" w:color="auto" w:sz="4" w:space="0"/>
           </w:tblBorders>
           <w:tblCellMar>
+            <w:top w:w="0" w:type="dxa"/>
             <w:left w:w="108" w:type="dxa"/>
+            <w:bottom w:w="0" w:type="dxa"/>
             <w:right w:w="108" w:type="dxa"/>
           </w:tblCellMar>
         </w:tblPrEx>
@@ -3305,6 +3903,8 @@
           </w:tcPr>
           <w:p>
             <w:pPr>
+              <w:widowControl w:val="0"/>
+              <w:jc w:val="both"/>
               <w:rPr>
                 <w:rFonts w:hint="default"/>
                 <w:vertAlign w:val="baseline"/>
@@ -3327,8 +3927,12 @@
           </w:tcPr>
           <w:p>
             <w:pPr>
-              <w:rPr>
-                <w:vertAlign w:val="baseline"/>
+              <w:widowControl w:val="0"/>
+              <w:jc w:val="both"/>
+              <w:rPr>
+                <w:rFonts w:hint="default"/>
+                <w:vertAlign w:val="baseline"/>
+                <w:lang w:val="en-US"/>
               </w:rPr>
             </w:pPr>
             <w:r>
@@ -3339,6 +3943,14 @@
               </w:rPr>
               <w:t>Fast corner</w:t>
             </w:r>
+            <w:r>
+              <w:rPr>
+                <w:rFonts w:hint="default"/>
+                <w:vertAlign w:val="baseline"/>
+                <w:lang w:val="en-US"/>
+              </w:rPr>
+              <w:t xml:space="preserve"> / Straight</w:t>
+            </w:r>
           </w:p>
         </w:tc>
         <w:tc>
@@ -3347,6 +3959,8 @@
           </w:tcPr>
           <w:p>
             <w:pPr>
+              <w:widowControl w:val="0"/>
+              <w:jc w:val="both"/>
               <w:rPr>
                 <w:vertAlign w:val="baseline"/>
               </w:rPr>
@@ -3359,6 +3973,8 @@
           </w:tcPr>
           <w:p>
             <w:pPr>
+              <w:widowControl w:val="0"/>
+              <w:jc w:val="both"/>
               <w:rPr>
                 <w:vertAlign w:val="baseline"/>
               </w:rPr>
@@ -3371,6 +3987,8 @@
           </w:tcPr>
           <w:p>
             <w:pPr>
+              <w:widowControl w:val="0"/>
+              <w:jc w:val="both"/>
               <w:rPr>
                 <w:vertAlign w:val="baseline"/>
               </w:rPr>
@@ -3383,6 +4001,8 @@
           </w:tcPr>
           <w:p>
             <w:pPr>
+              <w:widowControl w:val="0"/>
+              <w:jc w:val="both"/>
               <w:rPr>
                 <w:rFonts w:hint="default"/>
                 <w:vertAlign w:val="baseline"/>
@@ -3405,6 +4025,8 @@
           </w:tcPr>
           <w:p>
             <w:pPr>
+              <w:widowControl w:val="0"/>
+              <w:jc w:val="both"/>
               <w:rPr>
                 <w:rFonts w:hint="default"/>
                 <w:vertAlign w:val="baseline"/>
@@ -3427,6 +4049,8 @@
           </w:tcPr>
           <w:p>
             <w:pPr>
+              <w:widowControl w:val="0"/>
+              <w:jc w:val="both"/>
               <w:rPr>
                 <w:vertAlign w:val="baseline"/>
               </w:rPr>
@@ -3447,6 +4071,8 @@
           </w:tcPr>
           <w:p>
             <w:pPr>
+              <w:widowControl w:val="0"/>
+              <w:jc w:val="both"/>
               <w:rPr>
                 <w:vertAlign w:val="baseline"/>
               </w:rPr>
@@ -3465,7 +4091,9 @@
             <w:insideV w:val="single" w:color="auto" w:sz="4" w:space="0"/>
           </w:tblBorders>
           <w:tblCellMar>
+            <w:top w:w="0" w:type="dxa"/>
             <w:left w:w="108" w:type="dxa"/>
+            <w:bottom w:w="0" w:type="dxa"/>
             <w:right w:w="108" w:type="dxa"/>
           </w:tblCellMar>
         </w:tblPrEx>
@@ -3478,6 +4106,8 @@
           </w:tcPr>
           <w:p>
             <w:pPr>
+              <w:widowControl w:val="0"/>
+              <w:jc w:val="both"/>
               <w:rPr>
                 <w:rFonts w:hint="default"/>
                 <w:vertAlign w:val="baseline"/>
@@ -3500,6 +4130,8 @@
           </w:tcPr>
           <w:p>
             <w:pPr>
+              <w:widowControl w:val="0"/>
+              <w:jc w:val="both"/>
               <w:rPr>
                 <w:vertAlign w:val="baseline"/>
               </w:rPr>
@@ -3520,6 +4152,8 @@
           </w:tcPr>
           <w:p>
             <w:pPr>
+              <w:widowControl w:val="0"/>
+              <w:jc w:val="both"/>
               <w:rPr>
                 <w:vertAlign w:val="baseline"/>
               </w:rPr>
@@ -3532,6 +4166,8 @@
           </w:tcPr>
           <w:p>
             <w:pPr>
+              <w:widowControl w:val="0"/>
+              <w:jc w:val="both"/>
               <w:rPr>
                 <w:vertAlign w:val="baseline"/>
               </w:rPr>
@@ -3544,6 +4180,8 @@
           </w:tcPr>
           <w:p>
             <w:pPr>
+              <w:widowControl w:val="0"/>
+              <w:jc w:val="both"/>
               <w:rPr>
                 <w:vertAlign w:val="baseline"/>
               </w:rPr>
@@ -3556,6 +4194,8 @@
           </w:tcPr>
           <w:p>
             <w:pPr>
+              <w:widowControl w:val="0"/>
+              <w:jc w:val="both"/>
               <w:rPr>
                 <w:rFonts w:hint="default"/>
                 <w:vertAlign w:val="baseline"/>
@@ -3578,6 +4218,8 @@
           </w:tcPr>
           <w:p>
             <w:pPr>
+              <w:widowControl w:val="0"/>
+              <w:jc w:val="both"/>
               <w:rPr>
                 <w:vertAlign w:val="baseline"/>
               </w:rPr>
@@ -3590,6 +4232,8 @@
           </w:tcPr>
           <w:p>
             <w:pPr>
+              <w:widowControl w:val="0"/>
+              <w:jc w:val="both"/>
               <w:rPr>
                 <w:vertAlign w:val="baseline"/>
               </w:rPr>
@@ -3610,6 +4254,8 @@
           </w:tcPr>
           <w:p>
             <w:pPr>
+              <w:widowControl w:val="0"/>
+              <w:jc w:val="both"/>
               <w:rPr>
                 <w:rFonts w:hint="default"/>
                 <w:vertAlign w:val="baseline"/>
@@ -3638,7 +4284,9 @@
             <w:insideV w:val="single" w:color="auto" w:sz="4" w:space="0"/>
           </w:tblBorders>
           <w:tblCellMar>
+            <w:top w:w="0" w:type="dxa"/>
             <w:left w:w="108" w:type="dxa"/>
+            <w:bottom w:w="0" w:type="dxa"/>
             <w:right w:w="108" w:type="dxa"/>
           </w:tblCellMar>
         </w:tblPrEx>
@@ -3651,6 +4299,8 @@
           </w:tcPr>
           <w:p>
             <w:pPr>
+              <w:widowControl w:val="0"/>
+              <w:jc w:val="both"/>
               <w:rPr>
                 <w:rFonts w:hint="default"/>
                 <w:vertAlign w:val="baseline"/>
@@ -3673,6 +4323,8 @@
           </w:tcPr>
           <w:p>
             <w:pPr>
+              <w:widowControl w:val="0"/>
+              <w:jc w:val="both"/>
               <w:rPr>
                 <w:vertAlign w:val="baseline"/>
               </w:rPr>
@@ -3693,10 +4345,22 @@
           </w:tcPr>
           <w:p>
             <w:pPr>
-              <w:rPr>
-                <w:vertAlign w:val="baseline"/>
-              </w:rPr>
-            </w:pPr>
+              <w:widowControl w:val="0"/>
+              <w:jc w:val="both"/>
+              <w:rPr>
+                <w:rFonts w:hint="default"/>
+                <w:vertAlign w:val="baseline"/>
+                <w:lang w:val="en-US"/>
+              </w:rPr>
+            </w:pPr>
+            <w:r>
+              <w:rPr>
+                <w:rFonts w:hint="default"/>
+                <w:vertAlign w:val="baseline"/>
+                <w:lang w:val="en-US"/>
+              </w:rPr>
+              <w:t>236</w:t>
+            </w:r>
           </w:p>
         </w:tc>
         <w:tc>
@@ -3705,10 +4369,22 @@
           </w:tcPr>
           <w:p>
             <w:pPr>
-              <w:rPr>
-                <w:vertAlign w:val="baseline"/>
-              </w:rPr>
-            </w:pPr>
+              <w:widowControl w:val="0"/>
+              <w:jc w:val="both"/>
+              <w:rPr>
+                <w:rFonts w:hint="default"/>
+                <w:vertAlign w:val="baseline"/>
+                <w:lang w:val="en-US"/>
+              </w:rPr>
+            </w:pPr>
+            <w:r>
+              <w:rPr>
+                <w:rFonts w:hint="default"/>
+                <w:vertAlign w:val="baseline"/>
+                <w:lang w:val="en-US"/>
+              </w:rPr>
+              <w:t>249</w:t>
+            </w:r>
           </w:p>
         </w:tc>
         <w:tc>
@@ -3717,6 +4393,8 @@
           </w:tcPr>
           <w:p>
             <w:pPr>
+              <w:widowControl w:val="0"/>
+              <w:jc w:val="both"/>
               <w:rPr>
                 <w:vertAlign w:val="baseline"/>
               </w:rPr>
@@ -3729,6 +4407,8 @@
           </w:tcPr>
           <w:p>
             <w:pPr>
+              <w:widowControl w:val="0"/>
+              <w:jc w:val="both"/>
               <w:rPr>
                 <w:rFonts w:hint="default"/>
                 <w:vertAlign w:val="baseline"/>
@@ -3751,6 +4431,8 @@
           </w:tcPr>
           <w:p>
             <w:pPr>
+              <w:widowControl w:val="0"/>
+              <w:jc w:val="both"/>
               <w:rPr>
                 <w:rFonts w:hint="default"/>
                 <w:vertAlign w:val="baseline"/>
@@ -3773,6 +4455,8 @@
           </w:tcPr>
           <w:p>
             <w:pPr>
+              <w:widowControl w:val="0"/>
+              <w:jc w:val="both"/>
               <w:rPr>
                 <w:vertAlign w:val="baseline"/>
               </w:rPr>
@@ -3793,6 +4477,8 @@
           </w:tcPr>
           <w:p>
             <w:pPr>
+              <w:widowControl w:val="0"/>
+              <w:jc w:val="both"/>
               <w:rPr>
                 <w:vertAlign w:val="baseline"/>
               </w:rPr>
@@ -3811,7 +4497,9 @@
             <w:insideV w:val="single" w:color="auto" w:sz="4" w:space="0"/>
           </w:tblBorders>
           <w:tblCellMar>
+            <w:top w:w="0" w:type="dxa"/>
             <w:left w:w="108" w:type="dxa"/>
+            <w:bottom w:w="0" w:type="dxa"/>
             <w:right w:w="108" w:type="dxa"/>
           </w:tblCellMar>
         </w:tblPrEx>
@@ -3824,6 +4512,8 @@
           </w:tcPr>
           <w:p>
             <w:pPr>
+              <w:widowControl w:val="0"/>
+              <w:jc w:val="both"/>
               <w:rPr>
                 <w:rFonts w:hint="default"/>
                 <w:vertAlign w:val="baseline"/>
@@ -3846,6 +4536,8 @@
           </w:tcPr>
           <w:p>
             <w:pPr>
+              <w:widowControl w:val="0"/>
+              <w:jc w:val="both"/>
               <w:rPr>
                 <w:vertAlign w:val="baseline"/>
               </w:rPr>
@@ -3866,6 +4558,8 @@
           </w:tcPr>
           <w:p>
             <w:pPr>
+              <w:widowControl w:val="0"/>
+              <w:jc w:val="both"/>
               <w:rPr>
                 <w:vertAlign w:val="baseline"/>
               </w:rPr>
@@ -3878,6 +4572,8 @@
           </w:tcPr>
           <w:p>
             <w:pPr>
+              <w:widowControl w:val="0"/>
+              <w:jc w:val="both"/>
               <w:rPr>
                 <w:vertAlign w:val="baseline"/>
               </w:rPr>
@@ -3890,6 +4586,8 @@
           </w:tcPr>
           <w:p>
             <w:pPr>
+              <w:widowControl w:val="0"/>
+              <w:jc w:val="both"/>
               <w:rPr>
                 <w:vertAlign w:val="baseline"/>
               </w:rPr>
@@ -3902,6 +4600,8 @@
           </w:tcPr>
           <w:p>
             <w:pPr>
+              <w:widowControl w:val="0"/>
+              <w:jc w:val="both"/>
               <w:rPr>
                 <w:rFonts w:hint="default"/>
                 <w:vertAlign w:val="baseline"/>
@@ -3924,6 +4624,8 @@
           </w:tcPr>
           <w:p>
             <w:pPr>
+              <w:widowControl w:val="0"/>
+              <w:jc w:val="both"/>
               <w:rPr>
                 <w:vertAlign w:val="baseline"/>
               </w:rPr>
@@ -3936,6 +4638,8 @@
           </w:tcPr>
           <w:p>
             <w:pPr>
+              <w:widowControl w:val="0"/>
+              <w:jc w:val="both"/>
               <w:rPr>
                 <w:vertAlign w:val="baseline"/>
               </w:rPr>
@@ -3956,6 +4660,8 @@
           </w:tcPr>
           <w:p>
             <w:pPr>
+              <w:widowControl w:val="0"/>
+              <w:jc w:val="both"/>
               <w:rPr>
                 <w:vertAlign w:val="baseline"/>
               </w:rPr>
@@ -3974,7 +4680,9 @@
             <w:insideV w:val="single" w:color="auto" w:sz="4" w:space="0"/>
           </w:tblBorders>
           <w:tblCellMar>
+            <w:top w:w="0" w:type="dxa"/>
             <w:left w:w="108" w:type="dxa"/>
+            <w:bottom w:w="0" w:type="dxa"/>
             <w:right w:w="108" w:type="dxa"/>
           </w:tblCellMar>
         </w:tblPrEx>
@@ -3987,6 +4695,8 @@
           </w:tcPr>
           <w:p>
             <w:pPr>
+              <w:widowControl w:val="0"/>
+              <w:jc w:val="both"/>
               <w:rPr>
                 <w:rFonts w:hint="default"/>
                 <w:vertAlign w:val="baseline"/>
@@ -4009,6 +4719,8 @@
           </w:tcPr>
           <w:p>
             <w:pPr>
+              <w:widowControl w:val="0"/>
+              <w:jc w:val="both"/>
               <w:rPr>
                 <w:vertAlign w:val="baseline"/>
               </w:rPr>
@@ -4029,6 +4741,8 @@
           </w:tcPr>
           <w:p>
             <w:pPr>
+              <w:widowControl w:val="0"/>
+              <w:jc w:val="both"/>
               <w:rPr>
                 <w:vertAlign w:val="baseline"/>
               </w:rPr>
@@ -4041,6 +4755,8 @@
           </w:tcPr>
           <w:p>
             <w:pPr>
+              <w:widowControl w:val="0"/>
+              <w:jc w:val="both"/>
               <w:rPr>
                 <w:vertAlign w:val="baseline"/>
               </w:rPr>
@@ -4053,6 +4769,8 @@
           </w:tcPr>
           <w:p>
             <w:pPr>
+              <w:widowControl w:val="0"/>
+              <w:jc w:val="both"/>
               <w:rPr>
                 <w:vertAlign w:val="baseline"/>
               </w:rPr>
@@ -4065,6 +4783,8 @@
           </w:tcPr>
           <w:p>
             <w:pPr>
+              <w:widowControl w:val="0"/>
+              <w:jc w:val="both"/>
               <w:rPr>
                 <w:rFonts w:hint="default"/>
                 <w:vertAlign w:val="baseline"/>
@@ -4087,6 +4807,8 @@
           </w:tcPr>
           <w:p>
             <w:pPr>
+              <w:widowControl w:val="0"/>
+              <w:jc w:val="both"/>
               <w:rPr>
                 <w:vertAlign w:val="baseline"/>
               </w:rPr>
@@ -4099,6 +4821,8 @@
           </w:tcPr>
           <w:p>
             <w:pPr>
+              <w:widowControl w:val="0"/>
+              <w:jc w:val="both"/>
               <w:rPr>
                 <w:vertAlign w:val="baseline"/>
               </w:rPr>
@@ -4119,10 +4843,16 @@
           </w:tcPr>
           <w:p>
             <w:pPr>
-              <w:rPr>
-                <w:vertAlign w:val="baseline"/>
-              </w:rPr>
-            </w:pPr>
+              <w:widowControl w:val="0"/>
+              <w:jc w:val="both"/>
+              <w:rPr>
+                <w:rFonts w:hint="default"/>
+                <w:vertAlign w:val="baseline"/>
+                <w:lang w:val="en-GB"/>
+              </w:rPr>
+            </w:pPr>
+            <w:bookmarkStart w:id="0" w:name="_GoBack"/>
+            <w:bookmarkEnd w:id="0"/>
           </w:p>
         </w:tc>
       </w:tr>
@@ -4137,7 +4867,9 @@
             <w:insideV w:val="single" w:color="auto" w:sz="4" w:space="0"/>
           </w:tblBorders>
           <w:tblCellMar>
+            <w:top w:w="0" w:type="dxa"/>
             <w:left w:w="108" w:type="dxa"/>
+            <w:bottom w:w="0" w:type="dxa"/>
             <w:right w:w="108" w:type="dxa"/>
           </w:tblCellMar>
         </w:tblPrEx>
@@ -4150,6 +4882,8 @@
           </w:tcPr>
           <w:p>
             <w:pPr>
+              <w:widowControl w:val="0"/>
+              <w:jc w:val="both"/>
               <w:rPr>
                 <w:rFonts w:hint="default"/>
                 <w:vertAlign w:val="baseline"/>
@@ -4172,6 +4906,8 @@
           </w:tcPr>
           <w:p>
             <w:pPr>
+              <w:widowControl w:val="0"/>
+              <w:jc w:val="both"/>
               <w:rPr>
                 <w:vertAlign w:val="baseline"/>
               </w:rPr>
@@ -4192,10 +4928,22 @@
           </w:tcPr>
           <w:p>
             <w:pPr>
-              <w:rPr>
-                <w:vertAlign w:val="baseline"/>
-              </w:rPr>
-            </w:pPr>
+              <w:widowControl w:val="0"/>
+              <w:jc w:val="both"/>
+              <w:rPr>
+                <w:rFonts w:hint="default"/>
+                <w:vertAlign w:val="baseline"/>
+                <w:lang w:val="en-US"/>
+              </w:rPr>
+            </w:pPr>
+            <w:r>
+              <w:rPr>
+                <w:rFonts w:hint="default"/>
+                <w:vertAlign w:val="baseline"/>
+                <w:lang w:val="en-US"/>
+              </w:rPr>
+              <w:t>105</w:t>
+            </w:r>
           </w:p>
         </w:tc>
         <w:tc>
@@ -4204,10 +4952,22 @@
           </w:tcPr>
           <w:p>
             <w:pPr>
-              <w:rPr>
-                <w:vertAlign w:val="baseline"/>
-              </w:rPr>
-            </w:pPr>
+              <w:widowControl w:val="0"/>
+              <w:jc w:val="both"/>
+              <w:rPr>
+                <w:rFonts w:hint="default"/>
+                <w:vertAlign w:val="baseline"/>
+                <w:lang w:val="en-US"/>
+              </w:rPr>
+            </w:pPr>
+            <w:r>
+              <w:rPr>
+                <w:rFonts w:hint="default"/>
+                <w:vertAlign w:val="baseline"/>
+                <w:lang w:val="en-US"/>
+              </w:rPr>
+              <w:t>113</w:t>
+            </w:r>
           </w:p>
         </w:tc>
         <w:tc>
@@ -4216,6 +4976,8 @@
           </w:tcPr>
           <w:p>
             <w:pPr>
+              <w:widowControl w:val="0"/>
+              <w:jc w:val="both"/>
               <w:rPr>
                 <w:vertAlign w:val="baseline"/>
               </w:rPr>
@@ -4228,6 +4990,8 @@
           </w:tcPr>
           <w:p>
             <w:pPr>
+              <w:widowControl w:val="0"/>
+              <w:jc w:val="both"/>
               <w:rPr>
                 <w:rFonts w:hint="default"/>
                 <w:vertAlign w:val="baseline"/>
@@ -4250,6 +5014,8 @@
           </w:tcPr>
           <w:p>
             <w:pPr>
+              <w:widowControl w:val="0"/>
+              <w:jc w:val="both"/>
               <w:rPr>
                 <w:rFonts w:hint="default"/>
                 <w:vertAlign w:val="baseline"/>
@@ -4272,6 +5038,8 @@
           </w:tcPr>
           <w:p>
             <w:pPr>
+              <w:widowControl w:val="0"/>
+              <w:jc w:val="both"/>
               <w:rPr>
                 <w:vertAlign w:val="baseline"/>
               </w:rPr>
@@ -4292,6 +5060,8 @@
           </w:tcPr>
           <w:p>
             <w:pPr>
+              <w:widowControl w:val="0"/>
+              <w:jc w:val="both"/>
               <w:rPr>
                 <w:rFonts w:hint="default"/>
                 <w:vertAlign w:val="baseline"/>
@@ -4312,7 +5082,9 @@
             <w:insideV w:val="single" w:color="auto" w:sz="4" w:space="0"/>
           </w:tblBorders>
           <w:tblCellMar>
+            <w:top w:w="0" w:type="dxa"/>
             <w:left w:w="108" w:type="dxa"/>
+            <w:bottom w:w="0" w:type="dxa"/>
             <w:right w:w="108" w:type="dxa"/>
           </w:tblCellMar>
         </w:tblPrEx>
@@ -4325,6 +5097,8 @@
           </w:tcPr>
           <w:p>
             <w:pPr>
+              <w:widowControl w:val="0"/>
+              <w:jc w:val="both"/>
               <w:rPr>
                 <w:rFonts w:hint="default"/>
                 <w:vertAlign w:val="baseline"/>
@@ -4347,6 +5121,8 @@
           </w:tcPr>
           <w:p>
             <w:pPr>
+              <w:widowControl w:val="0"/>
+              <w:jc w:val="both"/>
               <w:rPr>
                 <w:vertAlign w:val="baseline"/>
               </w:rPr>
@@ -4367,10 +5143,22 @@
           </w:tcPr>
           <w:p>
             <w:pPr>
-              <w:rPr>
-                <w:vertAlign w:val="baseline"/>
-              </w:rPr>
-            </w:pPr>
+              <w:widowControl w:val="0"/>
+              <w:jc w:val="both"/>
+              <w:rPr>
+                <w:rFonts w:hint="default"/>
+                <w:vertAlign w:val="baseline"/>
+                <w:lang w:val="en-US"/>
+              </w:rPr>
+            </w:pPr>
+            <w:r>
+              <w:rPr>
+                <w:rFonts w:hint="default"/>
+                <w:vertAlign w:val="baseline"/>
+                <w:lang w:val="en-US"/>
+              </w:rPr>
+              <w:t>130</w:t>
+            </w:r>
           </w:p>
         </w:tc>
         <w:tc>
@@ -4379,10 +5167,22 @@
           </w:tcPr>
           <w:p>
             <w:pPr>
-              <w:rPr>
-                <w:vertAlign w:val="baseline"/>
-              </w:rPr>
-            </w:pPr>
+              <w:widowControl w:val="0"/>
+              <w:jc w:val="both"/>
+              <w:rPr>
+                <w:rFonts w:hint="default"/>
+                <w:vertAlign w:val="baseline"/>
+                <w:lang w:val="en-US"/>
+              </w:rPr>
+            </w:pPr>
+            <w:r>
+              <w:rPr>
+                <w:rFonts w:hint="default"/>
+                <w:vertAlign w:val="baseline"/>
+                <w:lang w:val="en-US"/>
+              </w:rPr>
+              <w:t>184</w:t>
+            </w:r>
           </w:p>
         </w:tc>
         <w:tc>
@@ -4391,6 +5191,8 @@
           </w:tcPr>
           <w:p>
             <w:pPr>
+              <w:widowControl w:val="0"/>
+              <w:jc w:val="both"/>
               <w:rPr>
                 <w:vertAlign w:val="baseline"/>
               </w:rPr>
@@ -4403,6 +5205,8 @@
           </w:tcPr>
           <w:p>
             <w:pPr>
+              <w:widowControl w:val="0"/>
+              <w:jc w:val="both"/>
               <w:rPr>
                 <w:rFonts w:hint="default"/>
                 <w:vertAlign w:val="baseline"/>
@@ -4425,6 +5229,8 @@
           </w:tcPr>
           <w:p>
             <w:pPr>
+              <w:widowControl w:val="0"/>
+              <w:jc w:val="both"/>
               <w:rPr>
                 <w:rFonts w:hint="default"/>
                 <w:vertAlign w:val="baseline"/>
@@ -4447,6 +5253,8 @@
           </w:tcPr>
           <w:p>
             <w:pPr>
+              <w:widowControl w:val="0"/>
+              <w:jc w:val="both"/>
               <w:rPr>
                 <w:vertAlign w:val="baseline"/>
               </w:rPr>
@@ -4467,6 +5275,8 @@
           </w:tcPr>
           <w:p>
             <w:pPr>
+              <w:widowControl w:val="0"/>
+              <w:jc w:val="both"/>
               <w:rPr>
                 <w:vertAlign w:val="baseline"/>
               </w:rPr>
@@ -4493,7 +5303,9 @@
             <w:insideV w:val="single" w:color="auto" w:sz="4" w:space="0"/>
           </w:tblBorders>
           <w:tblCellMar>
+            <w:top w:w="0" w:type="dxa"/>
             <w:left w:w="108" w:type="dxa"/>
+            <w:bottom w:w="0" w:type="dxa"/>
             <w:right w:w="108" w:type="dxa"/>
           </w:tblCellMar>
         </w:tblPrEx>
@@ -4506,6 +5318,8 @@
           </w:tcPr>
           <w:p>
             <w:pPr>
+              <w:widowControl w:val="0"/>
+              <w:jc w:val="both"/>
               <w:rPr>
                 <w:rFonts w:hint="default"/>
                 <w:vertAlign w:val="baseline"/>
@@ -4528,17 +5342,27 @@
           </w:tcPr>
           <w:p>
             <w:pPr>
-              <w:rPr>
-                <w:vertAlign w:val="baseline"/>
-              </w:rPr>
-            </w:pPr>
-            <w:r>
-              <w:rPr>
-                <w:rFonts w:hint="default"/>
-                <w:vertAlign w:val="baseline"/>
-                <w:lang w:val="en-GB"/>
-              </w:rPr>
-              <w:t>Slow corner</w:t>
+              <w:widowControl w:val="0"/>
+              <w:jc w:val="both"/>
+              <w:rPr>
+                <w:vertAlign w:val="baseline"/>
+              </w:rPr>
+            </w:pPr>
+            <w:r>
+              <w:rPr>
+                <w:rFonts w:hint="default"/>
+                <w:vertAlign w:val="baseline"/>
+                <w:lang w:val="en-US"/>
+              </w:rPr>
+              <w:t xml:space="preserve">Fast </w:t>
+            </w:r>
+            <w:r>
+              <w:rPr>
+                <w:rFonts w:hint="default"/>
+                <w:vertAlign w:val="baseline"/>
+                <w:lang w:val="en-GB"/>
+              </w:rPr>
+              <w:t>corner</w:t>
             </w:r>
           </w:p>
         </w:tc>
@@ -4548,10 +5372,22 @@
           </w:tcPr>
           <w:p>
             <w:pPr>
-              <w:rPr>
-                <w:vertAlign w:val="baseline"/>
-              </w:rPr>
-            </w:pPr>
+              <w:widowControl w:val="0"/>
+              <w:jc w:val="both"/>
+              <w:rPr>
+                <w:rFonts w:hint="default"/>
+                <w:vertAlign w:val="baseline"/>
+                <w:lang w:val="en-US"/>
+              </w:rPr>
+            </w:pPr>
+            <w:r>
+              <w:rPr>
+                <w:rFonts w:hint="default"/>
+                <w:vertAlign w:val="baseline"/>
+                <w:lang w:val="en-US"/>
+              </w:rPr>
+              <w:t xml:space="preserve">226  </w:t>
+            </w:r>
           </w:p>
         </w:tc>
         <w:tc>
@@ -4560,10 +5396,22 @@
           </w:tcPr>
           <w:p>
             <w:pPr>
-              <w:rPr>
-                <w:vertAlign w:val="baseline"/>
-              </w:rPr>
-            </w:pPr>
+              <w:widowControl w:val="0"/>
+              <w:jc w:val="both"/>
+              <w:rPr>
+                <w:rFonts w:hint="default"/>
+                <w:vertAlign w:val="baseline"/>
+                <w:lang w:val="en-US"/>
+              </w:rPr>
+            </w:pPr>
+            <w:r>
+              <w:rPr>
+                <w:rFonts w:hint="default"/>
+                <w:vertAlign w:val="baseline"/>
+                <w:lang w:val="en-US"/>
+              </w:rPr>
+              <w:t>243</w:t>
+            </w:r>
           </w:p>
         </w:tc>
         <w:tc>
@@ -4572,6 +5420,8 @@
           </w:tcPr>
           <w:p>
             <w:pPr>
+              <w:widowControl w:val="0"/>
+              <w:jc w:val="both"/>
               <w:rPr>
                 <w:vertAlign w:val="baseline"/>
               </w:rPr>
@@ -4584,6 +5434,8 @@
           </w:tcPr>
           <w:p>
             <w:pPr>
+              <w:widowControl w:val="0"/>
+              <w:jc w:val="both"/>
               <w:rPr>
                 <w:rFonts w:hint="default"/>
                 <w:vertAlign w:val="baseline"/>
@@ -4606,6 +5458,8 @@
           </w:tcPr>
           <w:p>
             <w:pPr>
+              <w:widowControl w:val="0"/>
+              <w:jc w:val="both"/>
               <w:rPr>
                 <w:rFonts w:hint="default"/>
                 <w:vertAlign w:val="baseline"/>
@@ -4628,6 +5482,8 @@
           </w:tcPr>
           <w:p>
             <w:pPr>
+              <w:widowControl w:val="0"/>
+              <w:jc w:val="both"/>
               <w:rPr>
                 <w:vertAlign w:val="baseline"/>
               </w:rPr>
@@ -4648,6 +5504,8 @@
           </w:tcPr>
           <w:p>
             <w:pPr>
+              <w:widowControl w:val="0"/>
+              <w:jc w:val="both"/>
               <w:rPr>
                 <w:vertAlign w:val="baseline"/>
               </w:rPr>
@@ -4673,7 +5531,9 @@
         </w:tblBorders>
         <w:tblLayout w:type="autofit"/>
         <w:tblCellMar>
+          <w:top w:w="0" w:type="dxa"/>
           <w:left w:w="108" w:type="dxa"/>
+          <w:bottom w:w="0" w:type="dxa"/>
           <w:right w:w="108" w:type="dxa"/>
         </w:tblCellMar>
       </w:tblPr>
@@ -4692,6 +5552,12 @@
             <w:insideH w:val="single" w:color="auto" w:sz="4" w:space="0"/>
             <w:insideV w:val="single" w:color="auto" w:sz="4" w:space="0"/>
           </w:tblBorders>
+          <w:tblCellMar>
+            <w:top w:w="0" w:type="dxa"/>
+            <w:left w:w="108" w:type="dxa"/>
+            <w:bottom w:w="0" w:type="dxa"/>
+            <w:right w:w="108" w:type="dxa"/>
+          </w:tblCellMar>
         </w:tblPrEx>
         <w:tc>
           <w:tcPr>
@@ -4699,6 +5565,8 @@
           </w:tcPr>
           <w:p>
             <w:pPr>
+              <w:widowControl w:val="0"/>
+              <w:jc w:val="both"/>
               <w:rPr>
                 <w:rFonts w:hint="default"/>
                 <w:vertAlign w:val="baseline"/>
@@ -4721,6 +5589,8 @@
           </w:tcPr>
           <w:p>
             <w:pPr>
+              <w:widowControl w:val="0"/>
+              <w:jc w:val="both"/>
               <w:rPr>
                 <w:rFonts w:hint="default"/>
                 <w:vertAlign w:val="baseline"/>
@@ -4743,6 +5613,8 @@
           </w:tcPr>
           <w:p>
             <w:pPr>
+              <w:widowControl w:val="0"/>
+              <w:jc w:val="both"/>
               <w:rPr>
                 <w:rFonts w:hint="default"/>
                 <w:vertAlign w:val="baseline"/>
@@ -4771,7 +5643,9 @@
             <w:insideV w:val="single" w:color="auto" w:sz="4" w:space="0"/>
           </w:tblBorders>
           <w:tblCellMar>
+            <w:top w:w="0" w:type="dxa"/>
             <w:left w:w="108" w:type="dxa"/>
+            <w:bottom w:w="0" w:type="dxa"/>
             <w:right w:w="108" w:type="dxa"/>
           </w:tblCellMar>
         </w:tblPrEx>
@@ -4781,6 +5655,8 @@
           </w:tcPr>
           <w:p>
             <w:pPr>
+              <w:widowControl w:val="0"/>
+              <w:jc w:val="both"/>
               <w:rPr>
                 <w:rFonts w:hint="default"/>
                 <w:vertAlign w:val="baseline"/>
@@ -4803,6 +5679,8 @@
           </w:tcPr>
           <w:p>
             <w:pPr>
+              <w:widowControl w:val="0"/>
+              <w:jc w:val="both"/>
               <w:rPr>
                 <w:rFonts w:hint="default"/>
                 <w:vertAlign w:val="baseline"/>
@@ -4825,6 +5703,8 @@
           </w:tcPr>
           <w:p>
             <w:pPr>
+              <w:widowControl w:val="0"/>
+              <w:jc w:val="both"/>
               <w:rPr>
                 <w:rFonts w:hint="default"/>
                 <w:vertAlign w:val="baseline"/>
@@ -4853,7 +5733,9 @@
             <w:insideV w:val="single" w:color="auto" w:sz="4" w:space="0"/>
           </w:tblBorders>
           <w:tblCellMar>
+            <w:top w:w="0" w:type="dxa"/>
             <w:left w:w="108" w:type="dxa"/>
+            <w:bottom w:w="0" w:type="dxa"/>
             <w:right w:w="108" w:type="dxa"/>
           </w:tblCellMar>
         </w:tblPrEx>
@@ -4863,6 +5745,8 @@
           </w:tcPr>
           <w:p>
             <w:pPr>
+              <w:widowControl w:val="0"/>
+              <w:jc w:val="both"/>
               <w:rPr>
                 <w:rFonts w:hint="default"/>
                 <w:vertAlign w:val="baseline"/>
@@ -4885,6 +5769,8 @@
           </w:tcPr>
           <w:p>
             <w:pPr>
+              <w:widowControl w:val="0"/>
+              <w:jc w:val="both"/>
               <w:rPr>
                 <w:rFonts w:hint="default"/>
                 <w:vertAlign w:val="baseline"/>
@@ -4907,6 +5793,8 @@
           </w:tcPr>
           <w:p>
             <w:pPr>
+              <w:widowControl w:val="0"/>
+              <w:jc w:val="both"/>
               <w:rPr>
                 <w:rFonts w:hint="default"/>
                 <w:vertAlign w:val="baseline"/>
@@ -4935,7 +5823,9 @@
             <w:insideV w:val="single" w:color="auto" w:sz="4" w:space="0"/>
           </w:tblBorders>
           <w:tblCellMar>
+            <w:top w:w="0" w:type="dxa"/>
             <w:left w:w="108" w:type="dxa"/>
+            <w:bottom w:w="0" w:type="dxa"/>
             <w:right w:w="108" w:type="dxa"/>
           </w:tblCellMar>
         </w:tblPrEx>
@@ -4945,6 +5835,8 @@
           </w:tcPr>
           <w:p>
             <w:pPr>
+              <w:widowControl w:val="0"/>
+              <w:jc w:val="both"/>
               <w:rPr>
                 <w:rFonts w:hint="default"/>
                 <w:vertAlign w:val="baseline"/>
@@ -4967,6 +5859,8 @@
           </w:tcPr>
           <w:p>
             <w:pPr>
+              <w:widowControl w:val="0"/>
+              <w:jc w:val="both"/>
               <w:rPr>
                 <w:rFonts w:hint="default"/>
                 <w:vertAlign w:val="baseline"/>
@@ -4989,6 +5883,8 @@
           </w:tcPr>
           <w:p>
             <w:pPr>
+              <w:widowControl w:val="0"/>
+              <w:jc w:val="both"/>
               <w:rPr>
                 <w:rFonts w:hint="default"/>
                 <w:vertAlign w:val="baseline"/>
@@ -5003,8 +5899,6 @@
               </w:rPr>
               <w:t>The position of the driver when rejoining the track is at the Apex of T2</w:t>
             </w:r>
-            <w:bookmarkStart w:id="0" w:name="_GoBack"/>
-            <w:bookmarkEnd w:id="0"/>
           </w:p>
         </w:tc>
       </w:tr>
@@ -5179,7 +6073,7 @@
     <w:lsdException w:unhideWhenUsed="0" w:uiPriority="0" w:semiHidden="0" w:name="Table Web 2"/>
     <w:lsdException w:unhideWhenUsed="0" w:uiPriority="0" w:semiHidden="0" w:name="Table Web 3"/>
     <w:lsdException w:unhideWhenUsed="0" w:uiPriority="0" w:semiHidden="0" w:name="Balloon Text"/>
-    <w:lsdException w:unhideWhenUsed="0" w:uiPriority="0" w:semiHidden="0" w:name="Table Grid"/>
+    <w:lsdException w:qFormat="1" w:unhideWhenUsed="0" w:uiPriority="0" w:semiHidden="0" w:name="Table Grid"/>
     <w:lsdException w:unhideWhenUsed="0" w:uiPriority="0" w:semiHidden="0" w:name="Table Theme"/>
     <w:lsdException w:unhideWhenUsed="0" w:uiPriority="60" w:semiHidden="0" w:name="Light Shading"/>
     <w:lsdException w:unhideWhenUsed="0" w:uiPriority="61" w:semiHidden="0" w:name="Light List"/>
@@ -5312,6 +6206,7 @@
   <w:style w:type="table" w:styleId="4">
     <w:name w:val="Table Grid"/>
     <w:basedOn w:val="3"/>
+    <w:qFormat/>
     <w:uiPriority w:val="0"/>
     <w:pPr>
       <w:widowControl w:val="0"/>

</xml_diff>

<commit_message>
Added much more details to the track
</commit_message>
<xml_diff>
--- a/Silverstone circuit data.docx
+++ b/Silverstone circuit data.docx
@@ -25,10 +25,11 @@
       </w:tblPr>
       <w:tblGrid>
         <w:gridCol w:w="1339"/>
-        <w:gridCol w:w="1228"/>
-        <w:gridCol w:w="1290"/>
-        <w:gridCol w:w="1063"/>
-        <w:gridCol w:w="779"/>
+        <w:gridCol w:w="896"/>
+        <w:gridCol w:w="834"/>
+        <w:gridCol w:w="925"/>
+        <w:gridCol w:w="903"/>
+        <w:gridCol w:w="802"/>
         <w:gridCol w:w="879"/>
         <w:gridCol w:w="868"/>
         <w:gridCol w:w="927"/>
@@ -80,7 +81,7 @@
         </w:tc>
         <w:tc>
           <w:tcPr>
-            <w:tcW w:w="1228" w:type="dxa"/>
+            <w:tcW w:w="896" w:type="dxa"/>
           </w:tcPr>
           <w:p>
             <w:pPr>
@@ -104,7 +105,7 @@
         </w:tc>
         <w:tc>
           <w:tcPr>
-            <w:tcW w:w="1290" w:type="dxa"/>
+            <w:tcW w:w="834" w:type="dxa"/>
           </w:tcPr>
           <w:p>
             <w:pPr>
@@ -147,7 +148,7 @@
         </w:tc>
         <w:tc>
           <w:tcPr>
-            <w:tcW w:w="1063" w:type="dxa"/>
+            <w:tcW w:w="925" w:type="dxa"/>
           </w:tcPr>
           <w:p>
             <w:pPr>
@@ -190,7 +191,31 @@
         </w:tc>
         <w:tc>
           <w:tcPr>
-            <w:tcW w:w="779" w:type="dxa"/>
+            <w:tcW w:w="903" w:type="dxa"/>
+          </w:tcPr>
+          <w:p>
+            <w:pPr>
+              <w:widowControl w:val="0"/>
+              <w:jc w:val="both"/>
+              <w:rPr>
+                <w:rFonts w:hint="default"/>
+                <w:vertAlign w:val="baseline"/>
+                <w:lang w:val="en-GB"/>
+              </w:rPr>
+            </w:pPr>
+            <w:r>
+              <w:rPr>
+                <w:rFonts w:hint="default"/>
+                <w:vertAlign w:val="baseline"/>
+                <w:lang w:val="en-GB"/>
+              </w:rPr>
+              <w:t>Throttle %</w:t>
+            </w:r>
+          </w:p>
+        </w:tc>
+        <w:tc>
+          <w:tcPr>
+            <w:tcW w:w="802" w:type="dxa"/>
           </w:tcPr>
           <w:p>
             <w:pPr>
@@ -209,6 +234,25 @@
                 <w:lang w:val="en-GB"/>
               </w:rPr>
               <w:t>Time Spent</w:t>
+            </w:r>
+          </w:p>
+          <w:p>
+            <w:pPr>
+              <w:widowControl w:val="0"/>
+              <w:jc w:val="both"/>
+              <w:rPr>
+                <w:rFonts w:hint="default"/>
+                <w:vertAlign w:val="baseline"/>
+                <w:lang w:val="en-GB"/>
+              </w:rPr>
+            </w:pPr>
+            <w:r>
+              <w:rPr>
+                <w:rFonts w:hint="default"/>
+                <w:vertAlign w:val="baseline"/>
+                <w:lang w:val="en-GB"/>
+              </w:rPr>
+              <w:t>(Base line)</w:t>
             </w:r>
           </w:p>
         </w:tc>
@@ -355,7 +399,7 @@
         </w:tc>
         <w:tc>
           <w:tcPr>
-            <w:tcW w:w="1228" w:type="dxa"/>
+            <w:tcW w:w="896" w:type="dxa"/>
           </w:tcPr>
           <w:p>
             <w:pPr>
@@ -379,35 +423,59 @@
         </w:tc>
         <w:tc>
           <w:tcPr>
-            <w:tcW w:w="1290" w:type="dxa"/>
-          </w:tcPr>
-          <w:p>
-            <w:pPr>
-              <w:widowControl w:val="0"/>
-              <w:jc w:val="both"/>
-              <w:rPr>
-                <w:vertAlign w:val="baseline"/>
-              </w:rPr>
-            </w:pPr>
-          </w:p>
-        </w:tc>
-        <w:tc>
-          <w:tcPr>
-            <w:tcW w:w="1063" w:type="dxa"/>
-          </w:tcPr>
-          <w:p>
-            <w:pPr>
-              <w:widowControl w:val="0"/>
-              <w:jc w:val="both"/>
-              <w:rPr>
-                <w:vertAlign w:val="baseline"/>
-              </w:rPr>
-            </w:pPr>
-          </w:p>
-        </w:tc>
-        <w:tc>
-          <w:tcPr>
-            <w:tcW w:w="779" w:type="dxa"/>
+            <w:tcW w:w="834" w:type="dxa"/>
+          </w:tcPr>
+          <w:p>
+            <w:pPr>
+              <w:widowControl w:val="0"/>
+              <w:jc w:val="both"/>
+              <w:rPr>
+                <w:vertAlign w:val="baseline"/>
+              </w:rPr>
+            </w:pPr>
+          </w:p>
+        </w:tc>
+        <w:tc>
+          <w:tcPr>
+            <w:tcW w:w="925" w:type="dxa"/>
+          </w:tcPr>
+          <w:p>
+            <w:pPr>
+              <w:widowControl w:val="0"/>
+              <w:jc w:val="both"/>
+              <w:rPr>
+                <w:vertAlign w:val="baseline"/>
+              </w:rPr>
+            </w:pPr>
+          </w:p>
+        </w:tc>
+        <w:tc>
+          <w:tcPr>
+            <w:tcW w:w="903" w:type="dxa"/>
+          </w:tcPr>
+          <w:p>
+            <w:pPr>
+              <w:widowControl w:val="0"/>
+              <w:jc w:val="both"/>
+              <w:rPr>
+                <w:rFonts w:hint="default"/>
+                <w:vertAlign w:val="baseline"/>
+                <w:lang w:val="en-GB"/>
+              </w:rPr>
+            </w:pPr>
+            <w:r>
+              <w:rPr>
+                <w:rFonts w:hint="default"/>
+                <w:vertAlign w:val="baseline"/>
+                <w:lang w:val="en-GB"/>
+              </w:rPr>
+              <w:t>100</w:t>
+            </w:r>
+          </w:p>
+        </w:tc>
+        <w:tc>
+          <w:tcPr>
+            <w:tcW w:w="802" w:type="dxa"/>
           </w:tcPr>
           <w:p>
             <w:pPr>
@@ -597,7 +665,7 @@
         </w:tc>
         <w:tc>
           <w:tcPr>
-            <w:tcW w:w="1228" w:type="dxa"/>
+            <w:tcW w:w="896" w:type="dxa"/>
           </w:tcPr>
           <w:p>
             <w:pPr>
@@ -621,7 +689,7 @@
         </w:tc>
         <w:tc>
           <w:tcPr>
-            <w:tcW w:w="1290" w:type="dxa"/>
+            <w:tcW w:w="834" w:type="dxa"/>
           </w:tcPr>
           <w:p>
             <w:pPr>
@@ -645,7 +713,7 @@
         </w:tc>
         <w:tc>
           <w:tcPr>
-            <w:tcW w:w="1063" w:type="dxa"/>
+            <w:tcW w:w="925" w:type="dxa"/>
           </w:tcPr>
           <w:p>
             <w:pPr>
@@ -669,7 +737,31 @@
         </w:tc>
         <w:tc>
           <w:tcPr>
-            <w:tcW w:w="779" w:type="dxa"/>
+            <w:tcW w:w="903" w:type="dxa"/>
+          </w:tcPr>
+          <w:p>
+            <w:pPr>
+              <w:widowControl w:val="0"/>
+              <w:jc w:val="both"/>
+              <w:rPr>
+                <w:rFonts w:hint="default"/>
+                <w:vertAlign w:val="baseline"/>
+                <w:lang w:val="en-GB"/>
+              </w:rPr>
+            </w:pPr>
+            <w:r>
+              <w:rPr>
+                <w:rFonts w:hint="default"/>
+                <w:vertAlign w:val="baseline"/>
+                <w:lang w:val="en-GB"/>
+              </w:rPr>
+              <w:t>100</w:t>
+            </w:r>
+          </w:p>
+        </w:tc>
+        <w:tc>
+          <w:tcPr>
+            <w:tcW w:w="802" w:type="dxa"/>
           </w:tcPr>
           <w:p>
             <w:pPr>
@@ -834,7 +926,7 @@
         </w:tc>
         <w:tc>
           <w:tcPr>
-            <w:tcW w:w="1228" w:type="dxa"/>
+            <w:tcW w:w="896" w:type="dxa"/>
           </w:tcPr>
           <w:p>
             <w:pPr>
@@ -856,7 +948,7 @@
         </w:tc>
         <w:tc>
           <w:tcPr>
-            <w:tcW w:w="1290" w:type="dxa"/>
+            <w:tcW w:w="834" w:type="dxa"/>
           </w:tcPr>
           <w:p>
             <w:pPr>
@@ -880,7 +972,7 @@
         </w:tc>
         <w:tc>
           <w:tcPr>
-            <w:tcW w:w="1063" w:type="dxa"/>
+            <w:tcW w:w="925" w:type="dxa"/>
           </w:tcPr>
           <w:p>
             <w:pPr>
@@ -904,7 +996,31 @@
         </w:tc>
         <w:tc>
           <w:tcPr>
-            <w:tcW w:w="779" w:type="dxa"/>
+            <w:tcW w:w="903" w:type="dxa"/>
+          </w:tcPr>
+          <w:p>
+            <w:pPr>
+              <w:widowControl w:val="0"/>
+              <w:jc w:val="both"/>
+              <w:rPr>
+                <w:rFonts w:hint="default"/>
+                <w:vertAlign w:val="baseline"/>
+                <w:lang w:val="en-GB"/>
+              </w:rPr>
+            </w:pPr>
+            <w:r>
+              <w:rPr>
+                <w:rFonts w:hint="default"/>
+                <w:vertAlign w:val="baseline"/>
+                <w:lang w:val="en-GB"/>
+              </w:rPr>
+              <w:t>100</w:t>
+            </w:r>
+          </w:p>
+        </w:tc>
+        <w:tc>
+          <w:tcPr>
+            <w:tcW w:w="802" w:type="dxa"/>
           </w:tcPr>
           <w:p>
             <w:pPr>
@@ -1045,7 +1161,7 @@
         </w:tc>
         <w:tc>
           <w:tcPr>
-            <w:tcW w:w="1228" w:type="dxa"/>
+            <w:tcW w:w="896" w:type="dxa"/>
           </w:tcPr>
           <w:p>
             <w:pPr>
@@ -1069,7 +1185,7 @@
         </w:tc>
         <w:tc>
           <w:tcPr>
-            <w:tcW w:w="1290" w:type="dxa"/>
+            <w:tcW w:w="834" w:type="dxa"/>
           </w:tcPr>
           <w:p>
             <w:pPr>
@@ -1093,7 +1209,7 @@
         </w:tc>
         <w:tc>
           <w:tcPr>
-            <w:tcW w:w="1063" w:type="dxa"/>
+            <w:tcW w:w="925" w:type="dxa"/>
           </w:tcPr>
           <w:p>
             <w:pPr>
@@ -1117,16 +1233,42 @@
         </w:tc>
         <w:tc>
           <w:tcPr>
-            <w:tcW w:w="779" w:type="dxa"/>
-          </w:tcPr>
-          <w:p>
-            <w:pPr>
-              <w:widowControl w:val="0"/>
-              <w:jc w:val="both"/>
-              <w:rPr>
-                <w:vertAlign w:val="baseline"/>
-              </w:rPr>
-            </w:pPr>
+            <w:tcW w:w="903" w:type="dxa"/>
+          </w:tcPr>
+          <w:p>
+            <w:pPr>
+              <w:widowControl w:val="0"/>
+              <w:jc w:val="both"/>
+              <w:rPr>
+                <w:rFonts w:hint="default"/>
+                <w:vertAlign w:val="baseline"/>
+                <w:lang w:val="en-US"/>
+              </w:rPr>
+            </w:pPr>
+          </w:p>
+        </w:tc>
+        <w:tc>
+          <w:tcPr>
+            <w:tcW w:w="802" w:type="dxa"/>
+          </w:tcPr>
+          <w:p>
+            <w:pPr>
+              <w:widowControl w:val="0"/>
+              <w:jc w:val="both"/>
+              <w:rPr>
+                <w:rFonts w:hint="default"/>
+                <w:vertAlign w:val="baseline"/>
+                <w:lang w:val="en-GB"/>
+              </w:rPr>
+            </w:pPr>
+            <w:r>
+              <w:rPr>
+                <w:rFonts w:hint="default"/>
+                <w:vertAlign w:val="baseline"/>
+                <w:lang w:val="en-GB"/>
+              </w:rPr>
+              <w:t>5.04</w:t>
+            </w:r>
           </w:p>
         </w:tc>
         <w:tc>
@@ -1208,9 +1350,19 @@
               <w:widowControl w:val="0"/>
               <w:jc w:val="both"/>
               <w:rPr>
-                <w:vertAlign w:val="baseline"/>
-              </w:rPr>
-            </w:pPr>
+                <w:rFonts w:hint="default"/>
+                <w:vertAlign w:val="baseline"/>
+                <w:lang w:val="en-GB"/>
+              </w:rPr>
+            </w:pPr>
+            <w:r>
+              <w:rPr>
+                <w:rFonts w:hint="default"/>
+                <w:vertAlign w:val="baseline"/>
+                <w:lang w:val="en-GB"/>
+              </w:rPr>
+              <w:t>Entry speed: 263 (prev)</w:t>
+            </w:r>
           </w:p>
         </w:tc>
       </w:tr>
@@ -1258,7 +1410,7 @@
         </w:tc>
         <w:tc>
           <w:tcPr>
-            <w:tcW w:w="1228" w:type="dxa"/>
+            <w:tcW w:w="896" w:type="dxa"/>
           </w:tcPr>
           <w:p>
             <w:pPr>
@@ -1280,7 +1432,7 @@
         </w:tc>
         <w:tc>
           <w:tcPr>
-            <w:tcW w:w="1290" w:type="dxa"/>
+            <w:tcW w:w="834" w:type="dxa"/>
           </w:tcPr>
           <w:p>
             <w:pPr>
@@ -1304,7 +1456,7 @@
         </w:tc>
         <w:tc>
           <w:tcPr>
-            <w:tcW w:w="1063" w:type="dxa"/>
+            <w:tcW w:w="925" w:type="dxa"/>
           </w:tcPr>
           <w:p>
             <w:pPr>
@@ -1328,16 +1480,42 @@
         </w:tc>
         <w:tc>
           <w:tcPr>
-            <w:tcW w:w="779" w:type="dxa"/>
-          </w:tcPr>
-          <w:p>
-            <w:pPr>
-              <w:widowControl w:val="0"/>
-              <w:jc w:val="both"/>
-              <w:rPr>
-                <w:vertAlign w:val="baseline"/>
-              </w:rPr>
-            </w:pPr>
+            <w:tcW w:w="903" w:type="dxa"/>
+          </w:tcPr>
+          <w:p>
+            <w:pPr>
+              <w:widowControl w:val="0"/>
+              <w:jc w:val="both"/>
+              <w:rPr>
+                <w:rFonts w:hint="default"/>
+                <w:vertAlign w:val="baseline"/>
+                <w:lang w:val="en-US"/>
+              </w:rPr>
+            </w:pPr>
+          </w:p>
+        </w:tc>
+        <w:tc>
+          <w:tcPr>
+            <w:tcW w:w="802" w:type="dxa"/>
+          </w:tcPr>
+          <w:p>
+            <w:pPr>
+              <w:widowControl w:val="0"/>
+              <w:jc w:val="both"/>
+              <w:rPr>
+                <w:rFonts w:hint="default"/>
+                <w:vertAlign w:val="baseline"/>
+                <w:lang w:val="en-GB"/>
+              </w:rPr>
+            </w:pPr>
+            <w:r>
+              <w:rPr>
+                <w:rFonts w:hint="default"/>
+                <w:vertAlign w:val="baseline"/>
+                <w:lang w:val="en-GB"/>
+              </w:rPr>
+              <w:t>5.06</w:t>
+            </w:r>
           </w:p>
         </w:tc>
         <w:tc>
@@ -1419,9 +1597,35 @@
               <w:widowControl w:val="0"/>
               <w:jc w:val="both"/>
               <w:rPr>
-                <w:vertAlign w:val="baseline"/>
-              </w:rPr>
-            </w:pPr>
+                <w:rFonts w:hint="default"/>
+                <w:vertAlign w:val="baseline"/>
+                <w:lang w:val="en-GB"/>
+              </w:rPr>
+            </w:pPr>
+            <w:r>
+              <w:rPr>
+                <w:rFonts w:hint="default"/>
+                <w:vertAlign w:val="baseline"/>
+                <w:lang w:val="en-GB"/>
+              </w:rPr>
+              <w:t xml:space="preserve">Entry speed: </w:t>
+            </w:r>
+            <w:r>
+              <w:rPr>
+                <w:rFonts w:hint="default"/>
+                <w:vertAlign w:val="baseline"/>
+                <w:lang w:val="en-US"/>
+              </w:rPr>
+              <w:t>141</w:t>
+            </w:r>
+            <w:r>
+              <w:rPr>
+                <w:rFonts w:hint="default"/>
+                <w:vertAlign w:val="baseline"/>
+                <w:lang w:val="en-GB"/>
+              </w:rPr>
+              <w:t xml:space="preserve"> (prev)</w:t>
+            </w:r>
           </w:p>
         </w:tc>
       </w:tr>
@@ -1469,7 +1673,7 @@
         </w:tc>
         <w:tc>
           <w:tcPr>
-            <w:tcW w:w="1228" w:type="dxa"/>
+            <w:tcW w:w="896" w:type="dxa"/>
           </w:tcPr>
           <w:p>
             <w:pPr>
@@ -1499,7 +1703,7 @@
         </w:tc>
         <w:tc>
           <w:tcPr>
-            <w:tcW w:w="1290" w:type="dxa"/>
+            <w:tcW w:w="834" w:type="dxa"/>
           </w:tcPr>
           <w:p>
             <w:pPr>
@@ -1523,7 +1727,7 @@
         </w:tc>
         <w:tc>
           <w:tcPr>
-            <w:tcW w:w="1063" w:type="dxa"/>
+            <w:tcW w:w="925" w:type="dxa"/>
           </w:tcPr>
           <w:p>
             <w:pPr>
@@ -1547,7 +1751,23 @@
         </w:tc>
         <w:tc>
           <w:tcPr>
-            <w:tcW w:w="779" w:type="dxa"/>
+            <w:tcW w:w="903" w:type="dxa"/>
+          </w:tcPr>
+          <w:p>
+            <w:pPr>
+              <w:widowControl w:val="0"/>
+              <w:jc w:val="both"/>
+              <w:rPr>
+                <w:rFonts w:hint="default"/>
+                <w:vertAlign w:val="baseline"/>
+                <w:lang w:val="en-US"/>
+              </w:rPr>
+            </w:pPr>
+          </w:p>
+        </w:tc>
+        <w:tc>
+          <w:tcPr>
+            <w:tcW w:w="802" w:type="dxa"/>
           </w:tcPr>
           <w:p>
             <w:pPr>
@@ -1694,7 +1914,7 @@
         </w:tc>
         <w:tc>
           <w:tcPr>
-            <w:tcW w:w="1228" w:type="dxa"/>
+            <w:tcW w:w="896" w:type="dxa"/>
           </w:tcPr>
           <w:p>
             <w:pPr>
@@ -1716,35 +1936,49 @@
         </w:tc>
         <w:tc>
           <w:tcPr>
-            <w:tcW w:w="1290" w:type="dxa"/>
-          </w:tcPr>
-          <w:p>
-            <w:pPr>
-              <w:widowControl w:val="0"/>
-              <w:jc w:val="both"/>
-              <w:rPr>
-                <w:vertAlign w:val="baseline"/>
-              </w:rPr>
-            </w:pPr>
-          </w:p>
-        </w:tc>
-        <w:tc>
-          <w:tcPr>
-            <w:tcW w:w="1063" w:type="dxa"/>
-          </w:tcPr>
-          <w:p>
-            <w:pPr>
-              <w:widowControl w:val="0"/>
-              <w:jc w:val="both"/>
-              <w:rPr>
-                <w:vertAlign w:val="baseline"/>
-              </w:rPr>
-            </w:pPr>
-          </w:p>
-        </w:tc>
-        <w:tc>
-          <w:tcPr>
-            <w:tcW w:w="779" w:type="dxa"/>
+            <w:tcW w:w="834" w:type="dxa"/>
+          </w:tcPr>
+          <w:p>
+            <w:pPr>
+              <w:widowControl w:val="0"/>
+              <w:jc w:val="both"/>
+              <w:rPr>
+                <w:vertAlign w:val="baseline"/>
+              </w:rPr>
+            </w:pPr>
+          </w:p>
+        </w:tc>
+        <w:tc>
+          <w:tcPr>
+            <w:tcW w:w="925" w:type="dxa"/>
+          </w:tcPr>
+          <w:p>
+            <w:pPr>
+              <w:widowControl w:val="0"/>
+              <w:jc w:val="both"/>
+              <w:rPr>
+                <w:vertAlign w:val="baseline"/>
+              </w:rPr>
+            </w:pPr>
+          </w:p>
+        </w:tc>
+        <w:tc>
+          <w:tcPr>
+            <w:tcW w:w="903" w:type="dxa"/>
+          </w:tcPr>
+          <w:p>
+            <w:pPr>
+              <w:widowControl w:val="0"/>
+              <w:jc w:val="both"/>
+              <w:rPr>
+                <w:vertAlign w:val="baseline"/>
+              </w:rPr>
+            </w:pPr>
+          </w:p>
+        </w:tc>
+        <w:tc>
+          <w:tcPr>
+            <w:tcW w:w="802" w:type="dxa"/>
           </w:tcPr>
           <w:p>
             <w:pPr>
@@ -1885,7 +2119,7 @@
         </w:tc>
         <w:tc>
           <w:tcPr>
-            <w:tcW w:w="1228" w:type="dxa"/>
+            <w:tcW w:w="896" w:type="dxa"/>
           </w:tcPr>
           <w:p>
             <w:pPr>
@@ -1907,7 +2141,7 @@
         </w:tc>
         <w:tc>
           <w:tcPr>
-            <w:tcW w:w="1290" w:type="dxa"/>
+            <w:tcW w:w="834" w:type="dxa"/>
           </w:tcPr>
           <w:p>
             <w:pPr>
@@ -1931,7 +2165,7 @@
         </w:tc>
         <w:tc>
           <w:tcPr>
-            <w:tcW w:w="1063" w:type="dxa"/>
+            <w:tcW w:w="925" w:type="dxa"/>
           </w:tcPr>
           <w:p>
             <w:pPr>
@@ -1955,16 +2189,42 @@
         </w:tc>
         <w:tc>
           <w:tcPr>
-            <w:tcW w:w="779" w:type="dxa"/>
-          </w:tcPr>
-          <w:p>
-            <w:pPr>
-              <w:widowControl w:val="0"/>
-              <w:jc w:val="both"/>
-              <w:rPr>
-                <w:vertAlign w:val="baseline"/>
-              </w:rPr>
-            </w:pPr>
+            <w:tcW w:w="903" w:type="dxa"/>
+          </w:tcPr>
+          <w:p>
+            <w:pPr>
+              <w:widowControl w:val="0"/>
+              <w:jc w:val="both"/>
+              <w:rPr>
+                <w:rFonts w:hint="default"/>
+                <w:vertAlign w:val="baseline"/>
+                <w:lang w:val="en-US"/>
+              </w:rPr>
+            </w:pPr>
+          </w:p>
+        </w:tc>
+        <w:tc>
+          <w:tcPr>
+            <w:tcW w:w="802" w:type="dxa"/>
+          </w:tcPr>
+          <w:p>
+            <w:pPr>
+              <w:widowControl w:val="0"/>
+              <w:jc w:val="both"/>
+              <w:rPr>
+                <w:rFonts w:hint="default"/>
+                <w:vertAlign w:val="baseline"/>
+                <w:lang w:val="en-GB"/>
+              </w:rPr>
+            </w:pPr>
+            <w:r>
+              <w:rPr>
+                <w:rFonts w:hint="default"/>
+                <w:vertAlign w:val="baseline"/>
+                <w:lang w:val="en-GB"/>
+              </w:rPr>
+              <w:t>4.13</w:t>
+            </w:r>
           </w:p>
         </w:tc>
         <w:tc>
@@ -2046,9 +2306,19 @@
               <w:widowControl w:val="0"/>
               <w:jc w:val="both"/>
               <w:rPr>
-                <w:vertAlign w:val="baseline"/>
-              </w:rPr>
-            </w:pPr>
+                <w:rFonts w:hint="default"/>
+                <w:vertAlign w:val="baseline"/>
+                <w:lang w:val="en-GB"/>
+              </w:rPr>
+            </w:pPr>
+            <w:r>
+              <w:rPr>
+                <w:rFonts w:hint="default"/>
+                <w:vertAlign w:val="baseline"/>
+                <w:lang w:val="en-GB"/>
+              </w:rPr>
+              <w:t>Entry speed: 280</w:t>
+            </w:r>
           </w:p>
         </w:tc>
       </w:tr>
@@ -2096,7 +2366,7 @@
         </w:tc>
         <w:tc>
           <w:tcPr>
-            <w:tcW w:w="1228" w:type="dxa"/>
+            <w:tcW w:w="896" w:type="dxa"/>
           </w:tcPr>
           <w:p>
             <w:pPr>
@@ -2118,7 +2388,7 @@
         </w:tc>
         <w:tc>
           <w:tcPr>
-            <w:tcW w:w="1290" w:type="dxa"/>
+            <w:tcW w:w="834" w:type="dxa"/>
           </w:tcPr>
           <w:p>
             <w:pPr>
@@ -2142,7 +2412,7 @@
         </w:tc>
         <w:tc>
           <w:tcPr>
-            <w:tcW w:w="1063" w:type="dxa"/>
+            <w:tcW w:w="925" w:type="dxa"/>
           </w:tcPr>
           <w:p>
             <w:pPr>
@@ -2166,16 +2436,42 @@
         </w:tc>
         <w:tc>
           <w:tcPr>
-            <w:tcW w:w="779" w:type="dxa"/>
-          </w:tcPr>
-          <w:p>
-            <w:pPr>
-              <w:widowControl w:val="0"/>
-              <w:jc w:val="both"/>
-              <w:rPr>
-                <w:vertAlign w:val="baseline"/>
-              </w:rPr>
-            </w:pPr>
+            <w:tcW w:w="903" w:type="dxa"/>
+          </w:tcPr>
+          <w:p>
+            <w:pPr>
+              <w:widowControl w:val="0"/>
+              <w:jc w:val="both"/>
+              <w:rPr>
+                <w:rFonts w:hint="default"/>
+                <w:vertAlign w:val="baseline"/>
+                <w:lang w:val="en-US"/>
+              </w:rPr>
+            </w:pPr>
+          </w:p>
+        </w:tc>
+        <w:tc>
+          <w:tcPr>
+            <w:tcW w:w="802" w:type="dxa"/>
+          </w:tcPr>
+          <w:p>
+            <w:pPr>
+              <w:widowControl w:val="0"/>
+              <w:jc w:val="both"/>
+              <w:rPr>
+                <w:rFonts w:hint="default"/>
+                <w:vertAlign w:val="baseline"/>
+                <w:lang w:val="en-GB"/>
+              </w:rPr>
+            </w:pPr>
+            <w:r>
+              <w:rPr>
+                <w:rFonts w:hint="default"/>
+                <w:vertAlign w:val="baseline"/>
+                <w:lang w:val="en-GB"/>
+              </w:rPr>
+              <w:t>6.17</w:t>
+            </w:r>
           </w:p>
         </w:tc>
         <w:tc>
@@ -2260,6 +2556,30 @@
                 <w:vertAlign w:val="baseline"/>
               </w:rPr>
             </w:pPr>
+            <w:r>
+              <w:rPr>
+                <w:rFonts w:hint="default"/>
+                <w:vertAlign w:val="baseline"/>
+                <w:lang w:val="en-GB"/>
+              </w:rPr>
+              <w:t xml:space="preserve">Entry speed: </w:t>
+            </w:r>
+            <w:r>
+              <w:rPr>
+                <w:rFonts w:hint="default"/>
+                <w:vertAlign w:val="baseline"/>
+                <w:lang w:val="en-US"/>
+              </w:rPr>
+              <w:t>184</w:t>
+            </w:r>
+            <w:r>
+              <w:rPr>
+                <w:rFonts w:hint="default"/>
+                <w:vertAlign w:val="baseline"/>
+                <w:lang w:val="en-GB"/>
+              </w:rPr>
+              <w:t xml:space="preserve"> (prev)</w:t>
+            </w:r>
           </w:p>
         </w:tc>
       </w:tr>
@@ -2307,7 +2627,7 @@
         </w:tc>
         <w:tc>
           <w:tcPr>
-            <w:tcW w:w="1228" w:type="dxa"/>
+            <w:tcW w:w="896" w:type="dxa"/>
           </w:tcPr>
           <w:p>
             <w:pPr>
@@ -2329,39 +2649,55 @@
         </w:tc>
         <w:tc>
           <w:tcPr>
-            <w:tcW w:w="1290" w:type="dxa"/>
-          </w:tcPr>
-          <w:p>
-            <w:pPr>
-              <w:widowControl w:val="0"/>
-              <w:jc w:val="both"/>
-              <w:rPr>
-                <w:rFonts w:hint="default"/>
-                <w:vertAlign w:val="baseline"/>
-                <w:lang w:val="en-US"/>
-              </w:rPr>
-            </w:pPr>
-          </w:p>
-        </w:tc>
-        <w:tc>
-          <w:tcPr>
-            <w:tcW w:w="1063" w:type="dxa"/>
-          </w:tcPr>
-          <w:p>
-            <w:pPr>
-              <w:widowControl w:val="0"/>
-              <w:jc w:val="both"/>
-              <w:rPr>
-                <w:rFonts w:hint="default"/>
-                <w:vertAlign w:val="baseline"/>
-                <w:lang w:val="en-US"/>
-              </w:rPr>
-            </w:pPr>
-          </w:p>
-        </w:tc>
-        <w:tc>
-          <w:tcPr>
-            <w:tcW w:w="779" w:type="dxa"/>
+            <w:tcW w:w="834" w:type="dxa"/>
+          </w:tcPr>
+          <w:p>
+            <w:pPr>
+              <w:widowControl w:val="0"/>
+              <w:jc w:val="both"/>
+              <w:rPr>
+                <w:rFonts w:hint="default"/>
+                <w:vertAlign w:val="baseline"/>
+                <w:lang w:val="en-US"/>
+              </w:rPr>
+            </w:pPr>
+          </w:p>
+        </w:tc>
+        <w:tc>
+          <w:tcPr>
+            <w:tcW w:w="925" w:type="dxa"/>
+          </w:tcPr>
+          <w:p>
+            <w:pPr>
+              <w:widowControl w:val="0"/>
+              <w:jc w:val="both"/>
+              <w:rPr>
+                <w:rFonts w:hint="default"/>
+                <w:vertAlign w:val="baseline"/>
+                <w:lang w:val="en-US"/>
+              </w:rPr>
+            </w:pPr>
+          </w:p>
+        </w:tc>
+        <w:tc>
+          <w:tcPr>
+            <w:tcW w:w="903" w:type="dxa"/>
+          </w:tcPr>
+          <w:p>
+            <w:pPr>
+              <w:widowControl w:val="0"/>
+              <w:jc w:val="both"/>
+              <w:rPr>
+                <w:rFonts w:hint="default"/>
+                <w:vertAlign w:val="baseline"/>
+                <w:lang w:val="en-US"/>
+              </w:rPr>
+            </w:pPr>
+          </w:p>
+        </w:tc>
+        <w:tc>
+          <w:tcPr>
+            <w:tcW w:w="802" w:type="dxa"/>
           </w:tcPr>
           <w:p>
             <w:pPr>
@@ -2514,7 +2850,7 @@
         </w:tc>
         <w:tc>
           <w:tcPr>
-            <w:tcW w:w="1228" w:type="dxa"/>
+            <w:tcW w:w="896" w:type="dxa"/>
           </w:tcPr>
           <w:p>
             <w:pPr>
@@ -2536,35 +2872,49 @@
         </w:tc>
         <w:tc>
           <w:tcPr>
-            <w:tcW w:w="1290" w:type="dxa"/>
-          </w:tcPr>
-          <w:p>
-            <w:pPr>
-              <w:widowControl w:val="0"/>
-              <w:jc w:val="both"/>
-              <w:rPr>
-                <w:vertAlign w:val="baseline"/>
-              </w:rPr>
-            </w:pPr>
-          </w:p>
-        </w:tc>
-        <w:tc>
-          <w:tcPr>
-            <w:tcW w:w="1063" w:type="dxa"/>
-          </w:tcPr>
-          <w:p>
-            <w:pPr>
-              <w:widowControl w:val="0"/>
-              <w:jc w:val="both"/>
-              <w:rPr>
-                <w:vertAlign w:val="baseline"/>
-              </w:rPr>
-            </w:pPr>
-          </w:p>
-        </w:tc>
-        <w:tc>
-          <w:tcPr>
-            <w:tcW w:w="779" w:type="dxa"/>
+            <w:tcW w:w="834" w:type="dxa"/>
+          </w:tcPr>
+          <w:p>
+            <w:pPr>
+              <w:widowControl w:val="0"/>
+              <w:jc w:val="both"/>
+              <w:rPr>
+                <w:vertAlign w:val="baseline"/>
+              </w:rPr>
+            </w:pPr>
+          </w:p>
+        </w:tc>
+        <w:tc>
+          <w:tcPr>
+            <w:tcW w:w="925" w:type="dxa"/>
+          </w:tcPr>
+          <w:p>
+            <w:pPr>
+              <w:widowControl w:val="0"/>
+              <w:jc w:val="both"/>
+              <w:rPr>
+                <w:vertAlign w:val="baseline"/>
+              </w:rPr>
+            </w:pPr>
+          </w:p>
+        </w:tc>
+        <w:tc>
+          <w:tcPr>
+            <w:tcW w:w="903" w:type="dxa"/>
+          </w:tcPr>
+          <w:p>
+            <w:pPr>
+              <w:widowControl w:val="0"/>
+              <w:jc w:val="both"/>
+              <w:rPr>
+                <w:vertAlign w:val="baseline"/>
+              </w:rPr>
+            </w:pPr>
+          </w:p>
+        </w:tc>
+        <w:tc>
+          <w:tcPr>
+            <w:tcW w:w="802" w:type="dxa"/>
           </w:tcPr>
           <w:p>
             <w:pPr>
@@ -2658,6 +3008,217 @@
               </w:rPr>
               <w:t>SM ends 100m before the end of the straight</w:t>
             </w:r>
+          </w:p>
+        </w:tc>
+      </w:tr>
+      <w:tr>
+        <w:tblPrEx>
+          <w:tblBorders>
+            <w:top w:val="single" w:color="auto" w:sz="4" w:space="0"/>
+            <w:left w:val="single" w:color="auto" w:sz="4" w:space="0"/>
+            <w:bottom w:val="single" w:color="auto" w:sz="4" w:space="0"/>
+            <w:right w:val="single" w:color="auto" w:sz="4" w:space="0"/>
+            <w:insideH w:val="single" w:color="auto" w:sz="4" w:space="0"/>
+            <w:insideV w:val="single" w:color="auto" w:sz="4" w:space="0"/>
+          </w:tblBorders>
+        </w:tblPrEx>
+        <w:trPr>
+          <w:trHeight w:val="554" w:hRule="atLeast"/>
+        </w:trPr>
+        <w:tc>
+          <w:tcPr>
+            <w:tcW w:w="1339" w:type="dxa"/>
+          </w:tcPr>
+          <w:p>
+            <w:pPr>
+              <w:widowControl w:val="0"/>
+              <w:jc w:val="both"/>
+              <w:rPr>
+                <w:vertAlign w:val="baseline"/>
+              </w:rPr>
+            </w:pPr>
+            <w:r>
+              <w:rPr>
+                <w:rFonts w:hint="default"/>
+                <w:vertAlign w:val="baseline"/>
+                <w:lang w:val="en-GB"/>
+              </w:rPr>
+              <w:t>T9 (Copse)</w:t>
+            </w:r>
+          </w:p>
+        </w:tc>
+        <w:tc>
+          <w:tcPr>
+            <w:tcW w:w="896" w:type="dxa"/>
+          </w:tcPr>
+          <w:p>
+            <w:pPr>
+              <w:widowControl w:val="0"/>
+              <w:jc w:val="both"/>
+              <w:rPr>
+                <w:vertAlign w:val="baseline"/>
+              </w:rPr>
+            </w:pPr>
+          </w:p>
+        </w:tc>
+        <w:tc>
+          <w:tcPr>
+            <w:tcW w:w="834" w:type="dxa"/>
+          </w:tcPr>
+          <w:p>
+            <w:pPr>
+              <w:widowControl w:val="0"/>
+              <w:jc w:val="both"/>
+              <w:rPr>
+                <w:rFonts w:hint="default"/>
+                <w:vertAlign w:val="baseline"/>
+                <w:lang w:val="en-US"/>
+              </w:rPr>
+            </w:pPr>
+            <w:r>
+              <w:rPr>
+                <w:rFonts w:hint="default"/>
+                <w:vertAlign w:val="baseline"/>
+                <w:lang w:val="en-US"/>
+              </w:rPr>
+              <w:t>284</w:t>
+            </w:r>
+          </w:p>
+        </w:tc>
+        <w:tc>
+          <w:tcPr>
+            <w:tcW w:w="925" w:type="dxa"/>
+          </w:tcPr>
+          <w:p>
+            <w:pPr>
+              <w:widowControl w:val="0"/>
+              <w:jc w:val="both"/>
+              <w:rPr>
+                <w:vertAlign w:val="baseline"/>
+              </w:rPr>
+            </w:pPr>
+            <w:r>
+              <w:rPr>
+                <w:rFonts w:hint="default"/>
+                <w:vertAlign w:val="baseline"/>
+                <w:lang w:val="en-US"/>
+              </w:rPr>
+              <w:t>287</w:t>
+            </w:r>
+          </w:p>
+        </w:tc>
+        <w:tc>
+          <w:tcPr>
+            <w:tcW w:w="903" w:type="dxa"/>
+          </w:tcPr>
+          <w:p>
+            <w:pPr>
+              <w:widowControl w:val="0"/>
+              <w:jc w:val="both"/>
+              <w:rPr>
+                <w:rFonts w:hint="default"/>
+                <w:vertAlign w:val="baseline"/>
+                <w:lang w:val="en-US"/>
+              </w:rPr>
+            </w:pPr>
+          </w:p>
+        </w:tc>
+        <w:tc>
+          <w:tcPr>
+            <w:tcW w:w="802" w:type="dxa"/>
+          </w:tcPr>
+          <w:p>
+            <w:pPr>
+              <w:widowControl w:val="0"/>
+              <w:jc w:val="both"/>
+              <w:rPr>
+                <w:vertAlign w:val="baseline"/>
+              </w:rPr>
+            </w:pPr>
+          </w:p>
+        </w:tc>
+        <w:tc>
+          <w:tcPr>
+            <w:tcW w:w="879" w:type="dxa"/>
+          </w:tcPr>
+          <w:p>
+            <w:pPr>
+              <w:widowControl w:val="0"/>
+              <w:jc w:val="both"/>
+              <w:rPr>
+                <w:rFonts w:hint="default"/>
+                <w:vertAlign w:val="baseline"/>
+                <w:lang w:val="en-GB"/>
+              </w:rPr>
+            </w:pPr>
+            <w:r>
+              <w:rPr>
+                <w:rFonts w:hint="default"/>
+                <w:vertAlign w:val="baseline"/>
+                <w:lang w:val="en-GB"/>
+              </w:rPr>
+              <w:t>109</w:t>
+            </w:r>
+          </w:p>
+        </w:tc>
+        <w:tc>
+          <w:tcPr>
+            <w:tcW w:w="868" w:type="dxa"/>
+          </w:tcPr>
+          <w:p>
+            <w:pPr>
+              <w:widowControl w:val="0"/>
+              <w:jc w:val="both"/>
+              <w:rPr>
+                <w:rFonts w:hint="default"/>
+                <w:vertAlign w:val="baseline"/>
+                <w:lang w:val="en-GB"/>
+              </w:rPr>
+            </w:pPr>
+            <w:r>
+              <w:rPr>
+                <w:rFonts w:hint="default"/>
+                <w:vertAlign w:val="baseline"/>
+                <w:lang w:val="en-GB"/>
+              </w:rPr>
+              <w:t>56</w:t>
+            </w:r>
+          </w:p>
+        </w:tc>
+        <w:tc>
+          <w:tcPr>
+            <w:tcW w:w="927" w:type="dxa"/>
+          </w:tcPr>
+          <w:p>
+            <w:pPr>
+              <w:widowControl w:val="0"/>
+              <w:jc w:val="both"/>
+              <w:rPr>
+                <w:vertAlign w:val="baseline"/>
+              </w:rPr>
+            </w:pPr>
+            <w:r>
+              <w:rPr>
+                <w:rFonts w:hint="default"/>
+                <w:vertAlign w:val="baseline"/>
+                <w:lang w:val="en-GB"/>
+              </w:rPr>
+              <w:t>false</w:t>
+            </w:r>
+          </w:p>
+        </w:tc>
+        <w:tc>
+          <w:tcPr>
+            <w:tcW w:w="2341" w:type="dxa"/>
+          </w:tcPr>
+          <w:p>
+            <w:pPr>
+              <w:widowControl w:val="0"/>
+              <w:jc w:val="both"/>
+              <w:rPr>
+                <w:vertAlign w:val="baseline"/>
+              </w:rPr>
+            </w:pPr>
           </w:p>
         </w:tc>
       </w:tr>
@@ -2690,82 +3251,88 @@
               <w:widowControl w:val="0"/>
               <w:jc w:val="both"/>
               <w:rPr>
-                <w:vertAlign w:val="baseline"/>
-              </w:rPr>
-            </w:pPr>
-            <w:r>
-              <w:rPr>
-                <w:rFonts w:hint="default"/>
-                <w:vertAlign w:val="baseline"/>
-                <w:lang w:val="en-GB"/>
-              </w:rPr>
-              <w:t>T9 (Copse)</w:t>
-            </w:r>
-          </w:p>
-        </w:tc>
-        <w:tc>
-          <w:tcPr>
-            <w:tcW w:w="1228" w:type="dxa"/>
-          </w:tcPr>
-          <w:p>
-            <w:pPr>
-              <w:widowControl w:val="0"/>
-              <w:jc w:val="both"/>
-              <w:rPr>
-                <w:vertAlign w:val="baseline"/>
-              </w:rPr>
-            </w:pPr>
-          </w:p>
-        </w:tc>
-        <w:tc>
-          <w:tcPr>
-            <w:tcW w:w="1290" w:type="dxa"/>
-          </w:tcPr>
-          <w:p>
-            <w:pPr>
-              <w:widowControl w:val="0"/>
-              <w:jc w:val="both"/>
-              <w:rPr>
-                <w:rFonts w:hint="default"/>
-                <w:vertAlign w:val="baseline"/>
-                <w:lang w:val="en-US"/>
-              </w:rPr>
-            </w:pPr>
-            <w:r>
-              <w:rPr>
-                <w:rFonts w:hint="default"/>
-                <w:vertAlign w:val="baseline"/>
-                <w:lang w:val="en-US"/>
-              </w:rPr>
-              <w:t>284</w:t>
-            </w:r>
-          </w:p>
-        </w:tc>
-        <w:tc>
-          <w:tcPr>
-            <w:tcW w:w="1063" w:type="dxa"/>
-          </w:tcPr>
-          <w:p>
-            <w:pPr>
-              <w:widowControl w:val="0"/>
-              <w:jc w:val="both"/>
-              <w:rPr>
-                <w:vertAlign w:val="baseline"/>
-              </w:rPr>
-            </w:pPr>
-            <w:r>
-              <w:rPr>
-                <w:rFonts w:hint="default"/>
-                <w:vertAlign w:val="baseline"/>
-                <w:lang w:val="en-US"/>
-              </w:rPr>
-              <w:t>287</w:t>
-            </w:r>
-          </w:p>
-        </w:tc>
-        <w:tc>
-          <w:tcPr>
-            <w:tcW w:w="779" w:type="dxa"/>
+                <w:rFonts w:hint="default"/>
+                <w:vertAlign w:val="baseline"/>
+                <w:lang w:val="en-GB"/>
+              </w:rPr>
+            </w:pPr>
+            <w:r>
+              <w:rPr>
+                <w:rFonts w:hint="default"/>
+                <w:vertAlign w:val="baseline"/>
+                <w:lang w:val="en-GB"/>
+              </w:rPr>
+              <w:t>Between T9-T10 Straight</w:t>
+            </w:r>
+          </w:p>
+        </w:tc>
+        <w:tc>
+          <w:tcPr>
+            <w:tcW w:w="896" w:type="dxa"/>
+          </w:tcPr>
+          <w:p>
+            <w:pPr>
+              <w:widowControl w:val="0"/>
+              <w:jc w:val="both"/>
+              <w:rPr>
+                <w:vertAlign w:val="baseline"/>
+              </w:rPr>
+            </w:pPr>
+            <w:r>
+              <w:rPr>
+                <w:rFonts w:hint="default"/>
+                <w:vertAlign w:val="baseline"/>
+                <w:lang w:val="en-GB"/>
+              </w:rPr>
+              <w:t>Straight</w:t>
+            </w:r>
+          </w:p>
+        </w:tc>
+        <w:tc>
+          <w:tcPr>
+            <w:tcW w:w="834" w:type="dxa"/>
+          </w:tcPr>
+          <w:p>
+            <w:pPr>
+              <w:widowControl w:val="0"/>
+              <w:jc w:val="both"/>
+              <w:rPr>
+                <w:vertAlign w:val="baseline"/>
+              </w:rPr>
+            </w:pPr>
+          </w:p>
+        </w:tc>
+        <w:tc>
+          <w:tcPr>
+            <w:tcW w:w="925" w:type="dxa"/>
+          </w:tcPr>
+          <w:p>
+            <w:pPr>
+              <w:widowControl w:val="0"/>
+              <w:jc w:val="both"/>
+              <w:rPr>
+                <w:vertAlign w:val="baseline"/>
+              </w:rPr>
+            </w:pPr>
+          </w:p>
+        </w:tc>
+        <w:tc>
+          <w:tcPr>
+            <w:tcW w:w="903" w:type="dxa"/>
+          </w:tcPr>
+          <w:p>
+            <w:pPr>
+              <w:widowControl w:val="0"/>
+              <w:jc w:val="both"/>
+              <w:rPr>
+                <w:vertAlign w:val="baseline"/>
+              </w:rPr>
+            </w:pPr>
+          </w:p>
+        </w:tc>
+        <w:tc>
+          <w:tcPr>
+            <w:tcW w:w="802" w:type="dxa"/>
           </w:tcPr>
           <w:p>
             <w:pPr>
@@ -2797,7 +3364,7 @@
                 <w:vertAlign w:val="baseline"/>
                 <w:lang w:val="en-GB"/>
               </w:rPr>
-              <w:t>109</w:t>
+              <w:t>384.5</w:t>
             </w:r>
           </w:p>
         </w:tc>
@@ -2810,19 +3377,9 @@
               <w:widowControl w:val="0"/>
               <w:jc w:val="both"/>
               <w:rPr>
-                <w:rFonts w:hint="default"/>
-                <w:vertAlign w:val="baseline"/>
-                <w:lang w:val="en-GB"/>
-              </w:rPr>
-            </w:pPr>
-            <w:r>
-              <w:rPr>
-                <w:rFonts w:hint="default"/>
-                <w:vertAlign w:val="baseline"/>
-                <w:lang w:val="en-GB"/>
-              </w:rPr>
-              <w:t>56</w:t>
-            </w:r>
+                <w:vertAlign w:val="baseline"/>
+              </w:rPr>
+            </w:pPr>
           </w:p>
         </w:tc>
         <w:tc>
@@ -2902,63 +3459,87 @@
                 <w:vertAlign w:val="baseline"/>
                 <w:lang w:val="en-GB"/>
               </w:rPr>
-              <w:t>Between T9-T10 Straight</w:t>
-            </w:r>
-          </w:p>
-        </w:tc>
-        <w:tc>
-          <w:tcPr>
-            <w:tcW w:w="1228" w:type="dxa"/>
-          </w:tcPr>
-          <w:p>
-            <w:pPr>
-              <w:widowControl w:val="0"/>
-              <w:jc w:val="both"/>
-              <w:rPr>
-                <w:vertAlign w:val="baseline"/>
-              </w:rPr>
-            </w:pPr>
-            <w:r>
-              <w:rPr>
-                <w:rFonts w:hint="default"/>
-                <w:vertAlign w:val="baseline"/>
-                <w:lang w:val="en-GB"/>
-              </w:rPr>
-              <w:t>Straight</w:t>
-            </w:r>
-          </w:p>
-        </w:tc>
-        <w:tc>
-          <w:tcPr>
-            <w:tcW w:w="1290" w:type="dxa"/>
-          </w:tcPr>
-          <w:p>
-            <w:pPr>
-              <w:widowControl w:val="0"/>
-              <w:jc w:val="both"/>
-              <w:rPr>
-                <w:vertAlign w:val="baseline"/>
-              </w:rPr>
-            </w:pPr>
-          </w:p>
-        </w:tc>
-        <w:tc>
-          <w:tcPr>
-            <w:tcW w:w="1063" w:type="dxa"/>
-          </w:tcPr>
-          <w:p>
-            <w:pPr>
-              <w:widowControl w:val="0"/>
-              <w:jc w:val="both"/>
-              <w:rPr>
-                <w:vertAlign w:val="baseline"/>
-              </w:rPr>
-            </w:pPr>
-          </w:p>
-        </w:tc>
-        <w:tc>
-          <w:tcPr>
-            <w:tcW w:w="779" w:type="dxa"/>
+              <w:t>T10</w:t>
+            </w:r>
+          </w:p>
+        </w:tc>
+        <w:tc>
+          <w:tcPr>
+            <w:tcW w:w="896" w:type="dxa"/>
+          </w:tcPr>
+          <w:p>
+            <w:pPr>
+              <w:widowControl w:val="0"/>
+              <w:jc w:val="both"/>
+              <w:rPr>
+                <w:vertAlign w:val="baseline"/>
+              </w:rPr>
+            </w:pPr>
+            <w:r>
+              <w:rPr>
+                <w:rFonts w:hint="default"/>
+                <w:vertAlign w:val="baseline"/>
+                <w:lang w:val="en-GB"/>
+              </w:rPr>
+              <w:t>Fast corner</w:t>
+            </w:r>
+          </w:p>
+        </w:tc>
+        <w:tc>
+          <w:tcPr>
+            <w:tcW w:w="834" w:type="dxa"/>
+          </w:tcPr>
+          <w:p>
+            <w:pPr>
+              <w:widowControl w:val="0"/>
+              <w:jc w:val="both"/>
+              <w:rPr>
+                <w:rFonts w:hint="default"/>
+                <w:vertAlign w:val="baseline"/>
+                <w:lang w:val="en-US"/>
+              </w:rPr>
+            </w:pPr>
+            <w:r>
+              <w:rPr>
+                <w:rFonts w:hint="default"/>
+                <w:vertAlign w:val="baseline"/>
+                <w:lang w:val="en-US"/>
+              </w:rPr>
+              <w:t>285</w:t>
+            </w:r>
+          </w:p>
+        </w:tc>
+        <w:tc>
+          <w:tcPr>
+            <w:tcW w:w="925" w:type="dxa"/>
+          </w:tcPr>
+          <w:p>
+            <w:pPr>
+              <w:widowControl w:val="0"/>
+              <w:jc w:val="both"/>
+              <w:rPr>
+                <w:vertAlign w:val="baseline"/>
+              </w:rPr>
+            </w:pPr>
+          </w:p>
+        </w:tc>
+        <w:tc>
+          <w:tcPr>
+            <w:tcW w:w="903" w:type="dxa"/>
+          </w:tcPr>
+          <w:p>
+            <w:pPr>
+              <w:widowControl w:val="0"/>
+              <w:jc w:val="both"/>
+              <w:rPr>
+                <w:vertAlign w:val="baseline"/>
+              </w:rPr>
+            </w:pPr>
+          </w:p>
+        </w:tc>
+        <w:tc>
+          <w:tcPr>
+            <w:tcW w:w="802" w:type="dxa"/>
           </w:tcPr>
           <w:p>
             <w:pPr>
@@ -2990,7 +3571,7 @@
                 <w:vertAlign w:val="baseline"/>
                 <w:lang w:val="en-GB"/>
               </w:rPr>
-              <w:t>384.5</w:t>
+              <w:t>75.5</w:t>
             </w:r>
           </w:p>
         </w:tc>
@@ -3003,9 +3584,19 @@
               <w:widowControl w:val="0"/>
               <w:jc w:val="both"/>
               <w:rPr>
-                <w:vertAlign w:val="baseline"/>
-              </w:rPr>
-            </w:pPr>
+                <w:rFonts w:hint="default"/>
+                <w:vertAlign w:val="baseline"/>
+                <w:lang w:val="en-GB"/>
+              </w:rPr>
+            </w:pPr>
+            <w:r>
+              <w:rPr>
+                <w:rFonts w:hint="default"/>
+                <w:vertAlign w:val="baseline"/>
+                <w:lang w:val="en-GB"/>
+              </w:rPr>
+              <w:t>46</w:t>
+            </w:r>
           </w:p>
         </w:tc>
         <w:tc>
@@ -3085,13 +3676,13 @@
                 <w:vertAlign w:val="baseline"/>
                 <w:lang w:val="en-GB"/>
               </w:rPr>
-              <w:t>T10</w:t>
-            </w:r>
-          </w:p>
-        </w:tc>
-        <w:tc>
-          <w:tcPr>
-            <w:tcW w:w="1228" w:type="dxa"/>
+              <w:t>T11</w:t>
+            </w:r>
+          </w:p>
+        </w:tc>
+        <w:tc>
+          <w:tcPr>
+            <w:tcW w:w="896" w:type="dxa"/>
           </w:tcPr>
           <w:p>
             <w:pPr>
@@ -3113,45 +3704,71 @@
         </w:tc>
         <w:tc>
           <w:tcPr>
-            <w:tcW w:w="1290" w:type="dxa"/>
-          </w:tcPr>
-          <w:p>
-            <w:pPr>
-              <w:widowControl w:val="0"/>
-              <w:jc w:val="both"/>
-              <w:rPr>
-                <w:rFonts w:hint="default"/>
-                <w:vertAlign w:val="baseline"/>
-                <w:lang w:val="en-US"/>
-              </w:rPr>
-            </w:pPr>
-            <w:r>
-              <w:rPr>
-                <w:rFonts w:hint="default"/>
-                <w:vertAlign w:val="baseline"/>
-                <w:lang w:val="en-US"/>
-              </w:rPr>
-              <w:t>285</w:t>
-            </w:r>
-          </w:p>
-        </w:tc>
-        <w:tc>
-          <w:tcPr>
-            <w:tcW w:w="1063" w:type="dxa"/>
-          </w:tcPr>
-          <w:p>
-            <w:pPr>
-              <w:widowControl w:val="0"/>
-              <w:jc w:val="both"/>
-              <w:rPr>
-                <w:vertAlign w:val="baseline"/>
-              </w:rPr>
-            </w:pPr>
-          </w:p>
-        </w:tc>
-        <w:tc>
-          <w:tcPr>
-            <w:tcW w:w="779" w:type="dxa"/>
+            <w:tcW w:w="834" w:type="dxa"/>
+          </w:tcPr>
+          <w:p>
+            <w:pPr>
+              <w:widowControl w:val="0"/>
+              <w:jc w:val="both"/>
+              <w:rPr>
+                <w:rFonts w:hint="default"/>
+                <w:vertAlign w:val="baseline"/>
+                <w:lang w:val="en-US"/>
+              </w:rPr>
+            </w:pPr>
+            <w:r>
+              <w:rPr>
+                <w:rFonts w:hint="default"/>
+                <w:vertAlign w:val="baseline"/>
+                <w:lang w:val="en-US"/>
+              </w:rPr>
+              <w:t>278</w:t>
+            </w:r>
+          </w:p>
+        </w:tc>
+        <w:tc>
+          <w:tcPr>
+            <w:tcW w:w="925" w:type="dxa"/>
+          </w:tcPr>
+          <w:p>
+            <w:pPr>
+              <w:widowControl w:val="0"/>
+              <w:jc w:val="both"/>
+              <w:rPr>
+                <w:rFonts w:hint="default"/>
+                <w:vertAlign w:val="baseline"/>
+                <w:lang w:val="en-US"/>
+              </w:rPr>
+            </w:pPr>
+            <w:r>
+              <w:rPr>
+                <w:rFonts w:hint="default"/>
+                <w:vertAlign w:val="baseline"/>
+                <w:lang w:val="en-US"/>
+              </w:rPr>
+              <w:t>270</w:t>
+            </w:r>
+          </w:p>
+        </w:tc>
+        <w:tc>
+          <w:tcPr>
+            <w:tcW w:w="903" w:type="dxa"/>
+          </w:tcPr>
+          <w:p>
+            <w:pPr>
+              <w:widowControl w:val="0"/>
+              <w:jc w:val="both"/>
+              <w:rPr>
+                <w:rFonts w:hint="default"/>
+                <w:vertAlign w:val="baseline"/>
+                <w:lang w:val="en-US"/>
+              </w:rPr>
+            </w:pPr>
+          </w:p>
+        </w:tc>
+        <w:tc>
+          <w:tcPr>
+            <w:tcW w:w="802" w:type="dxa"/>
           </w:tcPr>
           <w:p>
             <w:pPr>
@@ -3183,7 +3800,7 @@
                 <w:vertAlign w:val="baseline"/>
                 <w:lang w:val="en-GB"/>
               </w:rPr>
-              <w:t>75.5</w:t>
+              <w:t>45</w:t>
             </w:r>
           </w:p>
         </w:tc>
@@ -3207,7 +3824,7 @@
                 <w:vertAlign w:val="baseline"/>
                 <w:lang w:val="en-GB"/>
               </w:rPr>
-              <w:t>46</w:t>
+              <w:t>93</w:t>
             </w:r>
           </w:p>
         </w:tc>
@@ -3288,13 +3905,13 @@
                 <w:vertAlign w:val="baseline"/>
                 <w:lang w:val="en-GB"/>
               </w:rPr>
-              <w:t>T11</w:t>
-            </w:r>
-          </w:p>
-        </w:tc>
-        <w:tc>
-          <w:tcPr>
-            <w:tcW w:w="1228" w:type="dxa"/>
+              <w:t>T12</w:t>
+            </w:r>
+          </w:p>
+        </w:tc>
+        <w:tc>
+          <w:tcPr>
+            <w:tcW w:w="896" w:type="dxa"/>
           </w:tcPr>
           <w:p>
             <w:pPr>
@@ -3316,55 +3933,59 @@
         </w:tc>
         <w:tc>
           <w:tcPr>
-            <w:tcW w:w="1290" w:type="dxa"/>
-          </w:tcPr>
-          <w:p>
-            <w:pPr>
-              <w:widowControl w:val="0"/>
-              <w:jc w:val="both"/>
-              <w:rPr>
-                <w:rFonts w:hint="default"/>
-                <w:vertAlign w:val="baseline"/>
-                <w:lang w:val="en-US"/>
-              </w:rPr>
-            </w:pPr>
-            <w:r>
-              <w:rPr>
-                <w:rFonts w:hint="default"/>
-                <w:vertAlign w:val="baseline"/>
-                <w:lang w:val="en-US"/>
-              </w:rPr>
-              <w:t>278</w:t>
-            </w:r>
-          </w:p>
-        </w:tc>
-        <w:tc>
-          <w:tcPr>
-            <w:tcW w:w="1063" w:type="dxa"/>
-          </w:tcPr>
-          <w:p>
-            <w:pPr>
-              <w:widowControl w:val="0"/>
-              <w:jc w:val="both"/>
-              <w:rPr>
-                <w:rFonts w:hint="default"/>
-                <w:vertAlign w:val="baseline"/>
-                <w:lang w:val="en-US"/>
-              </w:rPr>
-            </w:pPr>
-            <w:r>
-              <w:rPr>
-                <w:rFonts w:hint="default"/>
-                <w:vertAlign w:val="baseline"/>
-                <w:lang w:val="en-US"/>
-              </w:rPr>
-              <w:t>270</w:t>
-            </w:r>
-          </w:p>
-        </w:tc>
-        <w:tc>
-          <w:tcPr>
-            <w:tcW w:w="779" w:type="dxa"/>
+            <w:tcW w:w="834" w:type="dxa"/>
+          </w:tcPr>
+          <w:p>
+            <w:pPr>
+              <w:widowControl w:val="0"/>
+              <w:jc w:val="both"/>
+              <w:rPr>
+                <w:rFonts w:hint="default"/>
+                <w:vertAlign w:val="baseline"/>
+                <w:lang w:val="en-US"/>
+              </w:rPr>
+            </w:pPr>
+            <w:r>
+              <w:rPr>
+                <w:rFonts w:hint="default"/>
+                <w:vertAlign w:val="baseline"/>
+                <w:lang w:val="en-US"/>
+              </w:rPr>
+              <w:t>259</w:t>
+            </w:r>
+          </w:p>
+        </w:tc>
+        <w:tc>
+          <w:tcPr>
+            <w:tcW w:w="925" w:type="dxa"/>
+          </w:tcPr>
+          <w:p>
+            <w:pPr>
+              <w:widowControl w:val="0"/>
+              <w:jc w:val="both"/>
+              <w:rPr>
+                <w:vertAlign w:val="baseline"/>
+              </w:rPr>
+            </w:pPr>
+          </w:p>
+        </w:tc>
+        <w:tc>
+          <w:tcPr>
+            <w:tcW w:w="903" w:type="dxa"/>
+          </w:tcPr>
+          <w:p>
+            <w:pPr>
+              <w:widowControl w:val="0"/>
+              <w:jc w:val="both"/>
+              <w:rPr>
+                <w:vertAlign w:val="baseline"/>
+              </w:rPr>
+            </w:pPr>
+          </w:p>
+        </w:tc>
+        <w:tc>
+          <w:tcPr>
+            <w:tcW w:w="802" w:type="dxa"/>
           </w:tcPr>
           <w:p>
             <w:pPr>
@@ -3396,7 +4017,7 @@
                 <w:vertAlign w:val="baseline"/>
                 <w:lang w:val="en-GB"/>
               </w:rPr>
-              <w:t>45</w:t>
+              <w:t>77</w:t>
             </w:r>
           </w:p>
         </w:tc>
@@ -3420,7 +4041,7 @@
                 <w:vertAlign w:val="baseline"/>
                 <w:lang w:val="en-GB"/>
               </w:rPr>
-              <w:t>93</w:t>
+              <w:t>54</w:t>
             </w:r>
           </w:p>
         </w:tc>
@@ -3501,13 +4122,13 @@
                 <w:vertAlign w:val="baseline"/>
                 <w:lang w:val="en-GB"/>
               </w:rPr>
-              <w:t>T12</w:t>
-            </w:r>
-          </w:p>
-        </w:tc>
-        <w:tc>
-          <w:tcPr>
-            <w:tcW w:w="1228" w:type="dxa"/>
+              <w:t>T13</w:t>
+            </w:r>
+          </w:p>
+        </w:tc>
+        <w:tc>
+          <w:tcPr>
+            <w:tcW w:w="896" w:type="dxa"/>
           </w:tcPr>
           <w:p>
             <w:pPr>
@@ -3529,45 +4150,71 @@
         </w:tc>
         <w:tc>
           <w:tcPr>
-            <w:tcW w:w="1290" w:type="dxa"/>
-          </w:tcPr>
-          <w:p>
-            <w:pPr>
-              <w:widowControl w:val="0"/>
-              <w:jc w:val="both"/>
-              <w:rPr>
-                <w:rFonts w:hint="default"/>
-                <w:vertAlign w:val="baseline"/>
-                <w:lang w:val="en-US"/>
-              </w:rPr>
-            </w:pPr>
-            <w:r>
-              <w:rPr>
-                <w:rFonts w:hint="default"/>
-                <w:vertAlign w:val="baseline"/>
-                <w:lang w:val="en-US"/>
-              </w:rPr>
-              <w:t>259</w:t>
-            </w:r>
-          </w:p>
-        </w:tc>
-        <w:tc>
-          <w:tcPr>
-            <w:tcW w:w="1063" w:type="dxa"/>
-          </w:tcPr>
-          <w:p>
-            <w:pPr>
-              <w:widowControl w:val="0"/>
-              <w:jc w:val="both"/>
-              <w:rPr>
-                <w:vertAlign w:val="baseline"/>
-              </w:rPr>
-            </w:pPr>
-          </w:p>
-        </w:tc>
-        <w:tc>
-          <w:tcPr>
-            <w:tcW w:w="779" w:type="dxa"/>
+            <w:tcW w:w="834" w:type="dxa"/>
+          </w:tcPr>
+          <w:p>
+            <w:pPr>
+              <w:widowControl w:val="0"/>
+              <w:jc w:val="both"/>
+              <w:rPr>
+                <w:rFonts w:hint="default"/>
+                <w:vertAlign w:val="baseline"/>
+                <w:lang w:val="en-US"/>
+              </w:rPr>
+            </w:pPr>
+            <w:r>
+              <w:rPr>
+                <w:rFonts w:hint="default"/>
+                <w:vertAlign w:val="baseline"/>
+                <w:lang w:val="en-US"/>
+              </w:rPr>
+              <w:t>219</w:t>
+            </w:r>
+          </w:p>
+        </w:tc>
+        <w:tc>
+          <w:tcPr>
+            <w:tcW w:w="925" w:type="dxa"/>
+          </w:tcPr>
+          <w:p>
+            <w:pPr>
+              <w:widowControl w:val="0"/>
+              <w:jc w:val="both"/>
+              <w:rPr>
+                <w:rFonts w:hint="default"/>
+                <w:vertAlign w:val="baseline"/>
+                <w:lang w:val="en-US"/>
+              </w:rPr>
+            </w:pPr>
+            <w:r>
+              <w:rPr>
+                <w:rFonts w:hint="default"/>
+                <w:vertAlign w:val="baseline"/>
+                <w:lang w:val="en-US"/>
+              </w:rPr>
+              <w:t>244</w:t>
+            </w:r>
+          </w:p>
+        </w:tc>
+        <w:tc>
+          <w:tcPr>
+            <w:tcW w:w="903" w:type="dxa"/>
+          </w:tcPr>
+          <w:p>
+            <w:pPr>
+              <w:widowControl w:val="0"/>
+              <w:jc w:val="both"/>
+              <w:rPr>
+                <w:rFonts w:hint="default"/>
+                <w:vertAlign w:val="baseline"/>
+                <w:lang w:val="en-US"/>
+              </w:rPr>
+            </w:pPr>
+          </w:p>
+        </w:tc>
+        <w:tc>
+          <w:tcPr>
+            <w:tcW w:w="802" w:type="dxa"/>
           </w:tcPr>
           <w:p>
             <w:pPr>
@@ -3599,7 +4246,7 @@
                 <w:vertAlign w:val="baseline"/>
                 <w:lang w:val="en-GB"/>
               </w:rPr>
-              <w:t>77</w:t>
+              <w:t>112</w:t>
             </w:r>
           </w:p>
         </w:tc>
@@ -3623,7 +4270,7 @@
                 <w:vertAlign w:val="baseline"/>
                 <w:lang w:val="en-GB"/>
               </w:rPr>
-              <w:t>54</w:t>
+              <w:t>68.5</w:t>
             </w:r>
           </w:p>
         </w:tc>
@@ -3704,20 +4351,22 @@
                 <w:vertAlign w:val="baseline"/>
                 <w:lang w:val="en-GB"/>
               </w:rPr>
-              <w:t>T13</w:t>
-            </w:r>
-          </w:p>
-        </w:tc>
-        <w:tc>
-          <w:tcPr>
-            <w:tcW w:w="1228" w:type="dxa"/>
-          </w:tcPr>
-          <w:p>
-            <w:pPr>
-              <w:widowControl w:val="0"/>
-              <w:jc w:val="both"/>
-              <w:rPr>
-                <w:vertAlign w:val="baseline"/>
+              <w:t>T14</w:t>
+            </w:r>
+          </w:p>
+        </w:tc>
+        <w:tc>
+          <w:tcPr>
+            <w:tcW w:w="896" w:type="dxa"/>
+          </w:tcPr>
+          <w:p>
+            <w:pPr>
+              <w:widowControl w:val="0"/>
+              <w:jc w:val="both"/>
+              <w:rPr>
+                <w:rFonts w:hint="default"/>
+                <w:vertAlign w:val="baseline"/>
+                <w:lang w:val="en-US"/>
               </w:rPr>
             </w:pPr>
             <w:r>
@@ -3728,59 +4377,61 @@
               </w:rPr>
               <w:t>Fast corner</w:t>
             </w:r>
-          </w:p>
-        </w:tc>
-        <w:tc>
-          <w:tcPr>
-            <w:tcW w:w="1290" w:type="dxa"/>
-          </w:tcPr>
-          <w:p>
-            <w:pPr>
-              <w:widowControl w:val="0"/>
-              <w:jc w:val="both"/>
-              <w:rPr>
-                <w:rFonts w:hint="default"/>
-                <w:vertAlign w:val="baseline"/>
-                <w:lang w:val="en-US"/>
-              </w:rPr>
-            </w:pPr>
-            <w:r>
-              <w:rPr>
-                <w:rFonts w:hint="default"/>
-                <w:vertAlign w:val="baseline"/>
-                <w:lang w:val="en-US"/>
-              </w:rPr>
-              <w:t>219</w:t>
-            </w:r>
-          </w:p>
-        </w:tc>
-        <w:tc>
-          <w:tcPr>
-            <w:tcW w:w="1063" w:type="dxa"/>
-          </w:tcPr>
-          <w:p>
-            <w:pPr>
-              <w:widowControl w:val="0"/>
-              <w:jc w:val="both"/>
-              <w:rPr>
-                <w:rFonts w:hint="default"/>
-                <w:vertAlign w:val="baseline"/>
-                <w:lang w:val="en-US"/>
-              </w:rPr>
-            </w:pPr>
-            <w:r>
-              <w:rPr>
-                <w:rFonts w:hint="default"/>
-                <w:vertAlign w:val="baseline"/>
-                <w:lang w:val="en-US"/>
-              </w:rPr>
-              <w:t>244</w:t>
-            </w:r>
-          </w:p>
-        </w:tc>
-        <w:tc>
-          <w:tcPr>
-            <w:tcW w:w="779" w:type="dxa"/>
+            <w:r>
+              <w:rPr>
+                <w:rFonts w:hint="default"/>
+                <w:vertAlign w:val="baseline"/>
+                <w:lang w:val="en-US"/>
+              </w:rPr>
+              <w:t xml:space="preserve"> / Straight</w:t>
+            </w:r>
+          </w:p>
+        </w:tc>
+        <w:tc>
+          <w:tcPr>
+            <w:tcW w:w="834" w:type="dxa"/>
+          </w:tcPr>
+          <w:p>
+            <w:pPr>
+              <w:widowControl w:val="0"/>
+              <w:jc w:val="both"/>
+              <w:rPr>
+                <w:vertAlign w:val="baseline"/>
+              </w:rPr>
+            </w:pPr>
+          </w:p>
+        </w:tc>
+        <w:tc>
+          <w:tcPr>
+            <w:tcW w:w="925" w:type="dxa"/>
+          </w:tcPr>
+          <w:p>
+            <w:pPr>
+              <w:widowControl w:val="0"/>
+              <w:jc w:val="both"/>
+              <w:rPr>
+                <w:vertAlign w:val="baseline"/>
+              </w:rPr>
+            </w:pPr>
+          </w:p>
+        </w:tc>
+        <w:tc>
+          <w:tcPr>
+            <w:tcW w:w="903" w:type="dxa"/>
+          </w:tcPr>
+          <w:p>
+            <w:pPr>
+              <w:widowControl w:val="0"/>
+              <w:jc w:val="both"/>
+              <w:rPr>
+                <w:vertAlign w:val="baseline"/>
+              </w:rPr>
+            </w:pPr>
+          </w:p>
+        </w:tc>
+        <w:tc>
+          <w:tcPr>
+            <w:tcW w:w="802" w:type="dxa"/>
           </w:tcPr>
           <w:p>
             <w:pPr>
@@ -3812,7 +4463,7 @@
                 <w:vertAlign w:val="baseline"/>
                 <w:lang w:val="en-GB"/>
               </w:rPr>
-              <w:t>112</w:t>
+              <w:t>58</w:t>
             </w:r>
           </w:p>
         </w:tc>
@@ -3836,7 +4487,7 @@
                 <w:vertAlign w:val="baseline"/>
                 <w:lang w:val="en-GB"/>
               </w:rPr>
-              <w:t>68.5</w:t>
+              <w:t>32.5</w:t>
             </w:r>
           </w:p>
         </w:tc>
@@ -3917,73 +4568,77 @@
                 <w:vertAlign w:val="baseline"/>
                 <w:lang w:val="en-GB"/>
               </w:rPr>
-              <w:t>T14</w:t>
-            </w:r>
-          </w:p>
-        </w:tc>
-        <w:tc>
-          <w:tcPr>
-            <w:tcW w:w="1228" w:type="dxa"/>
-          </w:tcPr>
-          <w:p>
-            <w:pPr>
-              <w:widowControl w:val="0"/>
-              <w:jc w:val="both"/>
-              <w:rPr>
-                <w:rFonts w:hint="default"/>
-                <w:vertAlign w:val="baseline"/>
-                <w:lang w:val="en-US"/>
-              </w:rPr>
-            </w:pPr>
-            <w:r>
-              <w:rPr>
-                <w:rFonts w:hint="default"/>
-                <w:vertAlign w:val="baseline"/>
-                <w:lang w:val="en-GB"/>
-              </w:rPr>
-              <w:t>Fast corner</w:t>
-            </w:r>
-            <w:r>
-              <w:rPr>
-                <w:rFonts w:hint="default"/>
-                <w:vertAlign w:val="baseline"/>
-                <w:lang w:val="en-US"/>
-              </w:rPr>
-              <w:t xml:space="preserve"> / Straight</w:t>
-            </w:r>
-          </w:p>
-        </w:tc>
-        <w:tc>
-          <w:tcPr>
-            <w:tcW w:w="1290" w:type="dxa"/>
-          </w:tcPr>
-          <w:p>
-            <w:pPr>
-              <w:widowControl w:val="0"/>
-              <w:jc w:val="both"/>
-              <w:rPr>
-                <w:vertAlign w:val="baseline"/>
-              </w:rPr>
-            </w:pPr>
-          </w:p>
-        </w:tc>
-        <w:tc>
-          <w:tcPr>
-            <w:tcW w:w="1063" w:type="dxa"/>
-          </w:tcPr>
-          <w:p>
-            <w:pPr>
-              <w:widowControl w:val="0"/>
-              <w:jc w:val="both"/>
-              <w:rPr>
-                <w:vertAlign w:val="baseline"/>
-              </w:rPr>
-            </w:pPr>
-          </w:p>
-        </w:tc>
-        <w:tc>
-          <w:tcPr>
-            <w:tcW w:w="779" w:type="dxa"/>
+              <w:t>Hanger Straight</w:t>
+            </w:r>
+          </w:p>
+        </w:tc>
+        <w:tc>
+          <w:tcPr>
+            <w:tcW w:w="896" w:type="dxa"/>
+          </w:tcPr>
+          <w:p>
+            <w:pPr>
+              <w:widowControl w:val="0"/>
+              <w:jc w:val="both"/>
+              <w:rPr>
+                <w:vertAlign w:val="baseline"/>
+              </w:rPr>
+            </w:pPr>
+            <w:r>
+              <w:rPr>
+                <w:rFonts w:hint="default"/>
+                <w:vertAlign w:val="baseline"/>
+                <w:lang w:val="en-GB"/>
+              </w:rPr>
+              <w:t>Straight</w:t>
+            </w:r>
+          </w:p>
+        </w:tc>
+        <w:tc>
+          <w:tcPr>
+            <w:tcW w:w="834" w:type="dxa"/>
+          </w:tcPr>
+          <w:p>
+            <w:pPr>
+              <w:widowControl w:val="0"/>
+              <w:jc w:val="both"/>
+              <w:rPr>
+                <w:vertAlign w:val="baseline"/>
+              </w:rPr>
+            </w:pPr>
+          </w:p>
+        </w:tc>
+        <w:tc>
+          <w:tcPr>
+            <w:tcW w:w="925" w:type="dxa"/>
+          </w:tcPr>
+          <w:p>
+            <w:pPr>
+              <w:widowControl w:val="0"/>
+              <w:jc w:val="both"/>
+              <w:rPr>
+                <w:vertAlign w:val="baseline"/>
+              </w:rPr>
+            </w:pPr>
+          </w:p>
+        </w:tc>
+        <w:tc>
+          <w:tcPr>
+            <w:tcW w:w="903" w:type="dxa"/>
+          </w:tcPr>
+          <w:p>
+            <w:pPr>
+              <w:widowControl w:val="0"/>
+              <w:jc w:val="both"/>
+              <w:rPr>
+                <w:vertAlign w:val="baseline"/>
+              </w:rPr>
+            </w:pPr>
+          </w:p>
+        </w:tc>
+        <w:tc>
+          <w:tcPr>
+            <w:tcW w:w="802" w:type="dxa"/>
           </w:tcPr>
           <w:p>
             <w:pPr>
@@ -4015,7 +4670,7 @@
                 <w:vertAlign w:val="baseline"/>
                 <w:lang w:val="en-GB"/>
               </w:rPr>
-              <w:t>58</w:t>
+              <w:t>723</w:t>
             </w:r>
           </w:p>
         </w:tc>
@@ -4028,19 +4683,9 @@
               <w:widowControl w:val="0"/>
               <w:jc w:val="both"/>
               <w:rPr>
-                <w:rFonts w:hint="default"/>
-                <w:vertAlign w:val="baseline"/>
-                <w:lang w:val="en-GB"/>
-              </w:rPr>
-            </w:pPr>
-            <w:r>
-              <w:rPr>
-                <w:rFonts w:hint="default"/>
-                <w:vertAlign w:val="baseline"/>
-                <w:lang w:val="en-GB"/>
-              </w:rPr>
-              <w:t>32.5</w:t>
-            </w:r>
+                <w:vertAlign w:val="baseline"/>
+              </w:rPr>
+            </w:pPr>
           </w:p>
         </w:tc>
         <w:tc>
@@ -4061,7 +4706,7 @@
                 <w:vertAlign w:val="baseline"/>
                 <w:lang w:val="en-GB"/>
               </w:rPr>
-              <w:t>false</w:t>
+              <w:t>true</w:t>
             </w:r>
           </w:p>
         </w:tc>
@@ -4074,9 +4719,19 @@
               <w:widowControl w:val="0"/>
               <w:jc w:val="both"/>
               <w:rPr>
-                <w:vertAlign w:val="baseline"/>
-              </w:rPr>
-            </w:pPr>
+                <w:rFonts w:hint="default"/>
+                <w:vertAlign w:val="baseline"/>
+                <w:lang w:val="en-GB"/>
+              </w:rPr>
+            </w:pPr>
+            <w:r>
+              <w:rPr>
+                <w:rFonts w:hint="default"/>
+                <w:vertAlign w:val="baseline"/>
+                <w:lang w:val="en-GB"/>
+              </w:rPr>
+              <w:t>SM lasts the whole straight</w:t>
+            </w:r>
           </w:p>
         </w:tc>
       </w:tr>
@@ -4120,72 +4775,118 @@
                 <w:vertAlign w:val="baseline"/>
                 <w:lang w:val="en-GB"/>
               </w:rPr>
-              <w:t>Hanger Straight</w:t>
-            </w:r>
-          </w:p>
-        </w:tc>
-        <w:tc>
-          <w:tcPr>
-            <w:tcW w:w="1228" w:type="dxa"/>
-          </w:tcPr>
-          <w:p>
-            <w:pPr>
-              <w:widowControl w:val="0"/>
-              <w:jc w:val="both"/>
-              <w:rPr>
-                <w:vertAlign w:val="baseline"/>
-              </w:rPr>
-            </w:pPr>
-            <w:r>
-              <w:rPr>
-                <w:rFonts w:hint="default"/>
-                <w:vertAlign w:val="baseline"/>
-                <w:lang w:val="en-GB"/>
-              </w:rPr>
-              <w:t>Straight</w:t>
-            </w:r>
-          </w:p>
-        </w:tc>
-        <w:tc>
-          <w:tcPr>
-            <w:tcW w:w="1290" w:type="dxa"/>
-          </w:tcPr>
-          <w:p>
-            <w:pPr>
-              <w:widowControl w:val="0"/>
-              <w:jc w:val="both"/>
-              <w:rPr>
-                <w:vertAlign w:val="baseline"/>
-              </w:rPr>
-            </w:pPr>
-          </w:p>
-        </w:tc>
-        <w:tc>
-          <w:tcPr>
-            <w:tcW w:w="1063" w:type="dxa"/>
-          </w:tcPr>
-          <w:p>
-            <w:pPr>
-              <w:widowControl w:val="0"/>
-              <w:jc w:val="both"/>
-              <w:rPr>
-                <w:vertAlign w:val="baseline"/>
-              </w:rPr>
-            </w:pPr>
-          </w:p>
-        </w:tc>
-        <w:tc>
-          <w:tcPr>
-            <w:tcW w:w="779" w:type="dxa"/>
-          </w:tcPr>
-          <w:p>
-            <w:pPr>
-              <w:widowControl w:val="0"/>
-              <w:jc w:val="both"/>
-              <w:rPr>
-                <w:vertAlign w:val="baseline"/>
-              </w:rPr>
-            </w:pPr>
+              <w:t>T15 Stowe</w:t>
+            </w:r>
+          </w:p>
+        </w:tc>
+        <w:tc>
+          <w:tcPr>
+            <w:tcW w:w="896" w:type="dxa"/>
+          </w:tcPr>
+          <w:p>
+            <w:pPr>
+              <w:widowControl w:val="0"/>
+              <w:jc w:val="both"/>
+              <w:rPr>
+                <w:vertAlign w:val="baseline"/>
+              </w:rPr>
+            </w:pPr>
+            <w:r>
+              <w:rPr>
+                <w:rFonts w:hint="default"/>
+                <w:vertAlign w:val="baseline"/>
+                <w:lang w:val="en-GB"/>
+              </w:rPr>
+              <w:t>Slow corner</w:t>
+            </w:r>
+          </w:p>
+        </w:tc>
+        <w:tc>
+          <w:tcPr>
+            <w:tcW w:w="834" w:type="dxa"/>
+          </w:tcPr>
+          <w:p>
+            <w:pPr>
+              <w:widowControl w:val="0"/>
+              <w:jc w:val="both"/>
+              <w:rPr>
+                <w:rFonts w:hint="default"/>
+                <w:vertAlign w:val="baseline"/>
+                <w:lang w:val="en-US"/>
+              </w:rPr>
+            </w:pPr>
+            <w:r>
+              <w:rPr>
+                <w:rFonts w:hint="default"/>
+                <w:vertAlign w:val="baseline"/>
+                <w:lang w:val="en-US"/>
+              </w:rPr>
+              <w:t>236</w:t>
+            </w:r>
+          </w:p>
+        </w:tc>
+        <w:tc>
+          <w:tcPr>
+            <w:tcW w:w="925" w:type="dxa"/>
+          </w:tcPr>
+          <w:p>
+            <w:pPr>
+              <w:widowControl w:val="0"/>
+              <w:jc w:val="both"/>
+              <w:rPr>
+                <w:rFonts w:hint="default"/>
+                <w:vertAlign w:val="baseline"/>
+                <w:lang w:val="en-US"/>
+              </w:rPr>
+            </w:pPr>
+            <w:r>
+              <w:rPr>
+                <w:rFonts w:hint="default"/>
+                <w:vertAlign w:val="baseline"/>
+                <w:lang w:val="en-US"/>
+              </w:rPr>
+              <w:t>249</w:t>
+            </w:r>
+          </w:p>
+        </w:tc>
+        <w:tc>
+          <w:tcPr>
+            <w:tcW w:w="903" w:type="dxa"/>
+          </w:tcPr>
+          <w:p>
+            <w:pPr>
+              <w:widowControl w:val="0"/>
+              <w:jc w:val="both"/>
+              <w:rPr>
+                <w:rFonts w:hint="default"/>
+                <w:vertAlign w:val="baseline"/>
+                <w:lang w:val="en-US"/>
+              </w:rPr>
+            </w:pPr>
+          </w:p>
+        </w:tc>
+        <w:tc>
+          <w:tcPr>
+            <w:tcW w:w="802" w:type="dxa"/>
+          </w:tcPr>
+          <w:p>
+            <w:pPr>
+              <w:widowControl w:val="0"/>
+              <w:jc w:val="both"/>
+              <w:rPr>
+                <w:rFonts w:hint="default"/>
+                <w:vertAlign w:val="baseline"/>
+                <w:lang w:val="en-GB"/>
+              </w:rPr>
+            </w:pPr>
+            <w:r>
+              <w:rPr>
+                <w:rFonts w:hint="default"/>
+                <w:vertAlign w:val="baseline"/>
+                <w:lang w:val="en-GB"/>
+              </w:rPr>
+              <w:t>3.38</w:t>
+            </w:r>
           </w:p>
         </w:tc>
         <w:tc>
@@ -4208,7 +4909,7 @@
                 <w:vertAlign w:val="baseline"/>
                 <w:lang w:val="en-GB"/>
               </w:rPr>
-              <w:t>723</w:t>
+              <w:t>132.5</w:t>
             </w:r>
           </w:p>
         </w:tc>
@@ -4221,9 +4922,19 @@
               <w:widowControl w:val="0"/>
               <w:jc w:val="both"/>
               <w:rPr>
-                <w:vertAlign w:val="baseline"/>
-              </w:rPr>
-            </w:pPr>
+                <w:rFonts w:hint="default"/>
+                <w:vertAlign w:val="baseline"/>
+                <w:lang w:val="en-GB"/>
+              </w:rPr>
+            </w:pPr>
+            <w:r>
+              <w:rPr>
+                <w:rFonts w:hint="default"/>
+                <w:vertAlign w:val="baseline"/>
+                <w:lang w:val="en-GB"/>
+              </w:rPr>
+              <w:t>95</w:t>
+            </w:r>
           </w:p>
         </w:tc>
         <w:tc>
@@ -4244,7 +4955,7 @@
                 <w:vertAlign w:val="baseline"/>
                 <w:lang w:val="en-GB"/>
               </w:rPr>
-              <w:t>true</w:t>
+              <w:t>false</w:t>
             </w:r>
           </w:p>
         </w:tc>
@@ -4268,7 +4979,7 @@
                 <w:vertAlign w:val="baseline"/>
                 <w:lang w:val="en-GB"/>
               </w:rPr>
-              <w:t>SM lasts the whole straight</w:t>
+              <w:t>Entry speed: 290</w:t>
             </w:r>
           </w:p>
         </w:tc>
@@ -4313,83 +5024,77 @@
                 <w:vertAlign w:val="baseline"/>
                 <w:lang w:val="en-GB"/>
               </w:rPr>
-              <w:t>T15</w:t>
-            </w:r>
-          </w:p>
-        </w:tc>
-        <w:tc>
-          <w:tcPr>
-            <w:tcW w:w="1228" w:type="dxa"/>
-          </w:tcPr>
-          <w:p>
-            <w:pPr>
-              <w:widowControl w:val="0"/>
-              <w:jc w:val="both"/>
-              <w:rPr>
-                <w:vertAlign w:val="baseline"/>
-              </w:rPr>
-            </w:pPr>
-            <w:r>
-              <w:rPr>
-                <w:rFonts w:hint="default"/>
-                <w:vertAlign w:val="baseline"/>
-                <w:lang w:val="en-GB"/>
-              </w:rPr>
-              <w:t>Slow corner</w:t>
-            </w:r>
-          </w:p>
-        </w:tc>
-        <w:tc>
-          <w:tcPr>
-            <w:tcW w:w="1290" w:type="dxa"/>
-          </w:tcPr>
-          <w:p>
-            <w:pPr>
-              <w:widowControl w:val="0"/>
-              <w:jc w:val="both"/>
-              <w:rPr>
-                <w:rFonts w:hint="default"/>
-                <w:vertAlign w:val="baseline"/>
-                <w:lang w:val="en-US"/>
-              </w:rPr>
-            </w:pPr>
-            <w:r>
-              <w:rPr>
-                <w:rFonts w:hint="default"/>
-                <w:vertAlign w:val="baseline"/>
-                <w:lang w:val="en-US"/>
-              </w:rPr>
-              <w:t>236</w:t>
-            </w:r>
-          </w:p>
-        </w:tc>
-        <w:tc>
-          <w:tcPr>
-            <w:tcW w:w="1063" w:type="dxa"/>
-          </w:tcPr>
-          <w:p>
-            <w:pPr>
-              <w:widowControl w:val="0"/>
-              <w:jc w:val="both"/>
-              <w:rPr>
-                <w:rFonts w:hint="default"/>
-                <w:vertAlign w:val="baseline"/>
-                <w:lang w:val="en-US"/>
-              </w:rPr>
-            </w:pPr>
-            <w:r>
-              <w:rPr>
-                <w:rFonts w:hint="default"/>
-                <w:vertAlign w:val="baseline"/>
-                <w:lang w:val="en-US"/>
-              </w:rPr>
-              <w:t>249</w:t>
-            </w:r>
-          </w:p>
-        </w:tc>
-        <w:tc>
-          <w:tcPr>
-            <w:tcW w:w="779" w:type="dxa"/>
+              <w:t>T15 - pit entry straight</w:t>
+            </w:r>
+          </w:p>
+        </w:tc>
+        <w:tc>
+          <w:tcPr>
+            <w:tcW w:w="896" w:type="dxa"/>
+          </w:tcPr>
+          <w:p>
+            <w:pPr>
+              <w:widowControl w:val="0"/>
+              <w:jc w:val="both"/>
+              <w:rPr>
+                <w:vertAlign w:val="baseline"/>
+              </w:rPr>
+            </w:pPr>
+            <w:r>
+              <w:rPr>
+                <w:rFonts w:hint="default"/>
+                <w:vertAlign w:val="baseline"/>
+                <w:lang w:val="en-GB"/>
+              </w:rPr>
+              <w:t>Straight</w:t>
+            </w:r>
+          </w:p>
+        </w:tc>
+        <w:tc>
+          <w:tcPr>
+            <w:tcW w:w="834" w:type="dxa"/>
+          </w:tcPr>
+          <w:p>
+            <w:pPr>
+              <w:widowControl w:val="0"/>
+              <w:jc w:val="both"/>
+              <w:rPr>
+                <w:vertAlign w:val="baseline"/>
+              </w:rPr>
+            </w:pPr>
+          </w:p>
+        </w:tc>
+        <w:tc>
+          <w:tcPr>
+            <w:tcW w:w="925" w:type="dxa"/>
+          </w:tcPr>
+          <w:p>
+            <w:pPr>
+              <w:widowControl w:val="0"/>
+              <w:jc w:val="both"/>
+              <w:rPr>
+                <w:vertAlign w:val="baseline"/>
+              </w:rPr>
+            </w:pPr>
+          </w:p>
+        </w:tc>
+        <w:tc>
+          <w:tcPr>
+            <w:tcW w:w="903" w:type="dxa"/>
+          </w:tcPr>
+          <w:p>
+            <w:pPr>
+              <w:widowControl w:val="0"/>
+              <w:jc w:val="both"/>
+              <w:rPr>
+                <w:vertAlign w:val="baseline"/>
+              </w:rPr>
+            </w:pPr>
+          </w:p>
+        </w:tc>
+        <w:tc>
+          <w:tcPr>
+            <w:tcW w:w="802" w:type="dxa"/>
           </w:tcPr>
           <w:p>
             <w:pPr>
@@ -4421,7 +5126,7 @@
                 <w:vertAlign w:val="baseline"/>
                 <w:lang w:val="en-GB"/>
               </w:rPr>
-              <w:t>132.5</w:t>
+              <w:t>157.5</w:t>
             </w:r>
           </w:p>
         </w:tc>
@@ -4434,19 +5139,9 @@
               <w:widowControl w:val="0"/>
               <w:jc w:val="both"/>
               <w:rPr>
-                <w:rFonts w:hint="default"/>
-                <w:vertAlign w:val="baseline"/>
-                <w:lang w:val="en-GB"/>
-              </w:rPr>
-            </w:pPr>
-            <w:r>
-              <w:rPr>
-                <w:rFonts w:hint="default"/>
-                <w:vertAlign w:val="baseline"/>
-                <w:lang w:val="en-GB"/>
-              </w:rPr>
-              <w:t>95</w:t>
-            </w:r>
+                <w:vertAlign w:val="baseline"/>
+              </w:rPr>
+            </w:pPr>
           </w:p>
         </w:tc>
         <w:tc>
@@ -4526,13 +5221,13 @@
                 <w:vertAlign w:val="baseline"/>
                 <w:lang w:val="en-GB"/>
               </w:rPr>
-              <w:t>T15 - pit entry straight</w:t>
-            </w:r>
-          </w:p>
-        </w:tc>
-        <w:tc>
-          <w:tcPr>
-            <w:tcW w:w="1228" w:type="dxa"/>
+              <w:t>Pit entry - T16 Straight</w:t>
+            </w:r>
+          </w:p>
+        </w:tc>
+        <w:tc>
+          <w:tcPr>
+            <w:tcW w:w="896" w:type="dxa"/>
           </w:tcPr>
           <w:p>
             <w:pPr>
@@ -4554,35 +5249,49 @@
         </w:tc>
         <w:tc>
           <w:tcPr>
-            <w:tcW w:w="1290" w:type="dxa"/>
-          </w:tcPr>
-          <w:p>
-            <w:pPr>
-              <w:widowControl w:val="0"/>
-              <w:jc w:val="both"/>
-              <w:rPr>
-                <w:vertAlign w:val="baseline"/>
-              </w:rPr>
-            </w:pPr>
-          </w:p>
-        </w:tc>
-        <w:tc>
-          <w:tcPr>
-            <w:tcW w:w="1063" w:type="dxa"/>
-          </w:tcPr>
-          <w:p>
-            <w:pPr>
-              <w:widowControl w:val="0"/>
-              <w:jc w:val="both"/>
-              <w:rPr>
-                <w:vertAlign w:val="baseline"/>
-              </w:rPr>
-            </w:pPr>
-          </w:p>
-        </w:tc>
-        <w:tc>
-          <w:tcPr>
-            <w:tcW w:w="779" w:type="dxa"/>
+            <w:tcW w:w="834" w:type="dxa"/>
+          </w:tcPr>
+          <w:p>
+            <w:pPr>
+              <w:widowControl w:val="0"/>
+              <w:jc w:val="both"/>
+              <w:rPr>
+                <w:vertAlign w:val="baseline"/>
+              </w:rPr>
+            </w:pPr>
+          </w:p>
+        </w:tc>
+        <w:tc>
+          <w:tcPr>
+            <w:tcW w:w="925" w:type="dxa"/>
+          </w:tcPr>
+          <w:p>
+            <w:pPr>
+              <w:widowControl w:val="0"/>
+              <w:jc w:val="both"/>
+              <w:rPr>
+                <w:vertAlign w:val="baseline"/>
+              </w:rPr>
+            </w:pPr>
+          </w:p>
+        </w:tc>
+        <w:tc>
+          <w:tcPr>
+            <w:tcW w:w="903" w:type="dxa"/>
+          </w:tcPr>
+          <w:p>
+            <w:pPr>
+              <w:widowControl w:val="0"/>
+              <w:jc w:val="both"/>
+              <w:rPr>
+                <w:vertAlign w:val="baseline"/>
+              </w:rPr>
+            </w:pPr>
+          </w:p>
+        </w:tc>
+        <w:tc>
+          <w:tcPr>
+            <w:tcW w:w="802" w:type="dxa"/>
           </w:tcPr>
           <w:p>
             <w:pPr>
@@ -4614,7 +5323,7 @@
                 <w:vertAlign w:val="baseline"/>
                 <w:lang w:val="en-GB"/>
               </w:rPr>
-              <w:t>157.5</w:t>
+              <w:t>133</w:t>
             </w:r>
           </w:p>
         </w:tc>
@@ -4663,7 +5372,9 @@
               <w:widowControl w:val="0"/>
               <w:jc w:val="both"/>
               <w:rPr>
-                <w:vertAlign w:val="baseline"/>
+                <w:rFonts w:hint="default"/>
+                <w:vertAlign w:val="baseline"/>
+                <w:lang w:val="en-GB"/>
               </w:rPr>
             </w:pPr>
           </w:p>
@@ -4709,150 +5420,214 @@
                 <w:vertAlign w:val="baseline"/>
                 <w:lang w:val="en-GB"/>
               </w:rPr>
-              <w:t>Pit entry - T16 Straight</w:t>
-            </w:r>
-          </w:p>
-        </w:tc>
-        <w:tc>
-          <w:tcPr>
-            <w:tcW w:w="1228" w:type="dxa"/>
-          </w:tcPr>
-          <w:p>
-            <w:pPr>
-              <w:widowControl w:val="0"/>
-              <w:jc w:val="both"/>
-              <w:rPr>
-                <w:vertAlign w:val="baseline"/>
-              </w:rPr>
-            </w:pPr>
-            <w:r>
-              <w:rPr>
-                <w:rFonts w:hint="default"/>
-                <w:vertAlign w:val="baseline"/>
-                <w:lang w:val="en-GB"/>
-              </w:rPr>
-              <w:t>Straight</w:t>
-            </w:r>
-          </w:p>
-        </w:tc>
-        <w:tc>
-          <w:tcPr>
-            <w:tcW w:w="1290" w:type="dxa"/>
-          </w:tcPr>
-          <w:p>
-            <w:pPr>
-              <w:widowControl w:val="0"/>
-              <w:jc w:val="both"/>
-              <w:rPr>
-                <w:vertAlign w:val="baseline"/>
-              </w:rPr>
-            </w:pPr>
-          </w:p>
-        </w:tc>
-        <w:tc>
-          <w:tcPr>
-            <w:tcW w:w="1063" w:type="dxa"/>
-          </w:tcPr>
-          <w:p>
-            <w:pPr>
-              <w:widowControl w:val="0"/>
-              <w:jc w:val="both"/>
-              <w:rPr>
-                <w:vertAlign w:val="baseline"/>
-              </w:rPr>
-            </w:pPr>
-          </w:p>
-        </w:tc>
-        <w:tc>
-          <w:tcPr>
-            <w:tcW w:w="779" w:type="dxa"/>
-          </w:tcPr>
-          <w:p>
-            <w:pPr>
-              <w:widowControl w:val="0"/>
-              <w:jc w:val="both"/>
-              <w:rPr>
-                <w:vertAlign w:val="baseline"/>
-              </w:rPr>
-            </w:pPr>
-          </w:p>
-        </w:tc>
-        <w:tc>
-          <w:tcPr>
-            <w:tcW w:w="879" w:type="dxa"/>
-          </w:tcPr>
-          <w:p>
-            <w:pPr>
-              <w:widowControl w:val="0"/>
-              <w:jc w:val="both"/>
-              <w:rPr>
-                <w:rFonts w:hint="default"/>
-                <w:vertAlign w:val="baseline"/>
-                <w:lang w:val="en-GB"/>
-              </w:rPr>
-            </w:pPr>
-            <w:r>
-              <w:rPr>
-                <w:rFonts w:hint="default"/>
-                <w:vertAlign w:val="baseline"/>
-                <w:lang w:val="en-GB"/>
-              </w:rPr>
-              <w:t>133</w:t>
-            </w:r>
-          </w:p>
-        </w:tc>
-        <w:tc>
-          <w:tcPr>
-            <w:tcW w:w="868" w:type="dxa"/>
-          </w:tcPr>
-          <w:p>
-            <w:pPr>
-              <w:widowControl w:val="0"/>
-              <w:jc w:val="both"/>
-              <w:rPr>
-                <w:vertAlign w:val="baseline"/>
-              </w:rPr>
-            </w:pPr>
-          </w:p>
-        </w:tc>
-        <w:tc>
-          <w:tcPr>
-            <w:tcW w:w="927" w:type="dxa"/>
-          </w:tcPr>
-          <w:p>
-            <w:pPr>
-              <w:widowControl w:val="0"/>
-              <w:jc w:val="both"/>
-              <w:rPr>
-                <w:vertAlign w:val="baseline"/>
-              </w:rPr>
-            </w:pPr>
-            <w:r>
-              <w:rPr>
-                <w:rFonts w:hint="default"/>
-                <w:vertAlign w:val="baseline"/>
-                <w:lang w:val="en-GB"/>
-              </w:rPr>
-              <w:t>false</w:t>
-            </w:r>
-          </w:p>
-        </w:tc>
-        <w:tc>
-          <w:tcPr>
-            <w:tcW w:w="2341" w:type="dxa"/>
-          </w:tcPr>
-          <w:p>
-            <w:pPr>
-              <w:widowControl w:val="0"/>
-              <w:jc w:val="both"/>
-              <w:rPr>
-                <w:rFonts w:hint="default"/>
-                <w:vertAlign w:val="baseline"/>
-                <w:lang w:val="en-GB"/>
-              </w:rPr>
-            </w:pPr>
+              <w:t>T16 Vale</w:t>
+            </w:r>
+          </w:p>
+        </w:tc>
+        <w:tc>
+          <w:tcPr>
+            <w:tcW w:w="896" w:type="dxa"/>
+          </w:tcPr>
+          <w:p>
+            <w:pPr>
+              <w:widowControl w:val="0"/>
+              <w:jc w:val="both"/>
+              <w:rPr>
+                <w:vertAlign w:val="baseline"/>
+              </w:rPr>
+            </w:pPr>
+            <w:r>
+              <w:rPr>
+                <w:rFonts w:hint="default"/>
+                <w:vertAlign w:val="baseline"/>
+                <w:lang w:val="en-GB"/>
+              </w:rPr>
+              <w:t>Slow corner</w:t>
+            </w:r>
+          </w:p>
+        </w:tc>
+        <w:tc>
+          <w:tcPr>
+            <w:tcW w:w="834" w:type="dxa"/>
+          </w:tcPr>
+          <w:p>
+            <w:pPr>
+              <w:widowControl w:val="0"/>
+              <w:jc w:val="both"/>
+              <w:rPr>
+                <w:rFonts w:hint="default"/>
+                <w:vertAlign w:val="baseline"/>
+                <w:lang w:val="en-US"/>
+              </w:rPr>
+            </w:pPr>
+            <w:r>
+              <w:rPr>
+                <w:rFonts w:hint="default"/>
+                <w:vertAlign w:val="baseline"/>
+                <w:lang w:val="en-US"/>
+              </w:rPr>
+              <w:t>105</w:t>
+            </w:r>
+          </w:p>
+        </w:tc>
+        <w:tc>
+          <w:tcPr>
+            <w:tcW w:w="925" w:type="dxa"/>
+          </w:tcPr>
+          <w:p>
+            <w:pPr>
+              <w:widowControl w:val="0"/>
+              <w:jc w:val="both"/>
+              <w:rPr>
+                <w:rFonts w:hint="default"/>
+                <w:vertAlign w:val="baseline"/>
+                <w:lang w:val="en-US"/>
+              </w:rPr>
+            </w:pPr>
+            <w:r>
+              <w:rPr>
+                <w:rFonts w:hint="default"/>
+                <w:vertAlign w:val="baseline"/>
+                <w:lang w:val="en-US"/>
+              </w:rPr>
+              <w:t>113</w:t>
+            </w:r>
+          </w:p>
+        </w:tc>
+        <w:tc>
+          <w:tcPr>
+            <w:tcW w:w="903" w:type="dxa"/>
+          </w:tcPr>
+          <w:p>
+            <w:pPr>
+              <w:widowControl w:val="0"/>
+              <w:jc w:val="both"/>
+              <w:rPr>
+                <w:rFonts w:hint="default"/>
+                <w:vertAlign w:val="baseline"/>
+                <w:lang w:val="en-US"/>
+              </w:rPr>
+            </w:pPr>
+          </w:p>
+        </w:tc>
+        <w:tc>
+          <w:tcPr>
+            <w:tcW w:w="802" w:type="dxa"/>
+          </w:tcPr>
+          <w:p>
+            <w:pPr>
+              <w:widowControl w:val="0"/>
+              <w:jc w:val="both"/>
+              <w:rPr>
+                <w:rFonts w:hint="default"/>
+                <w:vertAlign w:val="baseline"/>
+                <w:lang w:val="en-GB"/>
+              </w:rPr>
+            </w:pPr>
+            <w:r>
+              <w:rPr>
+                <w:rFonts w:hint="default"/>
+                <w:vertAlign w:val="baseline"/>
+                <w:lang w:val="en-GB"/>
+              </w:rPr>
+              <w:t>3.16</w:t>
+            </w:r>
             <w:bookmarkStart w:id="0" w:name="_GoBack"/>
             <w:bookmarkEnd w:id="0"/>
+          </w:p>
+        </w:tc>
+        <w:tc>
+          <w:tcPr>
+            <w:tcW w:w="879" w:type="dxa"/>
+          </w:tcPr>
+          <w:p>
+            <w:pPr>
+              <w:widowControl w:val="0"/>
+              <w:jc w:val="both"/>
+              <w:rPr>
+                <w:rFonts w:hint="default"/>
+                <w:vertAlign w:val="baseline"/>
+                <w:lang w:val="en-GB"/>
+              </w:rPr>
+            </w:pPr>
+            <w:r>
+              <w:rPr>
+                <w:rFonts w:hint="default"/>
+                <w:vertAlign w:val="baseline"/>
+                <w:lang w:val="en-GB"/>
+              </w:rPr>
+              <w:t>65</w:t>
+            </w:r>
+          </w:p>
+        </w:tc>
+        <w:tc>
+          <w:tcPr>
+            <w:tcW w:w="868" w:type="dxa"/>
+          </w:tcPr>
+          <w:p>
+            <w:pPr>
+              <w:widowControl w:val="0"/>
+              <w:jc w:val="both"/>
+              <w:rPr>
+                <w:rFonts w:hint="default"/>
+                <w:vertAlign w:val="baseline"/>
+                <w:lang w:val="en-GB"/>
+              </w:rPr>
+            </w:pPr>
+            <w:r>
+              <w:rPr>
+                <w:rFonts w:hint="default"/>
+                <w:vertAlign w:val="baseline"/>
+                <w:lang w:val="en-GB"/>
+              </w:rPr>
+              <w:t>30.5</w:t>
+            </w:r>
+          </w:p>
+        </w:tc>
+        <w:tc>
+          <w:tcPr>
+            <w:tcW w:w="927" w:type="dxa"/>
+          </w:tcPr>
+          <w:p>
+            <w:pPr>
+              <w:widowControl w:val="0"/>
+              <w:jc w:val="both"/>
+              <w:rPr>
+                <w:vertAlign w:val="baseline"/>
+              </w:rPr>
+            </w:pPr>
+            <w:r>
+              <w:rPr>
+                <w:rFonts w:hint="default"/>
+                <w:vertAlign w:val="baseline"/>
+                <w:lang w:val="en-GB"/>
+              </w:rPr>
+              <w:t>false</w:t>
+            </w:r>
+          </w:p>
+        </w:tc>
+        <w:tc>
+          <w:tcPr>
+            <w:tcW w:w="2341" w:type="dxa"/>
+          </w:tcPr>
+          <w:p>
+            <w:pPr>
+              <w:widowControl w:val="0"/>
+              <w:jc w:val="both"/>
+              <w:rPr>
+                <w:rFonts w:hint="default"/>
+                <w:vertAlign w:val="baseline"/>
+                <w:lang w:val="en-GB"/>
+              </w:rPr>
+            </w:pPr>
+            <w:r>
+              <w:rPr>
+                <w:rFonts w:hint="default"/>
+                <w:vertAlign w:val="baseline"/>
+                <w:lang w:val="en-GB"/>
+              </w:rPr>
+              <w:t>Entry speed: 260</w:t>
+            </w:r>
           </w:p>
         </w:tc>
       </w:tr>
@@ -4896,83 +5671,101 @@
                 <w:vertAlign w:val="baseline"/>
                 <w:lang w:val="en-GB"/>
               </w:rPr>
-              <w:t>T16</w:t>
-            </w:r>
-          </w:p>
-        </w:tc>
-        <w:tc>
-          <w:tcPr>
-            <w:tcW w:w="1228" w:type="dxa"/>
-          </w:tcPr>
-          <w:p>
-            <w:pPr>
-              <w:widowControl w:val="0"/>
-              <w:jc w:val="both"/>
-              <w:rPr>
-                <w:vertAlign w:val="baseline"/>
-              </w:rPr>
-            </w:pPr>
-            <w:r>
-              <w:rPr>
-                <w:rFonts w:hint="default"/>
-                <w:vertAlign w:val="baseline"/>
-                <w:lang w:val="en-GB"/>
-              </w:rPr>
-              <w:t>Slow corner</w:t>
-            </w:r>
-          </w:p>
-        </w:tc>
-        <w:tc>
-          <w:tcPr>
-            <w:tcW w:w="1290" w:type="dxa"/>
-          </w:tcPr>
-          <w:p>
-            <w:pPr>
-              <w:widowControl w:val="0"/>
-              <w:jc w:val="both"/>
-              <w:rPr>
-                <w:rFonts w:hint="default"/>
-                <w:vertAlign w:val="baseline"/>
-                <w:lang w:val="en-US"/>
-              </w:rPr>
-            </w:pPr>
-            <w:r>
-              <w:rPr>
-                <w:rFonts w:hint="default"/>
-                <w:vertAlign w:val="baseline"/>
-                <w:lang w:val="en-US"/>
-              </w:rPr>
-              <w:t>105</w:t>
-            </w:r>
-          </w:p>
-        </w:tc>
-        <w:tc>
-          <w:tcPr>
-            <w:tcW w:w="1063" w:type="dxa"/>
-          </w:tcPr>
-          <w:p>
-            <w:pPr>
-              <w:widowControl w:val="0"/>
-              <w:jc w:val="both"/>
-              <w:rPr>
-                <w:rFonts w:hint="default"/>
-                <w:vertAlign w:val="baseline"/>
-                <w:lang w:val="en-US"/>
-              </w:rPr>
-            </w:pPr>
-            <w:r>
-              <w:rPr>
-                <w:rFonts w:hint="default"/>
-                <w:vertAlign w:val="baseline"/>
-                <w:lang w:val="en-US"/>
-              </w:rPr>
-              <w:t>113</w:t>
-            </w:r>
-          </w:p>
-        </w:tc>
-        <w:tc>
-          <w:tcPr>
-            <w:tcW w:w="779" w:type="dxa"/>
+              <w:t>T17</w:t>
+            </w:r>
+          </w:p>
+        </w:tc>
+        <w:tc>
+          <w:tcPr>
+            <w:tcW w:w="896" w:type="dxa"/>
+          </w:tcPr>
+          <w:p>
+            <w:pPr>
+              <w:widowControl w:val="0"/>
+              <w:jc w:val="both"/>
+              <w:rPr>
+                <w:rFonts w:hint="default"/>
+                <w:vertAlign w:val="baseline"/>
+                <w:lang w:val="en-GB"/>
+              </w:rPr>
+            </w:pPr>
+            <w:r>
+              <w:rPr>
+                <w:rFonts w:hint="default"/>
+                <w:vertAlign w:val="baseline"/>
+                <w:lang w:val="en-GB"/>
+              </w:rPr>
+              <w:t>Fast corner</w:t>
+            </w:r>
+          </w:p>
+        </w:tc>
+        <w:tc>
+          <w:tcPr>
+            <w:tcW w:w="834" w:type="dxa"/>
+          </w:tcPr>
+          <w:p>
+            <w:pPr>
+              <w:widowControl w:val="0"/>
+              <w:jc w:val="both"/>
+              <w:rPr>
+                <w:rFonts w:hint="default"/>
+                <w:vertAlign w:val="baseline"/>
+                <w:lang w:val="en-US"/>
+              </w:rPr>
+            </w:pPr>
+            <w:r>
+              <w:rPr>
+                <w:rFonts w:hint="default"/>
+                <w:vertAlign w:val="baseline"/>
+                <w:lang w:val="en-US"/>
+              </w:rPr>
+              <w:t>130</w:t>
+            </w:r>
+          </w:p>
+        </w:tc>
+        <w:tc>
+          <w:tcPr>
+            <w:tcW w:w="925" w:type="dxa"/>
+          </w:tcPr>
+          <w:p>
+            <w:pPr>
+              <w:widowControl w:val="0"/>
+              <w:jc w:val="both"/>
+              <w:rPr>
+                <w:rFonts w:hint="default"/>
+                <w:vertAlign w:val="baseline"/>
+                <w:lang w:val="en-US"/>
+              </w:rPr>
+            </w:pPr>
+            <w:r>
+              <w:rPr>
+                <w:rFonts w:hint="default"/>
+                <w:vertAlign w:val="baseline"/>
+                <w:lang w:val="en-US"/>
+              </w:rPr>
+              <w:t>184</w:t>
+            </w:r>
+          </w:p>
+        </w:tc>
+        <w:tc>
+          <w:tcPr>
+            <w:tcW w:w="903" w:type="dxa"/>
+          </w:tcPr>
+          <w:p>
+            <w:pPr>
+              <w:widowControl w:val="0"/>
+              <w:jc w:val="both"/>
+              <w:rPr>
+                <w:rFonts w:hint="default"/>
+                <w:vertAlign w:val="baseline"/>
+                <w:lang w:val="en-US"/>
+              </w:rPr>
+            </w:pPr>
+          </w:p>
+        </w:tc>
+        <w:tc>
+          <w:tcPr>
+            <w:tcW w:w="802" w:type="dxa"/>
           </w:tcPr>
           <w:p>
             <w:pPr>
@@ -5004,7 +5797,7 @@
                 <w:vertAlign w:val="baseline"/>
                 <w:lang w:val="en-GB"/>
               </w:rPr>
-              <w:t>65</w:t>
+              <w:t>36.5</w:t>
             </w:r>
           </w:p>
         </w:tc>
@@ -5028,7 +5821,7 @@
                 <w:vertAlign w:val="baseline"/>
                 <w:lang w:val="en-GB"/>
               </w:rPr>
-              <w:t>30.5</w:t>
+              <w:t>63</w:t>
             </w:r>
           </w:p>
         </w:tc>
@@ -5063,11 +5856,17 @@
               <w:widowControl w:val="0"/>
               <w:jc w:val="both"/>
               <w:rPr>
-                <w:rFonts w:hint="default"/>
-                <w:vertAlign w:val="baseline"/>
-                <w:lang w:val="en-GB"/>
-              </w:rPr>
-            </w:pPr>
+                <w:vertAlign w:val="baseline"/>
+              </w:rPr>
+            </w:pPr>
+            <w:r>
+              <w:rPr>
+                <w:rFonts w:hint="default"/>
+                <w:vertAlign w:val="baseline"/>
+                <w:lang w:val="en-GB"/>
+              </w:rPr>
+              <w:t>Detection point for MOM for the next lap is at the exit of T17</w:t>
+            </w:r>
           </w:p>
         </w:tc>
       </w:tr>
@@ -5111,234 +5910,13 @@
                 <w:vertAlign w:val="baseline"/>
                 <w:lang w:val="en-GB"/>
               </w:rPr>
-              <w:t>T17</w:t>
-            </w:r>
-          </w:p>
-        </w:tc>
-        <w:tc>
-          <w:tcPr>
-            <w:tcW w:w="1228" w:type="dxa"/>
-          </w:tcPr>
-          <w:p>
-            <w:pPr>
-              <w:widowControl w:val="0"/>
-              <w:jc w:val="both"/>
-              <w:rPr>
-                <w:vertAlign w:val="baseline"/>
-              </w:rPr>
-            </w:pPr>
-            <w:r>
-              <w:rPr>
-                <w:rFonts w:hint="default"/>
-                <w:vertAlign w:val="baseline"/>
-                <w:lang w:val="en-GB"/>
-              </w:rPr>
-              <w:t>Slow corner</w:t>
-            </w:r>
-          </w:p>
-        </w:tc>
-        <w:tc>
-          <w:tcPr>
-            <w:tcW w:w="1290" w:type="dxa"/>
-          </w:tcPr>
-          <w:p>
-            <w:pPr>
-              <w:widowControl w:val="0"/>
-              <w:jc w:val="both"/>
-              <w:rPr>
-                <w:rFonts w:hint="default"/>
-                <w:vertAlign w:val="baseline"/>
-                <w:lang w:val="en-US"/>
-              </w:rPr>
-            </w:pPr>
-            <w:r>
-              <w:rPr>
-                <w:rFonts w:hint="default"/>
-                <w:vertAlign w:val="baseline"/>
-                <w:lang w:val="en-US"/>
-              </w:rPr>
-              <w:t>130</w:t>
-            </w:r>
-          </w:p>
-        </w:tc>
-        <w:tc>
-          <w:tcPr>
-            <w:tcW w:w="1063" w:type="dxa"/>
-          </w:tcPr>
-          <w:p>
-            <w:pPr>
-              <w:widowControl w:val="0"/>
-              <w:jc w:val="both"/>
-              <w:rPr>
-                <w:rFonts w:hint="default"/>
-                <w:vertAlign w:val="baseline"/>
-                <w:lang w:val="en-US"/>
-              </w:rPr>
-            </w:pPr>
-            <w:r>
-              <w:rPr>
-                <w:rFonts w:hint="default"/>
-                <w:vertAlign w:val="baseline"/>
-                <w:lang w:val="en-US"/>
-              </w:rPr>
-              <w:t>184</w:t>
-            </w:r>
-          </w:p>
-        </w:tc>
-        <w:tc>
-          <w:tcPr>
-            <w:tcW w:w="779" w:type="dxa"/>
-          </w:tcPr>
-          <w:p>
-            <w:pPr>
-              <w:widowControl w:val="0"/>
-              <w:jc w:val="both"/>
-              <w:rPr>
-                <w:vertAlign w:val="baseline"/>
-              </w:rPr>
-            </w:pPr>
-          </w:p>
-        </w:tc>
-        <w:tc>
-          <w:tcPr>
-            <w:tcW w:w="879" w:type="dxa"/>
-          </w:tcPr>
-          <w:p>
-            <w:pPr>
-              <w:widowControl w:val="0"/>
-              <w:jc w:val="both"/>
-              <w:rPr>
-                <w:rFonts w:hint="default"/>
-                <w:vertAlign w:val="baseline"/>
-                <w:lang w:val="en-GB"/>
-              </w:rPr>
-            </w:pPr>
-            <w:r>
-              <w:rPr>
-                <w:rFonts w:hint="default"/>
-                <w:vertAlign w:val="baseline"/>
-                <w:lang w:val="en-GB"/>
-              </w:rPr>
-              <w:t>36.5</w:t>
-            </w:r>
-          </w:p>
-        </w:tc>
-        <w:tc>
-          <w:tcPr>
-            <w:tcW w:w="868" w:type="dxa"/>
-          </w:tcPr>
-          <w:p>
-            <w:pPr>
-              <w:widowControl w:val="0"/>
-              <w:jc w:val="both"/>
-              <w:rPr>
-                <w:rFonts w:hint="default"/>
-                <w:vertAlign w:val="baseline"/>
-                <w:lang w:val="en-GB"/>
-              </w:rPr>
-            </w:pPr>
-            <w:r>
-              <w:rPr>
-                <w:rFonts w:hint="default"/>
-                <w:vertAlign w:val="baseline"/>
-                <w:lang w:val="en-GB"/>
-              </w:rPr>
-              <w:t>63</w:t>
-            </w:r>
-          </w:p>
-        </w:tc>
-        <w:tc>
-          <w:tcPr>
-            <w:tcW w:w="927" w:type="dxa"/>
-          </w:tcPr>
-          <w:p>
-            <w:pPr>
-              <w:widowControl w:val="0"/>
-              <w:jc w:val="both"/>
-              <w:rPr>
-                <w:vertAlign w:val="baseline"/>
-              </w:rPr>
-            </w:pPr>
-            <w:r>
-              <w:rPr>
-                <w:rFonts w:hint="default"/>
-                <w:vertAlign w:val="baseline"/>
-                <w:lang w:val="en-GB"/>
-              </w:rPr>
-              <w:t>false</w:t>
-            </w:r>
-          </w:p>
-        </w:tc>
-        <w:tc>
-          <w:tcPr>
-            <w:tcW w:w="2341" w:type="dxa"/>
-          </w:tcPr>
-          <w:p>
-            <w:pPr>
-              <w:widowControl w:val="0"/>
-              <w:jc w:val="both"/>
-              <w:rPr>
-                <w:vertAlign w:val="baseline"/>
-              </w:rPr>
-            </w:pPr>
-            <w:r>
-              <w:rPr>
-                <w:rFonts w:hint="default"/>
-                <w:vertAlign w:val="baseline"/>
-                <w:lang w:val="en-GB"/>
-              </w:rPr>
-              <w:t>Detection point for MOM for the next lap is at the exit of T17</w:t>
-            </w:r>
-          </w:p>
-        </w:tc>
-      </w:tr>
-      <w:tr>
-        <w:tblPrEx>
-          <w:tblBorders>
-            <w:top w:val="single" w:color="auto" w:sz="4" w:space="0"/>
-            <w:left w:val="single" w:color="auto" w:sz="4" w:space="0"/>
-            <w:bottom w:val="single" w:color="auto" w:sz="4" w:space="0"/>
-            <w:right w:val="single" w:color="auto" w:sz="4" w:space="0"/>
-            <w:insideH w:val="single" w:color="auto" w:sz="4" w:space="0"/>
-            <w:insideV w:val="single" w:color="auto" w:sz="4" w:space="0"/>
-          </w:tblBorders>
-          <w:tblCellMar>
-            <w:top w:w="0" w:type="dxa"/>
-            <w:left w:w="108" w:type="dxa"/>
-            <w:bottom w:w="0" w:type="dxa"/>
-            <w:right w:w="108" w:type="dxa"/>
-          </w:tblCellMar>
-        </w:tblPrEx>
-        <w:trPr>
-          <w:trHeight w:val="554" w:hRule="atLeast"/>
-        </w:trPr>
-        <w:tc>
-          <w:tcPr>
-            <w:tcW w:w="1339" w:type="dxa"/>
-          </w:tcPr>
-          <w:p>
-            <w:pPr>
-              <w:widowControl w:val="0"/>
-              <w:jc w:val="both"/>
-              <w:rPr>
-                <w:rFonts w:hint="default"/>
-                <w:vertAlign w:val="baseline"/>
-                <w:lang w:val="en-GB"/>
-              </w:rPr>
-            </w:pPr>
-            <w:r>
-              <w:rPr>
-                <w:rFonts w:hint="default"/>
-                <w:vertAlign w:val="baseline"/>
-                <w:lang w:val="en-GB"/>
-              </w:rPr>
               <w:t>T18</w:t>
             </w:r>
           </w:p>
         </w:tc>
         <w:tc>
           <w:tcPr>
-            <w:tcW w:w="1228" w:type="dxa"/>
+            <w:tcW w:w="896" w:type="dxa"/>
           </w:tcPr>
           <w:p>
             <w:pPr>
@@ -5368,7 +5946,7 @@
         </w:tc>
         <w:tc>
           <w:tcPr>
-            <w:tcW w:w="1290" w:type="dxa"/>
+            <w:tcW w:w="834" w:type="dxa"/>
           </w:tcPr>
           <w:p>
             <w:pPr>
@@ -5392,7 +5970,7 @@
         </w:tc>
         <w:tc>
           <w:tcPr>
-            <w:tcW w:w="1063" w:type="dxa"/>
+            <w:tcW w:w="925" w:type="dxa"/>
           </w:tcPr>
           <w:p>
             <w:pPr>
@@ -5416,7 +5994,23 @@
         </w:tc>
         <w:tc>
           <w:tcPr>
-            <w:tcW w:w="779" w:type="dxa"/>
+            <w:tcW w:w="903" w:type="dxa"/>
+          </w:tcPr>
+          <w:p>
+            <w:pPr>
+              <w:widowControl w:val="0"/>
+              <w:jc w:val="both"/>
+              <w:rPr>
+                <w:rFonts w:hint="default"/>
+                <w:vertAlign w:val="baseline"/>
+                <w:lang w:val="en-US"/>
+              </w:rPr>
+            </w:pPr>
+          </w:p>
+        </w:tc>
+        <w:tc>
+          <w:tcPr>
+            <w:tcW w:w="802" w:type="dxa"/>
           </w:tcPr>
           <w:p>
             <w:pPr>

</xml_diff>

<commit_message>
Changed Physics function to incorporate the SM starting and ending lines with the straights. Modified optimizer to react to the changes in Segment and its child classes
</commit_message>
<xml_diff>
--- a/Silverstone circuit data.docx
+++ b/Silverstone circuit data.docx
@@ -3021,6 +3021,12 @@
             <w:insideH w:val="single" w:color="auto" w:sz="4" w:space="0"/>
             <w:insideV w:val="single" w:color="auto" w:sz="4" w:space="0"/>
           </w:tblBorders>
+          <w:tblCellMar>
+            <w:top w:w="0" w:type="dxa"/>
+            <w:left w:w="108" w:type="dxa"/>
+            <w:bottom w:w="0" w:type="dxa"/>
+            <w:right w:w="108" w:type="dxa"/>
+          </w:tblCellMar>
         </w:tblPrEx>
         <w:trPr>
           <w:trHeight w:val="554" w:hRule="atLeast"/>
@@ -4546,7 +4552,7 @@
           </w:tblCellMar>
         </w:tblPrEx>
         <w:trPr>
-          <w:trHeight w:val="554" w:hRule="atLeast"/>
+          <w:trHeight w:val="538" w:hRule="atLeast"/>
         </w:trPr>
         <w:tc>
           <w:tcPr>
@@ -5076,6 +5082,8 @@
                 <w:vertAlign w:val="baseline"/>
               </w:rPr>
             </w:pPr>
+            <w:bookmarkStart w:id="0" w:name="_GoBack"/>
+            <w:bookmarkEnd w:id="0"/>
           </w:p>
         </w:tc>
         <w:tc>
@@ -5532,8 +5540,6 @@
               </w:rPr>
               <w:t>3.16</w:t>
             </w:r>
-            <w:bookmarkStart w:id="0" w:name="_GoBack"/>
-            <w:bookmarkEnd w:id="0"/>
           </w:p>
         </w:tc>
         <w:tc>

</xml_diff>

<commit_message>
Testing if the integration worked. And fixing the problems of T17-T18 not producing the correct results. And wrong table when a fastcorner follows from a slow corner
</commit_message>
<xml_diff>
--- a/Silverstone circuit data.docx
+++ b/Silverstone circuit data.docx
@@ -5082,8 +5082,6 @@
                 <w:vertAlign w:val="baseline"/>
               </w:rPr>
             </w:pPr>
-            <w:bookmarkStart w:id="0" w:name="_GoBack"/>
-            <w:bookmarkEnd w:id="0"/>
           </w:p>
         </w:tc>
         <w:tc>
@@ -5778,9 +5776,19 @@
               <w:widowControl w:val="0"/>
               <w:jc w:val="both"/>
               <w:rPr>
-                <w:vertAlign w:val="baseline"/>
-              </w:rPr>
-            </w:pPr>
+                <w:rFonts w:hint="default"/>
+                <w:vertAlign w:val="baseline"/>
+                <w:lang w:val="en-GB"/>
+              </w:rPr>
+            </w:pPr>
+            <w:r>
+              <w:rPr>
+                <w:rFonts w:hint="default"/>
+                <w:vertAlign w:val="baseline"/>
+                <w:lang w:val="en-GB"/>
+              </w:rPr>
+              <w:t>4.10</w:t>
+            </w:r>
           </w:p>
         </w:tc>
         <w:tc>
@@ -5873,6 +5881,8 @@
               </w:rPr>
               <w:t>Detection point for MOM for the next lap is at the exit of T17</w:t>
             </w:r>
+            <w:bookmarkStart w:id="0" w:name="_GoBack"/>
+            <w:bookmarkEnd w:id="0"/>
           </w:p>
         </w:tc>
       </w:tr>

</xml_diff>

<commit_message>
Changed the details of the circuit from T2 - T5 to make it more realistic
</commit_message>
<xml_diff>
--- a/Silverstone circuit data.docx
+++ b/Silverstone circuit data.docx
@@ -1076,8 +1076,10 @@
                 <w:vertAlign w:val="baseline"/>
                 <w:lang w:val="en-GB"/>
               </w:rPr>
-              <w:t>200</w:t>
-            </w:r>
+              <w:t>170</w:t>
+            </w:r>
+            <w:bookmarkStart w:id="0" w:name="_GoBack"/>
+            <w:bookmarkEnd w:id="0"/>
           </w:p>
         </w:tc>
         <w:tc>
@@ -1291,7 +1293,7 @@
                 <w:vertAlign w:val="baseline"/>
                 <w:lang w:val="en-GB"/>
               </w:rPr>
-              <w:t>75</w:t>
+              <w:t>110</w:t>
             </w:r>
           </w:p>
         </w:tc>
@@ -1315,7 +1317,7 @@
                 <w:vertAlign w:val="baseline"/>
                 <w:lang w:val="en-GB"/>
               </w:rPr>
-              <w:t>76</w:t>
+              <w:t>74</w:t>
             </w:r>
           </w:p>
         </w:tc>
@@ -1538,7 +1540,7 @@
                 <w:vertAlign w:val="baseline"/>
                 <w:lang w:val="en-GB"/>
               </w:rPr>
-              <w:t>73</w:t>
+              <w:t>68</w:t>
             </w:r>
           </w:p>
         </w:tc>
@@ -1562,7 +1564,7 @@
                 <w:vertAlign w:val="baseline"/>
                 <w:lang w:val="en-GB"/>
               </w:rPr>
-              <w:t>112</w:t>
+              <w:t>79</w:t>
             </w:r>
           </w:p>
         </w:tc>
@@ -1799,7 +1801,7 @@
                 <w:vertAlign w:val="baseline"/>
                 <w:lang w:val="en-GB"/>
               </w:rPr>
-              <w:t>83</w:t>
+              <w:t>108</w:t>
             </w:r>
           </w:p>
         </w:tc>
@@ -1823,7 +1825,7 @@
                 <w:vertAlign w:val="baseline"/>
                 <w:lang w:val="en-GB"/>
               </w:rPr>
-              <w:t>44</w:t>
+              <w:t>53</w:t>
             </w:r>
           </w:p>
         </w:tc>
@@ -5870,7 +5872,9 @@
               <w:widowControl w:val="0"/>
               <w:jc w:val="both"/>
               <w:rPr>
-                <w:vertAlign w:val="baseline"/>
+                <w:rFonts w:hint="default"/>
+                <w:vertAlign w:val="baseline"/>
+                <w:lang w:val="en-US"/>
               </w:rPr>
             </w:pPr>
             <w:r>
@@ -5881,8 +5885,6 @@
               </w:rPr>
               <w:t>Detection point for MOM for the next lap is at the exit of T17</w:t>
             </w:r>
-            <w:bookmarkStart w:id="0" w:name="_GoBack"/>
-            <w:bookmarkEnd w:id="0"/>
           </w:p>
         </w:tc>
       </w:tr>

</xml_diff>

<commit_message>
Update progress and testing prototype 3.5
</commit_message>
<xml_diff>
--- a/Silverstone circuit data.docx
+++ b/Silverstone circuit data.docx
@@ -1078,8 +1078,6 @@
               </w:rPr>
               <w:t>170</w:t>
             </w:r>
-            <w:bookmarkStart w:id="0" w:name="_GoBack"/>
-            <w:bookmarkEnd w:id="0"/>
           </w:p>
         </w:tc>
         <w:tc>
@@ -6516,6 +6514,24 @@
       </w:tr>
     </w:tbl>
     <w:p/>
+    <w:p/>
+    <w:p>
+      <w:pPr>
+        <w:rPr>
+          <w:rFonts w:hint="default"/>
+          <w:lang w:val="en-US"/>
+        </w:rPr>
+      </w:pPr>
+      <w:r>
+        <w:rPr>
+          <w:rFonts w:hint="default"/>
+          <w:lang w:val="en-US"/>
+        </w:rPr>
+        <w:t>Kimi lap: 28.348, 35.521, 24.242</w:t>
+      </w:r>
+      <w:bookmarkStart w:id="0" w:name="_GoBack"/>
+      <w:bookmarkEnd w:id="0"/>
+    </w:p>
     <w:sectPr>
       <w:pgSz w:w="11906" w:h="16838"/>
       <w:pgMar w:top="720" w:right="720" w:bottom="720" w:left="720" w:header="720" w:footer="720" w:gutter="0"/>

</xml_diff>